<commit_message>
[Chore] Normaliza identação, formatação e acentuação das páginas ASPX
</commit_message>
<xml_diff>
--- a/docs/Calendario_Detalhado_Hephaestus.docx
+++ b/docs/Calendario_Detalhado_Hephaestus.docx
@@ -6,8 +6,21 @@
       <w:pPr>
         <w:pStyle w:val="Ttulo"/>
       </w:pPr>
+      <w:proofErr w:type="spellStart"/>
       <w:r>
-        <w:t xml:space="preserve">Cronograma Detalhado de </w:t>
+        <w:t>Cronograma</w:t>
+      </w:r>
+      <w:proofErr w:type="spellEnd"/>
+      <w:r>
+        <w:t xml:space="preserve"> </w:t>
+      </w:r>
+      <w:proofErr w:type="spellStart"/>
+      <w:r>
+        <w:t>Detalhado</w:t>
+      </w:r>
+      <w:proofErr w:type="spellEnd"/>
+      <w:r>
+        <w:t xml:space="preserve"> de </w:t>
       </w:r>
       <w:proofErr w:type="spellStart"/>
       <w:r>
@@ -40,13 +53,7 @@
               <w:rPr>
                 <w:b/>
               </w:rPr>
-              <w:t>F</w:t>
-            </w:r>
-            <w:r>
-              <w:rPr>
-                <w:b/>
-              </w:rPr>
-              <w:t>ase</w:t>
+              <w:t>Fase</w:t>
             </w:r>
           </w:p>
         </w:tc>
@@ -83,7 +90,15 @@
             <w:tcW w:w="2880" w:type="dxa"/>
           </w:tcPr>
           <w:p>
+            <w:pPr>
+              <w:rPr>
+                <w:highlight w:val="green"/>
+              </w:rPr>
+            </w:pPr>
             <w:r>
+              <w:rPr>
+                <w:highlight w:val="green"/>
+              </w:rPr>
               <w:t>Frontend Web</w:t>
             </w:r>
           </w:p>
@@ -93,7 +108,15 @@
             <w:tcW w:w="2880" w:type="dxa"/>
           </w:tcPr>
           <w:p>
+            <w:pPr>
+              <w:rPr>
+                <w:highlight w:val="green"/>
+              </w:rPr>
+            </w:pPr>
             <w:r>
+              <w:rPr>
+                <w:highlight w:val="green"/>
+              </w:rPr>
               <w:t>01/08 a 02/08</w:t>
             </w:r>
           </w:p>
@@ -105,11 +128,13 @@
           <w:p>
             <w:pPr>
               <w:rPr>
+                <w:highlight w:val="green"/>
                 <w:lang w:val="pt-PT"/>
               </w:rPr>
             </w:pPr>
             <w:r>
               <w:rPr>
+                <w:highlight w:val="green"/>
                 <w:lang w:val="pt-PT"/>
               </w:rPr>
               <w:t>Setup inicial do projeto Web, definição da estrutura base (</w:t>
@@ -117,6 +142,7 @@
             <w:proofErr w:type="spellStart"/>
             <w:r>
               <w:rPr>
+                <w:highlight w:val="green"/>
                 <w:lang w:val="pt-PT"/>
               </w:rPr>
               <w:t>Navbar</w:t>
@@ -124,6 +150,7 @@
             <w:proofErr w:type="spellEnd"/>
             <w:r>
               <w:rPr>
+                <w:highlight w:val="green"/>
                 <w:lang w:val="pt-PT"/>
               </w:rPr>
               <w:t xml:space="preserve">, </w:t>
@@ -131,6 +158,7 @@
             <w:proofErr w:type="spellStart"/>
             <w:r>
               <w:rPr>
+                <w:highlight w:val="green"/>
                 <w:lang w:val="pt-PT"/>
               </w:rPr>
               <w:t>Sidebar</w:t>
@@ -138,6 +166,7 @@
             <w:proofErr w:type="spellEnd"/>
             <w:r>
               <w:rPr>
+                <w:highlight w:val="green"/>
                 <w:lang w:val="pt-PT"/>
               </w:rPr>
               <w:t xml:space="preserve"> e estilos globais / </w:t>
@@ -145,6 +174,7 @@
             <w:proofErr w:type="spellStart"/>
             <w:r>
               <w:rPr>
+                <w:highlight w:val="green"/>
                 <w:lang w:val="pt-PT"/>
               </w:rPr>
               <w:t>Bootstrap</w:t>
@@ -152,6 +182,7 @@
             <w:proofErr w:type="spellEnd"/>
             <w:r>
               <w:rPr>
+                <w:highlight w:val="green"/>
                 <w:lang w:val="pt-PT"/>
               </w:rPr>
               <w:t>).</w:t>
@@ -165,7 +196,15 @@
             <w:tcW w:w="2880" w:type="dxa"/>
           </w:tcPr>
           <w:p>
+            <w:pPr>
+              <w:rPr>
+                <w:highlight w:val="green"/>
+              </w:rPr>
+            </w:pPr>
             <w:r>
+              <w:rPr>
+                <w:highlight w:val="green"/>
+              </w:rPr>
               <w:t>Frontend Web</w:t>
             </w:r>
           </w:p>
@@ -175,7 +214,15 @@
             <w:tcW w:w="2880" w:type="dxa"/>
           </w:tcPr>
           <w:p>
+            <w:pPr>
+              <w:rPr>
+                <w:highlight w:val="green"/>
+              </w:rPr>
+            </w:pPr>
             <w:r>
+              <w:rPr>
+                <w:highlight w:val="green"/>
+              </w:rPr>
               <w:t>03/08 a 04/08</w:t>
             </w:r>
           </w:p>
@@ -187,11 +234,13 @@
           <w:p>
             <w:pPr>
               <w:rPr>
+                <w:highlight w:val="green"/>
                 <w:lang w:val="pt-PT"/>
               </w:rPr>
             </w:pPr>
             <w:r>
               <w:rPr>
+                <w:highlight w:val="green"/>
                 <w:lang w:val="pt-PT"/>
               </w:rPr>
               <w:t>Ecrã de Autenticação (Login), Ecrã de Recuperação de Password e Página de Gestão de Perfil.</w:t>
@@ -205,7 +254,15 @@
             <w:tcW w:w="2880" w:type="dxa"/>
           </w:tcPr>
           <w:p>
+            <w:pPr>
+              <w:rPr>
+                <w:highlight w:val="green"/>
+              </w:rPr>
+            </w:pPr>
             <w:r>
+              <w:rPr>
+                <w:highlight w:val="green"/>
+              </w:rPr>
               <w:t>Frontend Web</w:t>
             </w:r>
           </w:p>
@@ -215,7 +272,15 @@
             <w:tcW w:w="2880" w:type="dxa"/>
           </w:tcPr>
           <w:p>
+            <w:pPr>
+              <w:rPr>
+                <w:highlight w:val="green"/>
+              </w:rPr>
+            </w:pPr>
             <w:r>
+              <w:rPr>
+                <w:highlight w:val="green"/>
+              </w:rPr>
               <w:t>05/08 a 08/08</w:t>
             </w:r>
           </w:p>
@@ -227,12 +292,14 @@
           <w:p>
             <w:pPr>
               <w:rPr>
+                <w:highlight w:val="green"/>
                 <w:lang w:val="pt-PT"/>
               </w:rPr>
             </w:pPr>
             <w:proofErr w:type="spellStart"/>
             <w:r>
               <w:rPr>
+                <w:highlight w:val="green"/>
                 <w:lang w:val="pt-PT"/>
               </w:rPr>
               <w:t>Dashboard</w:t>
@@ -240,6 +307,7 @@
             <w:proofErr w:type="spellEnd"/>
             <w:r>
               <w:rPr>
+                <w:highlight w:val="green"/>
                 <w:lang w:val="pt-PT"/>
               </w:rPr>
               <w:t xml:space="preserve"> Principal, Vista de Calendário de Técnicos e Listagem de Histórico de Tickets com paginação e filtros cumulativos.</w:t>
@@ -492,7 +560,13 @@
           <w:tcPr>
             <w:tcW w:w="2880" w:type="dxa"/>
           </w:tcPr>
-          <w:p/>
+          <w:p>
+            <w:pPr>
+              <w:rPr>
+                <w:lang w:val="pt-PT"/>
+              </w:rPr>
+            </w:pPr>
+          </w:p>
           <w:p>
             <w:r>
               <w:lastRenderedPageBreak/>

</xml_diff>

<commit_message>
[Feature] Adiciona estrutura inicial da aplicação Android
  - Configura o projeto Android em .NET com suporte a múltiplas arquiteturas
  - Adiciona ecrãs de login, 2FA, início, perfil e alteração de palavra-passe
  - Implementa estrutura reutilizável de navegação inferior
  - Adiciona tema, ícones e componentes visuais alinhados com a aplicação web
  - Mantém os fluxos preparados para futura integração com o backend
  - Organiza as capturas de ecrã por plataforma web e Android
  - Atualiza o calendário detalhado e as notas do projeto
</commit_message>
<xml_diff>
--- a/docs/Calendario_Detalhado_Hephaestus.docx
+++ b/docs/Calendario_Detalhado_Hephaestus.docx
@@ -62,12 +62,14 @@
             <w:tcW w:w="2880" w:type="dxa"/>
           </w:tcPr>
           <w:p>
+            <w:proofErr w:type="spellStart"/>
             <w:r>
               <w:rPr>
                 <w:b/>
               </w:rPr>
               <w:t>Período</w:t>
             </w:r>
+            <w:proofErr w:type="spellEnd"/>
           </w:p>
         </w:tc>
         <w:tc>
@@ -75,12 +77,28 @@
             <w:tcW w:w="2880" w:type="dxa"/>
           </w:tcPr>
           <w:p>
+            <w:proofErr w:type="spellStart"/>
             <w:r>
               <w:rPr>
                 <w:b/>
               </w:rPr>
-              <w:t>Tarefas e Ecrãs</w:t>
+              <w:t>Tarefas</w:t>
             </w:r>
+            <w:proofErr w:type="spellEnd"/>
+            <w:r>
+              <w:rPr>
+                <w:b/>
+              </w:rPr>
+              <w:t xml:space="preserve"> e </w:t>
+            </w:r>
+            <w:proofErr w:type="spellStart"/>
+            <w:r>
+              <w:rPr>
+                <w:b/>
+              </w:rPr>
+              <w:t>Ecrãs</w:t>
+            </w:r>
+            <w:proofErr w:type="spellEnd"/>
           </w:p>
         </w:tc>
       </w:tr>
@@ -321,18 +339,16 @@
             <w:tcW w:w="2880" w:type="dxa"/>
           </w:tcPr>
           <w:p>
+            <w:pPr>
+              <w:rPr>
+                <w:highlight w:val="green"/>
+              </w:rPr>
+            </w:pPr>
             <w:r>
+              <w:rPr>
+                <w:highlight w:val="green"/>
+              </w:rPr>
               <w:t>Frontend Web</w:t>
-            </w:r>
-          </w:p>
-        </w:tc>
-        <w:tc>
-          <w:tcPr>
-            <w:tcW w:w="2880" w:type="dxa"/>
-          </w:tcPr>
-          <w:p>
-            <w:r>
-              <w:t>09/08 a 11/08</w:t>
             </w:r>
           </w:p>
         </w:tc>
@@ -343,11 +359,45 @@
           <w:p>
             <w:pPr>
               <w:rPr>
+                <w:highlight w:val="green"/>
+              </w:rPr>
+            </w:pPr>
+            <w:r>
+              <w:rPr>
+                <w:highlight w:val="green"/>
+              </w:rPr>
+              <w:t xml:space="preserve">09/08 </w:t>
+            </w:r>
+            <w:proofErr w:type="gramStart"/>
+            <w:r>
+              <w:rPr>
+                <w:highlight w:val="green"/>
+              </w:rPr>
+              <w:t>a</w:t>
+            </w:r>
+            <w:proofErr w:type="gramEnd"/>
+            <w:r>
+              <w:rPr>
+                <w:highlight w:val="green"/>
+              </w:rPr>
+              <w:t xml:space="preserve"> 11/08</w:t>
+            </w:r>
+          </w:p>
+        </w:tc>
+        <w:tc>
+          <w:tcPr>
+            <w:tcW w:w="2880" w:type="dxa"/>
+          </w:tcPr>
+          <w:p>
+            <w:pPr>
+              <w:rPr>
+                <w:highlight w:val="green"/>
                 <w:lang w:val="pt-PT"/>
               </w:rPr>
             </w:pPr>
             <w:r>
               <w:rPr>
+                <w:highlight w:val="green"/>
                 <w:lang w:val="pt-PT"/>
               </w:rPr>
               <w:t>Ecrã de Detalhe de Ticket/Tarefa, Formulário de Abertura de novos Tickets e Secção de Anexos e Comentários.</w:t>
@@ -361,18 +411,16 @@
             <w:tcW w:w="2880" w:type="dxa"/>
           </w:tcPr>
           <w:p>
+            <w:pPr>
+              <w:rPr>
+                <w:highlight w:val="green"/>
+              </w:rPr>
+            </w:pPr>
             <w:r>
+              <w:rPr>
+                <w:highlight w:val="green"/>
+              </w:rPr>
               <w:t>Frontend Web</w:t>
-            </w:r>
-          </w:p>
-        </w:tc>
-        <w:tc>
-          <w:tcPr>
-            <w:tcW w:w="2880" w:type="dxa"/>
-          </w:tcPr>
-          <w:p>
-            <w:r>
-              <w:t>12/08 a 14/08</w:t>
             </w:r>
           </w:p>
         </w:tc>
@@ -383,11 +431,45 @@
           <w:p>
             <w:pPr>
               <w:rPr>
+                <w:highlight w:val="green"/>
+              </w:rPr>
+            </w:pPr>
+            <w:r>
+              <w:rPr>
+                <w:highlight w:val="green"/>
+              </w:rPr>
+              <w:t>12/</w:t>
+            </w:r>
+            <w:proofErr w:type="gramStart"/>
+            <w:r>
+              <w:rPr>
+                <w:highlight w:val="green"/>
+              </w:rPr>
+              <w:t>08 a</w:t>
+            </w:r>
+            <w:proofErr w:type="gramEnd"/>
+            <w:r>
+              <w:rPr>
+                <w:highlight w:val="green"/>
+              </w:rPr>
+              <w:t xml:space="preserve"> 14/08</w:t>
+            </w:r>
+          </w:p>
+        </w:tc>
+        <w:tc>
+          <w:tcPr>
+            <w:tcW w:w="2880" w:type="dxa"/>
+          </w:tcPr>
+          <w:p>
+            <w:pPr>
+              <w:rPr>
+                <w:highlight w:val="green"/>
                 <w:lang w:val="pt-PT"/>
               </w:rPr>
             </w:pPr>
             <w:r>
               <w:rPr>
+                <w:highlight w:val="green"/>
                 <w:lang w:val="pt-PT"/>
               </w:rPr>
               <w:t>Painel de Administração: Páginas para Gestão de Utilizadores e Técnicos (criar, editar, desativar contas).</w:t>
@@ -401,7 +483,15 @@
             <w:tcW w:w="2880" w:type="dxa"/>
           </w:tcPr>
           <w:p>
+            <w:pPr>
+              <w:rPr>
+                <w:highlight w:val="green"/>
+              </w:rPr>
+            </w:pPr>
             <w:r>
+              <w:rPr>
+                <w:highlight w:val="green"/>
+              </w:rPr>
               <w:t>Frontend Web</w:t>
             </w:r>
           </w:p>
@@ -411,7 +501,15 @@
             <w:tcW w:w="2880" w:type="dxa"/>
           </w:tcPr>
           <w:p>
+            <w:pPr>
+              <w:rPr>
+                <w:highlight w:val="green"/>
+              </w:rPr>
+            </w:pPr>
             <w:r>
+              <w:rPr>
+                <w:highlight w:val="green"/>
+              </w:rPr>
               <w:t>15/08 a 16/08</w:t>
             </w:r>
           </w:p>
@@ -423,11 +521,13 @@
           <w:p>
             <w:pPr>
               <w:rPr>
+                <w:highlight w:val="green"/>
                 <w:lang w:val="pt-PT"/>
               </w:rPr>
             </w:pPr>
             <w:r>
               <w:rPr>
+                <w:highlight w:val="green"/>
                 <w:lang w:val="pt-PT"/>
               </w:rPr>
               <w:t>Ecrã de Estatísticas e Métricas, Exportação de Dados e Desenho de Páginas de Erro Personalizadas (404 e 500).</w:t>
@@ -441,18 +541,16 @@
             <w:tcW w:w="2880" w:type="dxa"/>
           </w:tcPr>
           <w:p>
+            <w:pPr>
+              <w:rPr>
+                <w:highlight w:val="green"/>
+              </w:rPr>
+            </w:pPr>
             <w:r>
+              <w:rPr>
+                <w:highlight w:val="green"/>
+              </w:rPr>
               <w:t>Frontend Mobile</w:t>
-            </w:r>
-          </w:p>
-        </w:tc>
-        <w:tc>
-          <w:tcPr>
-            <w:tcW w:w="2880" w:type="dxa"/>
-          </w:tcPr>
-          <w:p>
-            <w:r>
-              <w:t>17/08 a 18/08</w:t>
             </w:r>
           </w:p>
         </w:tc>
@@ -463,11 +561,45 @@
           <w:p>
             <w:pPr>
               <w:rPr>
+                <w:highlight w:val="green"/>
+              </w:rPr>
+            </w:pPr>
+            <w:r>
+              <w:rPr>
+                <w:highlight w:val="green"/>
+              </w:rPr>
+              <w:t xml:space="preserve">17/08 </w:t>
+            </w:r>
+            <w:proofErr w:type="gramStart"/>
+            <w:r>
+              <w:rPr>
+                <w:highlight w:val="green"/>
+              </w:rPr>
+              <w:t>a</w:t>
+            </w:r>
+            <w:proofErr w:type="gramEnd"/>
+            <w:r>
+              <w:rPr>
+                <w:highlight w:val="green"/>
+              </w:rPr>
+              <w:t xml:space="preserve"> 18/08</w:t>
+            </w:r>
+          </w:p>
+        </w:tc>
+        <w:tc>
+          <w:tcPr>
+            <w:tcW w:w="2880" w:type="dxa"/>
+          </w:tcPr>
+          <w:p>
+            <w:pPr>
+              <w:rPr>
+                <w:highlight w:val="green"/>
                 <w:lang w:val="pt-PT"/>
               </w:rPr>
             </w:pPr>
             <w:r>
               <w:rPr>
+                <w:highlight w:val="green"/>
                 <w:lang w:val="pt-PT"/>
               </w:rPr>
               <w:t>Setup da Aplicação Mobile (Android / MAUI) e estrutura de navegação básica.</w:t>
@@ -481,7 +613,15 @@
             <w:tcW w:w="2880" w:type="dxa"/>
           </w:tcPr>
           <w:p>
+            <w:pPr>
+              <w:rPr>
+                <w:highlight w:val="green"/>
+              </w:rPr>
+            </w:pPr>
             <w:r>
+              <w:rPr>
+                <w:highlight w:val="green"/>
+              </w:rPr>
               <w:t>Frontend Mobile</w:t>
             </w:r>
           </w:p>
@@ -491,7 +631,15 @@
             <w:tcW w:w="2880" w:type="dxa"/>
           </w:tcPr>
           <w:p>
+            <w:pPr>
+              <w:rPr>
+                <w:highlight w:val="green"/>
+              </w:rPr>
+            </w:pPr>
             <w:r>
+              <w:rPr>
+                <w:highlight w:val="green"/>
+              </w:rPr>
               <w:t>19/08 a 20/08</w:t>
             </w:r>
           </w:p>
@@ -503,11 +651,13 @@
           <w:p>
             <w:pPr>
               <w:rPr>
+                <w:highlight w:val="green"/>
                 <w:lang w:val="pt-PT"/>
               </w:rPr>
             </w:pPr>
             <w:r>
               <w:rPr>
+                <w:highlight w:val="green"/>
                 <w:lang w:val="pt-PT"/>
               </w:rPr>
               <w:t>Ecrãs de Autenticação simplificada (com suporte a 2FA e Google Login) e Perfil.</w:t>
@@ -955,7 +1105,15 @@
           </w:tcPr>
           <w:p>
             <w:r>
-              <w:t>14/09 a 18/09</w:t>
+              <w:t xml:space="preserve">14/09 </w:t>
+            </w:r>
+            <w:proofErr w:type="gramStart"/>
+            <w:r>
+              <w:t>a</w:t>
+            </w:r>
+            <w:proofErr w:type="gramEnd"/>
+            <w:r>
+              <w:t xml:space="preserve"> 18/09</w:t>
             </w:r>
           </w:p>
         </w:tc>

</xml_diff>

<commit_message>
[Feature] Implementa gestão de tickets e tarefas na aplicação Android
  - adiciona listagens e detalhes de tickets e tarefas
  - implementa progressão de estados das intervenções
  - adiciona comentários e histórico de alterações
  - reformula a página inicial conforme o perfil do utilizador
  - adiciona navegação inferior persistente e transições direcionais
  - apresenta conectividade e estados vazios sem dados simulados
  - prepara os ecrãs para futura integração com a API
</commit_message>
<xml_diff>
--- a/docs/Calendario_Detalhado_Hephaestus.docx
+++ b/docs/Calendario_Detalhado_Hephaestus.docx
@@ -1,10 +1,10 @@
 
 <file path=word/document.xml><?xml version="1.0" encoding="utf-8"?>
-<w:document xmlns:wpc="http://schemas.microsoft.com/office/word/2010/wordprocessingCanvas" xmlns:cx="http://schemas.microsoft.com/office/drawing/2014/chartex" xmlns:cx1="http://schemas.microsoft.com/office/drawing/2015/9/8/chartex" xmlns:cx2="http://schemas.microsoft.com/office/drawing/2015/10/21/chartex" xmlns:cx3="http://schemas.microsoft.com/office/drawing/2016/5/9/chartex" xmlns:cx4="http://schemas.microsoft.com/office/drawing/2016/5/10/chartex" xmlns:cx5="http://schemas.microsoft.com/office/drawing/2016/5/11/chartex" xmlns:cx6="http://schemas.microsoft.com/office/drawing/2016/5/12/chartex" xmlns:cx7="http://schemas.microsoft.com/office/drawing/2016/5/13/chartex" xmlns:cx8="http://schemas.microsoft.com/office/drawing/2016/5/14/chartex" xmlns:mc="http://schemas.openxmlformats.org/markup-compatibility/2006" xmlns:aink="http://schemas.microsoft.com/office/drawing/2016/ink" xmlns:am3d="http://schemas.microsoft.com/office/drawing/2017/model3d" xmlns:o="urn:schemas-microsoft-com:office:office" xmlns:oel="http://schemas.microsoft.com/office/2019/extlst" xmlns:r="http://schemas.openxmlformats.org/officeDocument/2006/relationships" xmlns:m="http://schemas.openxmlformats.org/officeDocument/2006/math" xmlns:v="urn:schemas-microsoft-com:vml" xmlns:wp14="http://schemas.microsoft.com/office/word/2010/wordprocessingDrawing" xmlns:wp="http://schemas.openxmlformats.org/drawingml/2006/wordprocessingDrawing" xmlns:w10="urn:schemas-microsoft-com:office:word" xmlns:w="http://schemas.openxmlformats.org/wordprocessingml/2006/main" xmlns:w14="http://schemas.microsoft.com/office/word/2010/wordml" xmlns:w15="http://schemas.microsoft.com/office/word/2012/wordml" xmlns:w16cei="http://schemas.microsoft.com/office/word/2026/wordml/cei" xmlns:w16cex="http://schemas.microsoft.com/office/word/2018/wordml/cex" xmlns:w16cid="http://schemas.microsoft.com/office/word/2016/wordml/cid" xmlns:w16="http://schemas.microsoft.com/office/word/2018/wordml" xmlns:w16du="http://schemas.microsoft.com/office/word/2023/wordml/word16du" xmlns:w16sdtdh="http://schemas.microsoft.com/office/word/2020/wordml/sdtdatahash" xmlns:w16sdtfl="http://schemas.microsoft.com/office/word/2024/wordml/sdtformatlock" xmlns:w16se="http://schemas.microsoft.com/office/word/2015/wordml/symex" xmlns:wpg="http://schemas.microsoft.com/office/word/2010/wordprocessingGroup" xmlns:wpi="http://schemas.microsoft.com/office/word/2010/wordprocessingInk" xmlns:wne="http://schemas.microsoft.com/office/word/2006/wordml" xmlns:wps="http://schemas.microsoft.com/office/word/2010/wordprocessingShape" mc:Ignorable="w14 w15 w16se w16cid w16 w16cex w16sdtdh w16sdtfl w16du wp14">
+<w:document xmlns:wpc="http://schemas.microsoft.com/office/word/2010/wordprocessingCanvas" xmlns:cx="http://schemas.microsoft.com/office/drawing/2014/chartex" xmlns:cx1="http://schemas.microsoft.com/office/drawing/2015/9/8/chartex" xmlns:cx2="http://schemas.microsoft.com/office/drawing/2015/10/21/chartex" xmlns:cx3="http://schemas.microsoft.com/office/drawing/2016/5/9/chartex" xmlns:cx4="http://schemas.microsoft.com/office/drawing/2016/5/10/chartex" xmlns:cx5="http://schemas.microsoft.com/office/drawing/2016/5/11/chartex" xmlns:cx6="http://schemas.microsoft.com/office/drawing/2016/5/12/chartex" xmlns:cx7="http://schemas.microsoft.com/office/drawing/2016/5/13/chartex" xmlns:cx8="http://schemas.microsoft.com/office/drawing/2016/5/14/chartex" xmlns:mc="http://schemas.openxmlformats.org/markup-compatibility/2006" xmlns:aink="http://schemas.microsoft.com/office/drawing/2016/ink" xmlns:am3d="http://schemas.microsoft.com/office/drawing/2017/model3d" xmlns:o="urn:schemas-microsoft-com:office:office" xmlns:oel="http://schemas.microsoft.com/office/2019/extlst" xmlns:r="http://schemas.openxmlformats.org/officeDocument/2006/relationships" xmlns:m="http://schemas.openxmlformats.org/officeDocument/2006/math" xmlns:v="urn:schemas-microsoft-com:vml" xmlns:wp14="http://schemas.microsoft.com/office/word/2010/wordprocessingDrawing" xmlns:wp="http://schemas.openxmlformats.org/drawingml/2006/wordprocessingDrawing" xmlns:w10="urn:schemas-microsoft-com:office:word" xmlns:w="http://schemas.openxmlformats.org/wordprocessingml/2006/main" xmlns:w14="http://schemas.microsoft.com/office/word/2010/wordml" xmlns:w15="http://schemas.microsoft.com/office/word/2012/wordml" xmlns:w16cex="http://schemas.microsoft.com/office/word/2018/wordml/cex" xmlns:w16cid="http://schemas.microsoft.com/office/word/2016/wordml/cid" xmlns:w16="http://schemas.microsoft.com/office/word/2018/wordml" xmlns:w16du="http://schemas.microsoft.com/office/word/2023/wordml/word16du" xmlns:w16sdtdh="http://schemas.microsoft.com/office/word/2020/wordml/sdtdatahash" xmlns:w16sdtfl="http://schemas.microsoft.com/office/word/2024/wordml/sdtformatlock" xmlns:w16se="http://schemas.microsoft.com/office/word/2015/wordml/symex" xmlns:wpg="http://schemas.microsoft.com/office/word/2010/wordprocessingGroup" xmlns:wpi="http://schemas.microsoft.com/office/word/2010/wordprocessingInk" xmlns:wne="http://schemas.microsoft.com/office/word/2006/wordml" xmlns:wps="http://schemas.microsoft.com/office/word/2010/wordprocessingShape" mc:Ignorable="w14 w15 w16se w16cid w16 w16cex w16sdtdh w16sdtfl w16du wp14">
   <w:body>
     <w:p>
       <w:pPr>
-        <w:pStyle w:val="Ttulo"/>
+        <w:pStyle w:val="Title"/>
       </w:pPr>
       <w:proofErr w:type="spellStart"/>
       <w:r>
@@ -34,7 +34,7 @@
     <w:p/>
     <w:tbl>
       <w:tblPr>
-        <w:tblStyle w:val="TabelacomGrelha"/>
+        <w:tblStyle w:val="TableGrid"/>
         <w:tblW w:w="0" w:type="auto"/>
         <w:tblLook w:val="04A0" w:firstRow="1" w:lastRow="0" w:firstColumn="1" w:lastColumn="0" w:noHBand="0" w:noVBand="1"/>
       </w:tblPr>
@@ -155,55 +155,7 @@
                 <w:highlight w:val="green"/>
                 <w:lang w:val="pt-PT"/>
               </w:rPr>
-              <w:t>Setup inicial do projeto Web, definição da estrutura base (</w:t>
-            </w:r>
-            <w:proofErr w:type="spellStart"/>
-            <w:r>
-              <w:rPr>
-                <w:highlight w:val="green"/>
-                <w:lang w:val="pt-PT"/>
-              </w:rPr>
-              <w:t>Navbar</w:t>
-            </w:r>
-            <w:proofErr w:type="spellEnd"/>
-            <w:r>
-              <w:rPr>
-                <w:highlight w:val="green"/>
-                <w:lang w:val="pt-PT"/>
-              </w:rPr>
-              <w:t xml:space="preserve">, </w:t>
-            </w:r>
-            <w:proofErr w:type="spellStart"/>
-            <w:r>
-              <w:rPr>
-                <w:highlight w:val="green"/>
-                <w:lang w:val="pt-PT"/>
-              </w:rPr>
-              <w:t>Sidebar</w:t>
-            </w:r>
-            <w:proofErr w:type="spellEnd"/>
-            <w:r>
-              <w:rPr>
-                <w:highlight w:val="green"/>
-                <w:lang w:val="pt-PT"/>
-              </w:rPr>
-              <w:t xml:space="preserve"> e estilos globais / </w:t>
-            </w:r>
-            <w:proofErr w:type="spellStart"/>
-            <w:r>
-              <w:rPr>
-                <w:highlight w:val="green"/>
-                <w:lang w:val="pt-PT"/>
-              </w:rPr>
-              <w:t>Bootstrap</w:t>
-            </w:r>
-            <w:proofErr w:type="spellEnd"/>
-            <w:r>
-              <w:rPr>
-                <w:highlight w:val="green"/>
-                <w:lang w:val="pt-PT"/>
-              </w:rPr>
-              <w:t>).</w:t>
+              <w:t>Setup inicial do projeto Web, definição da estrutura base (Navbar, Sidebar e estilos globais / Bootstrap).</w:t>
             </w:r>
           </w:p>
         </w:tc>
@@ -314,21 +266,12 @@
                 <w:lang w:val="pt-PT"/>
               </w:rPr>
             </w:pPr>
-            <w:proofErr w:type="spellStart"/>
             <w:r>
               <w:rPr>
                 <w:highlight w:val="green"/>
                 <w:lang w:val="pt-PT"/>
               </w:rPr>
-              <w:t>Dashboard</w:t>
-            </w:r>
-            <w:proofErr w:type="spellEnd"/>
-            <w:r>
-              <w:rPr>
-                <w:highlight w:val="green"/>
-                <w:lang w:val="pt-PT"/>
-              </w:rPr>
-              <w:t xml:space="preserve"> Principal, Vista de Calendário de Técnicos e Listagem de Histórico de Tickets com paginação e filtros cumulativos.</w:t>
+              <w:t>Dashboard Principal, Vista de Calendário de Técnicos e Listagem de Histórico de Tickets com paginação e filtros cumulativos.</w:t>
             </w:r>
           </w:p>
         </w:tc>
@@ -671,7 +614,15 @@
             <w:tcW w:w="2880" w:type="dxa"/>
           </w:tcPr>
           <w:p>
+            <w:pPr>
+              <w:rPr>
+                <w:highlight w:val="green"/>
+              </w:rPr>
+            </w:pPr>
             <w:r>
+              <w:rPr>
+                <w:highlight w:val="green"/>
+              </w:rPr>
               <w:t>Frontend Mobile</w:t>
             </w:r>
           </w:p>
@@ -681,7 +632,15 @@
             <w:tcW w:w="2880" w:type="dxa"/>
           </w:tcPr>
           <w:p>
+            <w:pPr>
+              <w:rPr>
+                <w:highlight w:val="green"/>
+              </w:rPr>
+            </w:pPr>
             <w:r>
+              <w:rPr>
+                <w:highlight w:val="green"/>
+              </w:rPr>
               <w:t>21/08 a 22/08</w:t>
             </w:r>
           </w:p>
@@ -693,11 +652,13 @@
           <w:p>
             <w:pPr>
               <w:rPr>
+                <w:highlight w:val="green"/>
                 <w:lang w:val="pt-PT"/>
               </w:rPr>
             </w:pPr>
             <w:r>
               <w:rPr>
+                <w:highlight w:val="green"/>
                 <w:lang w:val="pt-PT"/>
               </w:rPr>
               <w:t>Ecrã de Abertura Rápida de Tickets e integração com a câmara para anexar fotos de avarias.</w:t>
@@ -713,12 +674,21 @@
           <w:p>
             <w:pPr>
               <w:rPr>
+                <w:highlight w:val="green"/>
                 <w:lang w:val="pt-PT"/>
               </w:rPr>
             </w:pPr>
           </w:p>
           <w:p>
+            <w:pPr>
+              <w:rPr>
+                <w:highlight w:val="green"/>
+              </w:rPr>
+            </w:pPr>
             <w:r>
+              <w:rPr>
+                <w:highlight w:val="green"/>
+              </w:rPr>
               <w:lastRenderedPageBreak/>
               <w:t>Frontend Mobile</w:t>
             </w:r>
@@ -728,9 +698,23 @@
           <w:tcPr>
             <w:tcW w:w="2880" w:type="dxa"/>
           </w:tcPr>
-          <w:p/>
           <w:p>
+            <w:pPr>
+              <w:rPr>
+                <w:highlight w:val="green"/>
+              </w:rPr>
+            </w:pPr>
+          </w:p>
+          <w:p>
+            <w:pPr>
+              <w:rPr>
+                <w:highlight w:val="green"/>
+              </w:rPr>
+            </w:pPr>
             <w:r>
+              <w:rPr>
+                <w:highlight w:val="green"/>
+              </w:rPr>
               <w:lastRenderedPageBreak/>
               <w:t>23/08 a 24/08</w:t>
             </w:r>
@@ -743,6 +727,7 @@
           <w:p>
             <w:pPr>
               <w:rPr>
+                <w:highlight w:val="green"/>
                 <w:lang w:val="pt-PT"/>
               </w:rPr>
             </w:pPr>
@@ -750,43 +735,17 @@
           <w:p>
             <w:pPr>
               <w:rPr>
+                <w:highlight w:val="green"/>
                 <w:lang w:val="pt-PT"/>
               </w:rPr>
             </w:pPr>
             <w:r>
               <w:rPr>
+                <w:highlight w:val="green"/>
                 <w:lang w:val="pt-PT"/>
               </w:rPr>
               <w:lastRenderedPageBreak/>
-              <w:t xml:space="preserve">Listagem simplificada de Tarefas, Ecrã de Detalhe com atualização rápida de estados (Open, In </w:t>
-            </w:r>
-            <w:proofErr w:type="spellStart"/>
-            <w:r>
-              <w:rPr>
-                <w:lang w:val="pt-PT"/>
-              </w:rPr>
-              <w:t>Progress</w:t>
-            </w:r>
-            <w:proofErr w:type="spellEnd"/>
-            <w:r>
-              <w:rPr>
-                <w:lang w:val="pt-PT"/>
-              </w:rPr>
-              <w:t xml:space="preserve">, </w:t>
-            </w:r>
-            <w:proofErr w:type="spellStart"/>
-            <w:r>
-              <w:rPr>
-                <w:lang w:val="pt-PT"/>
-              </w:rPr>
-              <w:t>Done</w:t>
-            </w:r>
-            <w:proofErr w:type="spellEnd"/>
-            <w:r>
-              <w:rPr>
-                <w:lang w:val="pt-PT"/>
-              </w:rPr>
-              <w:t>).</w:t>
+              <w:t>Listagem simplificada de Tarefas, Ecrã de Detalhe com atualização rápida de estados (Open, In Progress, Done).</w:t>
             </w:r>
           </w:p>
         </w:tc>
@@ -867,21 +826,7 @@
               <w:rPr>
                 <w:lang w:val="pt-PT"/>
               </w:rPr>
-              <w:t xml:space="preserve">Configuração do projeto .NET Framework/C#, ligação à Base de Dados SQL Server e configuração de Web </w:t>
-            </w:r>
-            <w:proofErr w:type="spellStart"/>
-            <w:r>
-              <w:rPr>
-                <w:lang w:val="pt-PT"/>
-              </w:rPr>
-              <w:t>Services</w:t>
-            </w:r>
-            <w:proofErr w:type="spellEnd"/>
-            <w:r>
-              <w:rPr>
-                <w:lang w:val="pt-PT"/>
-              </w:rPr>
-              <w:t xml:space="preserve"> no IIS.</w:t>
+              <w:t>Configuração do projeto .NET Framework/C#, ligação à Base de Dados SQL Server e configuração de Web Services no IIS.</w:t>
             </w:r>
           </w:p>
         </w:tc>
@@ -921,35 +866,7 @@
               <w:rPr>
                 <w:lang w:val="pt-PT"/>
               </w:rPr>
-              <w:t>Implementação de Autenticação, gestão de sessões, controlo de acessos por roles (</w:t>
-            </w:r>
-            <w:proofErr w:type="spellStart"/>
-            <w:r>
-              <w:rPr>
-                <w:lang w:val="pt-PT"/>
-              </w:rPr>
-              <w:t>Admin</w:t>
-            </w:r>
-            <w:proofErr w:type="spellEnd"/>
-            <w:r>
-              <w:rPr>
-                <w:lang w:val="pt-PT"/>
-              </w:rPr>
-              <w:t xml:space="preserve">, Técnico, Standard) e </w:t>
-            </w:r>
-            <w:proofErr w:type="spellStart"/>
-            <w:r>
-              <w:rPr>
-                <w:lang w:val="pt-PT"/>
-              </w:rPr>
-              <w:t>OAuth</w:t>
-            </w:r>
-            <w:proofErr w:type="spellEnd"/>
-            <w:r>
-              <w:rPr>
-                <w:lang w:val="pt-PT"/>
-              </w:rPr>
-              <w:t xml:space="preserve"> 2.0.</w:t>
+              <w:t>Implementação de Autenticação, gestão de sessões, controlo de acessos por roles (Admin, Técnico, Standard) e OAuth 2.0.</w:t>
             </w:r>
           </w:p>
         </w:tc>
@@ -989,21 +906,7 @@
               <w:rPr>
                 <w:lang w:val="pt-PT"/>
               </w:rPr>
-              <w:t xml:space="preserve">Construção das </w:t>
-            </w:r>
-            <w:proofErr w:type="spellStart"/>
-            <w:r>
-              <w:rPr>
-                <w:lang w:val="pt-PT"/>
-              </w:rPr>
-              <w:t>APIs</w:t>
-            </w:r>
-            <w:proofErr w:type="spellEnd"/>
-            <w:r>
-              <w:rPr>
-                <w:lang w:val="pt-PT"/>
-              </w:rPr>
-              <w:t xml:space="preserve"> (CRUD) para gestão de Tickets, Tarefas, Históricos de Modificação e upload de Anexos.</w:t>
+              <w:t>Construção das APIs (CRUD) para gestão de Tickets, Tarefas, Históricos de Modificação e upload de Anexos.</w:t>
             </w:r>
           </w:p>
         </w:tc>
@@ -1171,21 +1074,7 @@
               <w:rPr>
                 <w:lang w:val="pt-PT"/>
               </w:rPr>
-              <w:t xml:space="preserve">Realização de Testes Unitários no </w:t>
-            </w:r>
-            <w:proofErr w:type="spellStart"/>
-            <w:r>
-              <w:rPr>
-                <w:lang w:val="pt-PT"/>
-              </w:rPr>
-              <w:t>Backend</w:t>
-            </w:r>
-            <w:proofErr w:type="spellEnd"/>
-            <w:r>
-              <w:rPr>
-                <w:lang w:val="pt-PT"/>
-              </w:rPr>
-              <w:t>, validação de segurança e regras de negócio.</w:t>
+              <w:t>Realização de Testes Unitários no Backend, validação de segurança e regras de negócio.</w:t>
             </w:r>
           </w:p>
         </w:tc>
@@ -1371,7 +1260,7 @@
 </file>
 
 <file path=word/numbering.xml><?xml version="1.0" encoding="utf-8"?>
-<w:numbering xmlns:wpc="http://schemas.microsoft.com/office/word/2010/wordprocessingCanvas" xmlns:cx="http://schemas.microsoft.com/office/drawing/2014/chartex" xmlns:cx1="http://schemas.microsoft.com/office/drawing/2015/9/8/chartex" xmlns:cx2="http://schemas.microsoft.com/office/drawing/2015/10/21/chartex" xmlns:cx3="http://schemas.microsoft.com/office/drawing/2016/5/9/chartex" xmlns:cx4="http://schemas.microsoft.com/office/drawing/2016/5/10/chartex" xmlns:cx5="http://schemas.microsoft.com/office/drawing/2016/5/11/chartex" xmlns:cx6="http://schemas.microsoft.com/office/drawing/2016/5/12/chartex" xmlns:cx7="http://schemas.microsoft.com/office/drawing/2016/5/13/chartex" xmlns:cx8="http://schemas.microsoft.com/office/drawing/2016/5/14/chartex" xmlns:mc="http://schemas.openxmlformats.org/markup-compatibility/2006" xmlns:aink="http://schemas.microsoft.com/office/drawing/2016/ink" xmlns:am3d="http://schemas.microsoft.com/office/drawing/2017/model3d" xmlns:o="urn:schemas-microsoft-com:office:office" xmlns:oel="http://schemas.microsoft.com/office/2019/extlst" xmlns:r="http://schemas.openxmlformats.org/officeDocument/2006/relationships" xmlns:m="http://schemas.openxmlformats.org/officeDocument/2006/math" xmlns:v="urn:schemas-microsoft-com:vml" xmlns:wp14="http://schemas.microsoft.com/office/word/2010/wordprocessingDrawing" xmlns:wp="http://schemas.openxmlformats.org/drawingml/2006/wordprocessingDrawing" xmlns:w10="urn:schemas-microsoft-com:office:word" xmlns:w="http://schemas.openxmlformats.org/wordprocessingml/2006/main" xmlns:w14="http://schemas.microsoft.com/office/word/2010/wordml" xmlns:w15="http://schemas.microsoft.com/office/word/2012/wordml" xmlns:w16cei="http://schemas.microsoft.com/office/word/2026/wordml/cei" xmlns:w16cex="http://schemas.microsoft.com/office/word/2018/wordml/cex" xmlns:w16cid="http://schemas.microsoft.com/office/word/2016/wordml/cid" xmlns:w16="http://schemas.microsoft.com/office/word/2018/wordml" xmlns:w16du="http://schemas.microsoft.com/office/word/2023/wordml/word16du" xmlns:w16sdtdh="http://schemas.microsoft.com/office/word/2020/wordml/sdtdatahash" xmlns:w16sdtfl="http://schemas.microsoft.com/office/word/2024/wordml/sdtformatlock" xmlns:w16se="http://schemas.microsoft.com/office/word/2015/wordml/symex" xmlns:wpg="http://schemas.microsoft.com/office/word/2010/wordprocessingGroup" xmlns:wpi="http://schemas.microsoft.com/office/word/2010/wordprocessingInk" xmlns:wne="http://schemas.microsoft.com/office/word/2006/wordml" xmlns:wps="http://schemas.microsoft.com/office/word/2010/wordprocessingShape" mc:Ignorable="w14 w15 w16se w16cid w16 w16cex w16sdtdh w16sdtfl w16du wp14">
+<w:numbering xmlns:wpc="http://schemas.microsoft.com/office/word/2010/wordprocessingCanvas" xmlns:cx="http://schemas.microsoft.com/office/drawing/2014/chartex" xmlns:cx1="http://schemas.microsoft.com/office/drawing/2015/9/8/chartex" xmlns:cx2="http://schemas.microsoft.com/office/drawing/2015/10/21/chartex" xmlns:cx3="http://schemas.microsoft.com/office/drawing/2016/5/9/chartex" xmlns:cx4="http://schemas.microsoft.com/office/drawing/2016/5/10/chartex" xmlns:cx5="http://schemas.microsoft.com/office/drawing/2016/5/11/chartex" xmlns:cx6="http://schemas.microsoft.com/office/drawing/2016/5/12/chartex" xmlns:cx7="http://schemas.microsoft.com/office/drawing/2016/5/13/chartex" xmlns:cx8="http://schemas.microsoft.com/office/drawing/2016/5/14/chartex" xmlns:mc="http://schemas.openxmlformats.org/markup-compatibility/2006" xmlns:aink="http://schemas.microsoft.com/office/drawing/2016/ink" xmlns:am3d="http://schemas.microsoft.com/office/drawing/2017/model3d" xmlns:o="urn:schemas-microsoft-com:office:office" xmlns:oel="http://schemas.microsoft.com/office/2019/extlst" xmlns:r="http://schemas.openxmlformats.org/officeDocument/2006/relationships" xmlns:m="http://schemas.openxmlformats.org/officeDocument/2006/math" xmlns:v="urn:schemas-microsoft-com:vml" xmlns:wp14="http://schemas.microsoft.com/office/word/2010/wordprocessingDrawing" xmlns:wp="http://schemas.openxmlformats.org/drawingml/2006/wordprocessingDrawing" xmlns:w10="urn:schemas-microsoft-com:office:word" xmlns:w="http://schemas.openxmlformats.org/wordprocessingml/2006/main" xmlns:w14="http://schemas.microsoft.com/office/word/2010/wordml" xmlns:w15="http://schemas.microsoft.com/office/word/2012/wordml" xmlns:w16cex="http://schemas.microsoft.com/office/word/2018/wordml/cex" xmlns:w16cid="http://schemas.microsoft.com/office/word/2016/wordml/cid" xmlns:w16="http://schemas.microsoft.com/office/word/2018/wordml" xmlns:w16du="http://schemas.microsoft.com/office/word/2023/wordml/word16du" xmlns:w16sdtdh="http://schemas.microsoft.com/office/word/2020/wordml/sdtdatahash" xmlns:w16sdtfl="http://schemas.microsoft.com/office/word/2024/wordml/sdtformatlock" xmlns:w16se="http://schemas.microsoft.com/office/word/2015/wordml/symex" xmlns:wpg="http://schemas.microsoft.com/office/word/2010/wordprocessingGroup" xmlns:wpi="http://schemas.microsoft.com/office/word/2010/wordprocessingInk" xmlns:wne="http://schemas.microsoft.com/office/word/2006/wordml" xmlns:wps="http://schemas.microsoft.com/office/word/2010/wordprocessingShape" mc:Ignorable="w14 w15 w16se w16cid w16 w16cex w16sdtdh w16sdtfl w16du wp14">
   <w:abstractNum w:abstractNumId="0" w15:restartNumberingAfterBreak="0">
     <w:nsid w:val="FFFFFF7C"/>
     <w:multiLevelType w:val="singleLevel"/>
@@ -1413,7 +1302,7 @@
     <w:lvl w:ilvl="0">
       <w:start w:val="1"/>
       <w:numFmt w:val="decimal"/>
-      <w:pStyle w:val="Listanumerada3"/>
+      <w:pStyle w:val="ListNumber3"/>
       <w:lvlText w:val="%1."/>
       <w:lvlJc w:val="left"/>
       <w:pPr>
@@ -1431,7 +1320,7 @@
     <w:lvl w:ilvl="0">
       <w:start w:val="1"/>
       <w:numFmt w:val="decimal"/>
-      <w:pStyle w:val="Listanumerada2"/>
+      <w:pStyle w:val="ListNumber2"/>
       <w:lvlText w:val="%1."/>
       <w:lvlJc w:val="left"/>
       <w:pPr>
@@ -1469,7 +1358,7 @@
     <w:lvl w:ilvl="0">
       <w:start w:val="1"/>
       <w:numFmt w:val="bullet"/>
-      <w:pStyle w:val="Listacommarcas3"/>
+      <w:pStyle w:val="ListBullet3"/>
       <w:lvlText w:val=""/>
       <w:lvlJc w:val="left"/>
       <w:pPr>
@@ -1490,7 +1379,7 @@
     <w:lvl w:ilvl="0">
       <w:start w:val="1"/>
       <w:numFmt w:val="bullet"/>
-      <w:pStyle w:val="Listacommarcas2"/>
+      <w:pStyle w:val="ListBullet2"/>
       <w:lvlText w:val=""/>
       <w:lvlJc w:val="left"/>
       <w:pPr>
@@ -1511,7 +1400,7 @@
     <w:lvl w:ilvl="0">
       <w:start w:val="1"/>
       <w:numFmt w:val="decimal"/>
-      <w:pStyle w:val="Listanumerada"/>
+      <w:pStyle w:val="ListNumber"/>
       <w:lvlText w:val="%1."/>
       <w:lvlJc w:val="left"/>
       <w:pPr>
@@ -1529,7 +1418,7 @@
     <w:lvl w:ilvl="0">
       <w:start w:val="1"/>
       <w:numFmt w:val="bullet"/>
-      <w:pStyle w:val="Listacommarcas"/>
+      <w:pStyle w:val="ListBullet"/>
       <w:lvlText w:val=""/>
       <w:lvlJc w:val="left"/>
       <w:pPr>
@@ -1964,11 +1853,11 @@
     <w:qFormat/>
     <w:rsid w:val="00FC693F"/>
   </w:style>
-  <w:style w:type="paragraph" w:styleId="Ttulo1">
+  <w:style w:type="paragraph" w:styleId="Heading1">
     <w:name w:val="heading 1"/>
     <w:basedOn w:val="Normal"/>
     <w:next w:val="Normal"/>
-    <w:link w:val="Ttulo1Carter"/>
+    <w:link w:val="Heading1Char"/>
     <w:uiPriority w:val="9"/>
     <w:qFormat/>
     <w:rsid w:val="00FC693F"/>
@@ -1987,11 +1876,11 @@
       <w:szCs w:val="28"/>
     </w:rPr>
   </w:style>
-  <w:style w:type="paragraph" w:styleId="Ttulo2">
+  <w:style w:type="paragraph" w:styleId="Heading2">
     <w:name w:val="heading 2"/>
     <w:basedOn w:val="Normal"/>
     <w:next w:val="Normal"/>
-    <w:link w:val="Ttulo2Carter"/>
+    <w:link w:val="Heading2Char"/>
     <w:uiPriority w:val="9"/>
     <w:unhideWhenUsed/>
     <w:qFormat/>
@@ -2011,11 +1900,11 @@
       <w:szCs w:val="26"/>
     </w:rPr>
   </w:style>
-  <w:style w:type="paragraph" w:styleId="Ttulo3">
+  <w:style w:type="paragraph" w:styleId="Heading3">
     <w:name w:val="heading 3"/>
     <w:basedOn w:val="Normal"/>
     <w:next w:val="Normal"/>
-    <w:link w:val="Ttulo3Carter"/>
+    <w:link w:val="Heading3Char"/>
     <w:uiPriority w:val="9"/>
     <w:unhideWhenUsed/>
     <w:qFormat/>
@@ -2033,11 +1922,11 @@
       <w:color w:val="4F81BD" w:themeColor="accent1"/>
     </w:rPr>
   </w:style>
-  <w:style w:type="paragraph" w:styleId="Ttulo4">
+  <w:style w:type="paragraph" w:styleId="Heading4">
     <w:name w:val="heading 4"/>
     <w:basedOn w:val="Normal"/>
     <w:next w:val="Normal"/>
-    <w:link w:val="Ttulo4Carter"/>
+    <w:link w:val="Heading4Char"/>
     <w:uiPriority w:val="9"/>
     <w:semiHidden/>
     <w:unhideWhenUsed/>
@@ -2058,11 +1947,11 @@
       <w:color w:val="4F81BD" w:themeColor="accent1"/>
     </w:rPr>
   </w:style>
-  <w:style w:type="paragraph" w:styleId="Ttulo5">
+  <w:style w:type="paragraph" w:styleId="Heading5">
     <w:name w:val="heading 5"/>
     <w:basedOn w:val="Normal"/>
     <w:next w:val="Normal"/>
-    <w:link w:val="Ttulo5Carter"/>
+    <w:link w:val="Heading5Char"/>
     <w:uiPriority w:val="9"/>
     <w:semiHidden/>
     <w:unhideWhenUsed/>
@@ -2079,11 +1968,11 @@
       <w:color w:val="243F60" w:themeColor="accent1" w:themeShade="7F"/>
     </w:rPr>
   </w:style>
-  <w:style w:type="paragraph" w:styleId="Ttulo6">
+  <w:style w:type="paragraph" w:styleId="Heading6">
     <w:name w:val="heading 6"/>
     <w:basedOn w:val="Normal"/>
     <w:next w:val="Normal"/>
-    <w:link w:val="Ttulo6Carter"/>
+    <w:link w:val="Heading6Char"/>
     <w:uiPriority w:val="9"/>
     <w:semiHidden/>
     <w:unhideWhenUsed/>
@@ -2102,11 +1991,11 @@
       <w:color w:val="243F60" w:themeColor="accent1" w:themeShade="7F"/>
     </w:rPr>
   </w:style>
-  <w:style w:type="paragraph" w:styleId="Ttulo7">
+  <w:style w:type="paragraph" w:styleId="Heading7">
     <w:name w:val="heading 7"/>
     <w:basedOn w:val="Normal"/>
     <w:next w:val="Normal"/>
-    <w:link w:val="Ttulo7Carter"/>
+    <w:link w:val="Heading7Char"/>
     <w:uiPriority w:val="9"/>
     <w:semiHidden/>
     <w:unhideWhenUsed/>
@@ -2125,11 +2014,11 @@
       <w:color w:val="404040" w:themeColor="text1" w:themeTint="BF"/>
     </w:rPr>
   </w:style>
-  <w:style w:type="paragraph" w:styleId="Ttulo8">
+  <w:style w:type="paragraph" w:styleId="Heading8">
     <w:name w:val="heading 8"/>
     <w:basedOn w:val="Normal"/>
     <w:next w:val="Normal"/>
-    <w:link w:val="Ttulo8Carter"/>
+    <w:link w:val="Heading8Char"/>
     <w:uiPriority w:val="9"/>
     <w:semiHidden/>
     <w:unhideWhenUsed/>
@@ -2148,11 +2037,11 @@
       <w:szCs w:val="20"/>
     </w:rPr>
   </w:style>
-  <w:style w:type="paragraph" w:styleId="Ttulo9">
+  <w:style w:type="paragraph" w:styleId="Heading9">
     <w:name w:val="heading 9"/>
     <w:basedOn w:val="Normal"/>
     <w:next w:val="Normal"/>
-    <w:link w:val="Ttulo9Carter"/>
+    <w:link w:val="Heading9Char"/>
     <w:uiPriority w:val="9"/>
     <w:semiHidden/>
     <w:unhideWhenUsed/>
@@ -2173,13 +2062,13 @@
       <w:szCs w:val="20"/>
     </w:rPr>
   </w:style>
-  <w:style w:type="character" w:default="1" w:styleId="Tipodeletrapredefinidodopargrafo">
+  <w:style w:type="character" w:default="1" w:styleId="DefaultParagraphFont">
     <w:name w:val="Default Paragraph Font"/>
     <w:uiPriority w:val="1"/>
     <w:semiHidden/>
     <w:unhideWhenUsed/>
   </w:style>
-  <w:style w:type="table" w:default="1" w:styleId="Tabelanormal">
+  <w:style w:type="table" w:default="1" w:styleId="TableNormal">
     <w:name w:val="Normal Table"/>
     <w:uiPriority w:val="99"/>
     <w:semiHidden/>
@@ -2194,16 +2083,16 @@
       </w:tblCellMar>
     </w:tblPr>
   </w:style>
-  <w:style w:type="numbering" w:default="1" w:styleId="Semlista">
+  <w:style w:type="numbering" w:default="1" w:styleId="NoList">
     <w:name w:val="No List"/>
     <w:uiPriority w:val="99"/>
     <w:semiHidden/>
     <w:unhideWhenUsed/>
   </w:style>
-  <w:style w:type="paragraph" w:styleId="Cabealho">
+  <w:style w:type="paragraph" w:styleId="Header">
     <w:name w:val="header"/>
     <w:basedOn w:val="Normal"/>
-    <w:link w:val="CabealhoCarter"/>
+    <w:link w:val="HeaderChar"/>
     <w:uiPriority w:val="99"/>
     <w:unhideWhenUsed/>
     <w:rsid w:val="00E618BF"/>
@@ -2215,17 +2104,17 @@
       <w:spacing w:after="0" w:line="240" w:lineRule="auto"/>
     </w:pPr>
   </w:style>
-  <w:style w:type="character" w:customStyle="1" w:styleId="CabealhoCarter">
-    <w:name w:val="Cabeçalho Caráter"/>
-    <w:basedOn w:val="Tipodeletrapredefinidodopargrafo"/>
-    <w:link w:val="Cabealho"/>
+  <w:style w:type="character" w:customStyle="1" w:styleId="HeaderChar">
+    <w:name w:val="Header Char"/>
+    <w:basedOn w:val="DefaultParagraphFont"/>
+    <w:link w:val="Header"/>
     <w:uiPriority w:val="99"/>
     <w:rsid w:val="00E618BF"/>
   </w:style>
-  <w:style w:type="paragraph" w:styleId="Rodap">
+  <w:style w:type="paragraph" w:styleId="Footer">
     <w:name w:val="footer"/>
     <w:basedOn w:val="Normal"/>
-    <w:link w:val="RodapCarter"/>
+    <w:link w:val="FooterChar"/>
     <w:uiPriority w:val="99"/>
     <w:unhideWhenUsed/>
     <w:rsid w:val="00E618BF"/>
@@ -2237,14 +2126,14 @@
       <w:spacing w:after="0" w:line="240" w:lineRule="auto"/>
     </w:pPr>
   </w:style>
-  <w:style w:type="character" w:customStyle="1" w:styleId="RodapCarter">
-    <w:name w:val="Rodapé Caráter"/>
-    <w:basedOn w:val="Tipodeletrapredefinidodopargrafo"/>
-    <w:link w:val="Rodap"/>
+  <w:style w:type="character" w:customStyle="1" w:styleId="FooterChar">
+    <w:name w:val="Footer Char"/>
+    <w:basedOn w:val="DefaultParagraphFont"/>
+    <w:link w:val="Footer"/>
     <w:uiPriority w:val="99"/>
     <w:rsid w:val="00E618BF"/>
   </w:style>
-  <w:style w:type="paragraph" w:styleId="SemEspaamento">
+  <w:style w:type="paragraph" w:styleId="NoSpacing">
     <w:name w:val="No Spacing"/>
     <w:uiPriority w:val="1"/>
     <w:qFormat/>
@@ -2253,10 +2142,10 @@
       <w:spacing w:after="0" w:line="240" w:lineRule="auto"/>
     </w:pPr>
   </w:style>
-  <w:style w:type="character" w:customStyle="1" w:styleId="Ttulo1Carter">
-    <w:name w:val="Título 1 Caráter"/>
-    <w:basedOn w:val="Tipodeletrapredefinidodopargrafo"/>
-    <w:link w:val="Ttulo1"/>
+  <w:style w:type="character" w:customStyle="1" w:styleId="Heading1Char">
+    <w:name w:val="Heading 1 Char"/>
+    <w:basedOn w:val="DefaultParagraphFont"/>
+    <w:link w:val="Heading1"/>
     <w:uiPriority w:val="9"/>
     <w:rsid w:val="00FC693F"/>
     <w:rPr>
@@ -2268,10 +2157,10 @@
       <w:szCs w:val="28"/>
     </w:rPr>
   </w:style>
-  <w:style w:type="character" w:customStyle="1" w:styleId="Ttulo2Carter">
-    <w:name w:val="Título 2 Caráter"/>
-    <w:basedOn w:val="Tipodeletrapredefinidodopargrafo"/>
-    <w:link w:val="Ttulo2"/>
+  <w:style w:type="character" w:customStyle="1" w:styleId="Heading2Char">
+    <w:name w:val="Heading 2 Char"/>
+    <w:basedOn w:val="DefaultParagraphFont"/>
+    <w:link w:val="Heading2"/>
     <w:uiPriority w:val="9"/>
     <w:rsid w:val="00FC693F"/>
     <w:rPr>
@@ -2283,10 +2172,10 @@
       <w:szCs w:val="26"/>
     </w:rPr>
   </w:style>
-  <w:style w:type="character" w:customStyle="1" w:styleId="Ttulo3Carter">
-    <w:name w:val="Título 3 Caráter"/>
-    <w:basedOn w:val="Tipodeletrapredefinidodopargrafo"/>
-    <w:link w:val="Ttulo3"/>
+  <w:style w:type="character" w:customStyle="1" w:styleId="Heading3Char">
+    <w:name w:val="Heading 3 Char"/>
+    <w:basedOn w:val="DefaultParagraphFont"/>
+    <w:link w:val="Heading3"/>
     <w:uiPriority w:val="9"/>
     <w:rsid w:val="00FC693F"/>
     <w:rPr>
@@ -2296,11 +2185,11 @@
       <w:color w:val="4F81BD" w:themeColor="accent1"/>
     </w:rPr>
   </w:style>
-  <w:style w:type="paragraph" w:styleId="Ttulo">
+  <w:style w:type="paragraph" w:styleId="Title">
     <w:name w:val="Title"/>
     <w:basedOn w:val="Normal"/>
     <w:next w:val="Normal"/>
-    <w:link w:val="TtuloCarter"/>
+    <w:link w:val="TitleChar"/>
     <w:uiPriority w:val="10"/>
     <w:qFormat/>
     <w:rsid w:val="00FC693F"/>
@@ -2320,10 +2209,10 @@
       <w:szCs w:val="52"/>
     </w:rPr>
   </w:style>
-  <w:style w:type="character" w:customStyle="1" w:styleId="TtuloCarter">
-    <w:name w:val="Título Caráter"/>
-    <w:basedOn w:val="Tipodeletrapredefinidodopargrafo"/>
-    <w:link w:val="Ttulo"/>
+  <w:style w:type="character" w:customStyle="1" w:styleId="TitleChar">
+    <w:name w:val="Title Char"/>
+    <w:basedOn w:val="DefaultParagraphFont"/>
+    <w:link w:val="Title"/>
     <w:uiPriority w:val="10"/>
     <w:rsid w:val="00FC693F"/>
     <w:rPr>
@@ -2335,11 +2224,11 @@
       <w:szCs w:val="52"/>
     </w:rPr>
   </w:style>
-  <w:style w:type="paragraph" w:styleId="Subttulo">
+  <w:style w:type="paragraph" w:styleId="Subtitle">
     <w:name w:val="Subtitle"/>
     <w:basedOn w:val="Normal"/>
     <w:next w:val="Normal"/>
-    <w:link w:val="SubttuloCarter"/>
+    <w:link w:val="SubtitleChar"/>
     <w:uiPriority w:val="11"/>
     <w:qFormat/>
     <w:rsid w:val="00FC693F"/>
@@ -2358,10 +2247,10 @@
       <w:szCs w:val="24"/>
     </w:rPr>
   </w:style>
-  <w:style w:type="character" w:customStyle="1" w:styleId="SubttuloCarter">
-    <w:name w:val="Subtítulo Caráter"/>
-    <w:basedOn w:val="Tipodeletrapredefinidodopargrafo"/>
-    <w:link w:val="Subttulo"/>
+  <w:style w:type="character" w:customStyle="1" w:styleId="SubtitleChar">
+    <w:name w:val="Subtitle Char"/>
+    <w:basedOn w:val="DefaultParagraphFont"/>
+    <w:link w:val="Subtitle"/>
     <w:uiPriority w:val="11"/>
     <w:rsid w:val="00FC693F"/>
     <w:rPr>
@@ -2374,7 +2263,7 @@
       <w:szCs w:val="24"/>
     </w:rPr>
   </w:style>
-  <w:style w:type="paragraph" w:styleId="PargrafodaLista">
+  <w:style w:type="paragraph" w:styleId="ListParagraph">
     <w:name w:val="List Paragraph"/>
     <w:basedOn w:val="Normal"/>
     <w:uiPriority w:val="34"/>
@@ -2385,10 +2274,10 @@
       <w:contextualSpacing/>
     </w:pPr>
   </w:style>
-  <w:style w:type="paragraph" w:styleId="Corpodetexto">
+  <w:style w:type="paragraph" w:styleId="BodyText">
     <w:name w:val="Body Text"/>
     <w:basedOn w:val="Normal"/>
-    <w:link w:val="CorpodetextoCarter"/>
+    <w:link w:val="BodyTextChar"/>
     <w:uiPriority w:val="99"/>
     <w:unhideWhenUsed/>
     <w:rsid w:val="00AA1D8D"/>
@@ -2396,17 +2285,17 @@
       <w:spacing w:after="120"/>
     </w:pPr>
   </w:style>
-  <w:style w:type="character" w:customStyle="1" w:styleId="CorpodetextoCarter">
-    <w:name w:val="Corpo de texto Caráter"/>
-    <w:basedOn w:val="Tipodeletrapredefinidodopargrafo"/>
-    <w:link w:val="Corpodetexto"/>
+  <w:style w:type="character" w:customStyle="1" w:styleId="BodyTextChar">
+    <w:name w:val="Body Text Char"/>
+    <w:basedOn w:val="DefaultParagraphFont"/>
+    <w:link w:val="BodyText"/>
     <w:uiPriority w:val="99"/>
     <w:rsid w:val="00AA1D8D"/>
   </w:style>
-  <w:style w:type="paragraph" w:styleId="Corpodetexto2">
+  <w:style w:type="paragraph" w:styleId="BodyText2">
     <w:name w:val="Body Text 2"/>
     <w:basedOn w:val="Normal"/>
-    <w:link w:val="Corpodetexto2Carter"/>
+    <w:link w:val="BodyText2Char"/>
     <w:uiPriority w:val="99"/>
     <w:unhideWhenUsed/>
     <w:rsid w:val="00AA1D8D"/>
@@ -2414,17 +2303,17 @@
       <w:spacing w:after="120" w:line="480" w:lineRule="auto"/>
     </w:pPr>
   </w:style>
-  <w:style w:type="character" w:customStyle="1" w:styleId="Corpodetexto2Carter">
-    <w:name w:val="Corpo de texto 2 Caráter"/>
-    <w:basedOn w:val="Tipodeletrapredefinidodopargrafo"/>
-    <w:link w:val="Corpodetexto2"/>
+  <w:style w:type="character" w:customStyle="1" w:styleId="BodyText2Char">
+    <w:name w:val="Body Text 2 Char"/>
+    <w:basedOn w:val="DefaultParagraphFont"/>
+    <w:link w:val="BodyText2"/>
     <w:uiPriority w:val="99"/>
     <w:rsid w:val="00AA1D8D"/>
   </w:style>
-  <w:style w:type="paragraph" w:styleId="Corpodetexto3">
+  <w:style w:type="paragraph" w:styleId="BodyText3">
     <w:name w:val="Body Text 3"/>
     <w:basedOn w:val="Normal"/>
-    <w:link w:val="Corpodetexto3Carter"/>
+    <w:link w:val="BodyText3Char"/>
     <w:uiPriority w:val="99"/>
     <w:unhideWhenUsed/>
     <w:rsid w:val="00AA1D8D"/>
@@ -2436,10 +2325,10 @@
       <w:szCs w:val="16"/>
     </w:rPr>
   </w:style>
-  <w:style w:type="character" w:customStyle="1" w:styleId="Corpodetexto3Carter">
-    <w:name w:val="Corpo de texto 3 Caráter"/>
-    <w:basedOn w:val="Tipodeletrapredefinidodopargrafo"/>
-    <w:link w:val="Corpodetexto3"/>
+  <w:style w:type="character" w:customStyle="1" w:styleId="BodyText3Char">
+    <w:name w:val="Body Text 3 Char"/>
+    <w:basedOn w:val="DefaultParagraphFont"/>
+    <w:link w:val="BodyText3"/>
     <w:uiPriority w:val="99"/>
     <w:rsid w:val="00AA1D8D"/>
     <w:rPr>
@@ -2447,7 +2336,7 @@
       <w:szCs w:val="16"/>
     </w:rPr>
   </w:style>
-  <w:style w:type="paragraph" w:styleId="Lista">
+  <w:style w:type="paragraph" w:styleId="List">
     <w:name w:val="List"/>
     <w:basedOn w:val="Normal"/>
     <w:uiPriority w:val="99"/>
@@ -2458,7 +2347,7 @@
       <w:contextualSpacing/>
     </w:pPr>
   </w:style>
-  <w:style w:type="paragraph" w:styleId="Lista2">
+  <w:style w:type="paragraph" w:styleId="List2">
     <w:name w:val="List 2"/>
     <w:basedOn w:val="Normal"/>
     <w:uiPriority w:val="99"/>
@@ -2469,7 +2358,7 @@
       <w:contextualSpacing/>
     </w:pPr>
   </w:style>
-  <w:style w:type="paragraph" w:styleId="Lista3">
+  <w:style w:type="paragraph" w:styleId="List3">
     <w:name w:val="List 3"/>
     <w:basedOn w:val="Normal"/>
     <w:uiPriority w:val="99"/>
@@ -2480,7 +2369,7 @@
       <w:contextualSpacing/>
     </w:pPr>
   </w:style>
-  <w:style w:type="paragraph" w:styleId="Listacommarcas">
+  <w:style w:type="paragraph" w:styleId="ListBullet">
     <w:name w:val="List Bullet"/>
     <w:basedOn w:val="Normal"/>
     <w:uiPriority w:val="99"/>
@@ -2493,7 +2382,7 @@
       <w:contextualSpacing/>
     </w:pPr>
   </w:style>
-  <w:style w:type="paragraph" w:styleId="Listacommarcas2">
+  <w:style w:type="paragraph" w:styleId="ListBullet2">
     <w:name w:val="List Bullet 2"/>
     <w:basedOn w:val="Normal"/>
     <w:uiPriority w:val="99"/>
@@ -2506,7 +2395,7 @@
       <w:contextualSpacing/>
     </w:pPr>
   </w:style>
-  <w:style w:type="paragraph" w:styleId="Listacommarcas3">
+  <w:style w:type="paragraph" w:styleId="ListBullet3">
     <w:name w:val="List Bullet 3"/>
     <w:basedOn w:val="Normal"/>
     <w:uiPriority w:val="99"/>
@@ -2519,7 +2408,7 @@
       <w:contextualSpacing/>
     </w:pPr>
   </w:style>
-  <w:style w:type="paragraph" w:styleId="Listanumerada">
+  <w:style w:type="paragraph" w:styleId="ListNumber">
     <w:name w:val="List Number"/>
     <w:basedOn w:val="Normal"/>
     <w:uiPriority w:val="99"/>
@@ -2532,7 +2421,7 @@
       <w:contextualSpacing/>
     </w:pPr>
   </w:style>
-  <w:style w:type="paragraph" w:styleId="Listanumerada2">
+  <w:style w:type="paragraph" w:styleId="ListNumber2">
     <w:name w:val="List Number 2"/>
     <w:basedOn w:val="Normal"/>
     <w:uiPriority w:val="99"/>
@@ -2545,7 +2434,7 @@
       <w:contextualSpacing/>
     </w:pPr>
   </w:style>
-  <w:style w:type="paragraph" w:styleId="Listanumerada3">
+  <w:style w:type="paragraph" w:styleId="ListNumber3">
     <w:name w:val="List Number 3"/>
     <w:basedOn w:val="Normal"/>
     <w:uiPriority w:val="99"/>
@@ -2558,7 +2447,7 @@
       <w:contextualSpacing/>
     </w:pPr>
   </w:style>
-  <w:style w:type="paragraph" w:styleId="Listadecont">
+  <w:style w:type="paragraph" w:styleId="ListContinue">
     <w:name w:val="List Continue"/>
     <w:basedOn w:val="Normal"/>
     <w:uiPriority w:val="99"/>
@@ -2570,7 +2459,7 @@
       <w:contextualSpacing/>
     </w:pPr>
   </w:style>
-  <w:style w:type="paragraph" w:styleId="Listadecont2">
+  <w:style w:type="paragraph" w:styleId="ListContinue2">
     <w:name w:val="List Continue 2"/>
     <w:basedOn w:val="Normal"/>
     <w:uiPriority w:val="99"/>
@@ -2582,7 +2471,7 @@
       <w:contextualSpacing/>
     </w:pPr>
   </w:style>
-  <w:style w:type="paragraph" w:styleId="Listadecont3">
+  <w:style w:type="paragraph" w:styleId="ListContinue3">
     <w:name w:val="List Continue 3"/>
     <w:basedOn w:val="Normal"/>
     <w:uiPriority w:val="99"/>
@@ -2594,9 +2483,9 @@
       <w:contextualSpacing/>
     </w:pPr>
   </w:style>
-  <w:style w:type="paragraph" w:styleId="Textodemacro">
+  <w:style w:type="paragraph" w:styleId="MacroText">
     <w:name w:val="macro"/>
-    <w:link w:val="TextodemacroCarter"/>
+    <w:link w:val="MacroTextChar"/>
     <w:uiPriority w:val="99"/>
     <w:unhideWhenUsed/>
     <w:rsid w:val="0029639D"/>
@@ -2617,10 +2506,10 @@
       <w:szCs w:val="20"/>
     </w:rPr>
   </w:style>
-  <w:style w:type="character" w:customStyle="1" w:styleId="TextodemacroCarter">
-    <w:name w:val="Texto de macro Caráter"/>
-    <w:basedOn w:val="Tipodeletrapredefinidodopargrafo"/>
-    <w:link w:val="Textodemacro"/>
+  <w:style w:type="character" w:customStyle="1" w:styleId="MacroTextChar">
+    <w:name w:val="Macro Text Char"/>
+    <w:basedOn w:val="DefaultParagraphFont"/>
+    <w:link w:val="MacroText"/>
     <w:uiPriority w:val="99"/>
     <w:rsid w:val="0029639D"/>
     <w:rPr>
@@ -2629,11 +2518,11 @@
       <w:szCs w:val="20"/>
     </w:rPr>
   </w:style>
-  <w:style w:type="paragraph" w:styleId="Citao">
+  <w:style w:type="paragraph" w:styleId="Quote">
     <w:name w:val="Quote"/>
     <w:basedOn w:val="Normal"/>
     <w:next w:val="Normal"/>
-    <w:link w:val="CitaoCarter"/>
+    <w:link w:val="QuoteChar"/>
     <w:uiPriority w:val="29"/>
     <w:qFormat/>
     <w:rsid w:val="00FC693F"/>
@@ -2643,10 +2532,10 @@
       <w:color w:val="000000" w:themeColor="text1"/>
     </w:rPr>
   </w:style>
-  <w:style w:type="character" w:customStyle="1" w:styleId="CitaoCarter">
-    <w:name w:val="Citação Caráter"/>
-    <w:basedOn w:val="Tipodeletrapredefinidodopargrafo"/>
-    <w:link w:val="Citao"/>
+  <w:style w:type="character" w:customStyle="1" w:styleId="QuoteChar">
+    <w:name w:val="Quote Char"/>
+    <w:basedOn w:val="DefaultParagraphFont"/>
+    <w:link w:val="Quote"/>
     <w:uiPriority w:val="29"/>
     <w:rsid w:val="00FC693F"/>
     <w:rPr>
@@ -2655,10 +2544,10 @@
       <w:color w:val="000000" w:themeColor="text1"/>
     </w:rPr>
   </w:style>
-  <w:style w:type="character" w:customStyle="1" w:styleId="Ttulo4Carter">
-    <w:name w:val="Título 4 Caráter"/>
-    <w:basedOn w:val="Tipodeletrapredefinidodopargrafo"/>
-    <w:link w:val="Ttulo4"/>
+  <w:style w:type="character" w:customStyle="1" w:styleId="Heading4Char">
+    <w:name w:val="Heading 4 Char"/>
+    <w:basedOn w:val="DefaultParagraphFont"/>
+    <w:link w:val="Heading4"/>
     <w:uiPriority w:val="9"/>
     <w:semiHidden/>
     <w:rsid w:val="00FC693F"/>
@@ -2671,10 +2560,10 @@
       <w:color w:val="4F81BD" w:themeColor="accent1"/>
     </w:rPr>
   </w:style>
-  <w:style w:type="character" w:customStyle="1" w:styleId="Ttulo5Carter">
-    <w:name w:val="Título 5 Caráter"/>
-    <w:basedOn w:val="Tipodeletrapredefinidodopargrafo"/>
-    <w:link w:val="Ttulo5"/>
+  <w:style w:type="character" w:customStyle="1" w:styleId="Heading5Char">
+    <w:name w:val="Heading 5 Char"/>
+    <w:basedOn w:val="DefaultParagraphFont"/>
+    <w:link w:val="Heading5"/>
     <w:uiPriority w:val="9"/>
     <w:semiHidden/>
     <w:rsid w:val="00FC693F"/>
@@ -2683,10 +2572,10 @@
       <w:color w:val="243F60" w:themeColor="accent1" w:themeShade="7F"/>
     </w:rPr>
   </w:style>
-  <w:style w:type="character" w:customStyle="1" w:styleId="Ttulo6Carter">
-    <w:name w:val="Título 6 Caráter"/>
-    <w:basedOn w:val="Tipodeletrapredefinidodopargrafo"/>
-    <w:link w:val="Ttulo6"/>
+  <w:style w:type="character" w:customStyle="1" w:styleId="Heading6Char">
+    <w:name w:val="Heading 6 Char"/>
+    <w:basedOn w:val="DefaultParagraphFont"/>
+    <w:link w:val="Heading6"/>
     <w:uiPriority w:val="9"/>
     <w:semiHidden/>
     <w:rsid w:val="00FC693F"/>
@@ -2697,10 +2586,10 @@
       <w:color w:val="243F60" w:themeColor="accent1" w:themeShade="7F"/>
     </w:rPr>
   </w:style>
-  <w:style w:type="character" w:customStyle="1" w:styleId="Ttulo7Carter">
-    <w:name w:val="Título 7 Caráter"/>
-    <w:basedOn w:val="Tipodeletrapredefinidodopargrafo"/>
-    <w:link w:val="Ttulo7"/>
+  <w:style w:type="character" w:customStyle="1" w:styleId="Heading7Char">
+    <w:name w:val="Heading 7 Char"/>
+    <w:basedOn w:val="DefaultParagraphFont"/>
+    <w:link w:val="Heading7"/>
     <w:uiPriority w:val="9"/>
     <w:semiHidden/>
     <w:rsid w:val="00FC693F"/>
@@ -2711,10 +2600,10 @@
       <w:color w:val="404040" w:themeColor="text1" w:themeTint="BF"/>
     </w:rPr>
   </w:style>
-  <w:style w:type="character" w:customStyle="1" w:styleId="Ttulo8Carter">
-    <w:name w:val="Título 8 Caráter"/>
-    <w:basedOn w:val="Tipodeletrapredefinidodopargrafo"/>
-    <w:link w:val="Ttulo8"/>
+  <w:style w:type="character" w:customStyle="1" w:styleId="Heading8Char">
+    <w:name w:val="Heading 8 Char"/>
+    <w:basedOn w:val="DefaultParagraphFont"/>
+    <w:link w:val="Heading8"/>
     <w:uiPriority w:val="9"/>
     <w:semiHidden/>
     <w:rsid w:val="00FC693F"/>
@@ -2725,10 +2614,10 @@
       <w:szCs w:val="20"/>
     </w:rPr>
   </w:style>
-  <w:style w:type="character" w:customStyle="1" w:styleId="Ttulo9Carter">
-    <w:name w:val="Título 9 Caráter"/>
-    <w:basedOn w:val="Tipodeletrapredefinidodopargrafo"/>
-    <w:link w:val="Ttulo9"/>
+  <w:style w:type="character" w:customStyle="1" w:styleId="Heading9Char">
+    <w:name w:val="Heading 9 Char"/>
+    <w:basedOn w:val="DefaultParagraphFont"/>
+    <w:link w:val="Heading9"/>
     <w:uiPriority w:val="9"/>
     <w:semiHidden/>
     <w:rsid w:val="00FC693F"/>
@@ -2741,7 +2630,7 @@
       <w:szCs w:val="20"/>
     </w:rPr>
   </w:style>
-  <w:style w:type="paragraph" w:styleId="Legenda">
+  <w:style w:type="paragraph" w:styleId="Caption">
     <w:name w:val="caption"/>
     <w:basedOn w:val="Normal"/>
     <w:next w:val="Normal"/>
@@ -2761,9 +2650,9 @@
       <w:szCs w:val="18"/>
     </w:rPr>
   </w:style>
-  <w:style w:type="character" w:styleId="Forte">
+  <w:style w:type="character" w:styleId="Strong">
     <w:name w:val="Strong"/>
-    <w:basedOn w:val="Tipodeletrapredefinidodopargrafo"/>
+    <w:basedOn w:val="DefaultParagraphFont"/>
     <w:uiPriority w:val="22"/>
     <w:qFormat/>
     <w:rsid w:val="00FC693F"/>
@@ -2772,9 +2661,9 @@
       <w:bCs/>
     </w:rPr>
   </w:style>
-  <w:style w:type="character" w:styleId="nfase">
+  <w:style w:type="character" w:styleId="Emphasis">
     <w:name w:val="Emphasis"/>
-    <w:basedOn w:val="Tipodeletrapredefinidodopargrafo"/>
+    <w:basedOn w:val="DefaultParagraphFont"/>
     <w:uiPriority w:val="20"/>
     <w:qFormat/>
     <w:rsid w:val="00FC693F"/>
@@ -2783,11 +2672,11 @@
       <w:iCs/>
     </w:rPr>
   </w:style>
-  <w:style w:type="paragraph" w:styleId="CitaoIntensa">
+  <w:style w:type="paragraph" w:styleId="IntenseQuote">
     <w:name w:val="Intense Quote"/>
     <w:basedOn w:val="Normal"/>
     <w:next w:val="Normal"/>
-    <w:link w:val="CitaoIntensaCarter"/>
+    <w:link w:val="IntenseQuoteChar"/>
     <w:uiPriority w:val="30"/>
     <w:qFormat/>
     <w:rsid w:val="00FC693F"/>
@@ -2806,10 +2695,10 @@
       <w:color w:val="4F81BD" w:themeColor="accent1"/>
     </w:rPr>
   </w:style>
-  <w:style w:type="character" w:customStyle="1" w:styleId="CitaoIntensaCarter">
-    <w:name w:val="Citação Intensa Caráter"/>
-    <w:basedOn w:val="Tipodeletrapredefinidodopargrafo"/>
-    <w:link w:val="CitaoIntensa"/>
+  <w:style w:type="character" w:customStyle="1" w:styleId="IntenseQuoteChar">
+    <w:name w:val="Intense Quote Char"/>
+    <w:basedOn w:val="DefaultParagraphFont"/>
+    <w:link w:val="IntenseQuote"/>
     <w:uiPriority w:val="30"/>
     <w:rsid w:val="00FC693F"/>
     <w:rPr>
@@ -2820,9 +2709,9 @@
       <w:color w:val="4F81BD" w:themeColor="accent1"/>
     </w:rPr>
   </w:style>
-  <w:style w:type="character" w:styleId="nfaseDiscreta">
+  <w:style w:type="character" w:styleId="SubtleEmphasis">
     <w:name w:val="Subtle Emphasis"/>
-    <w:basedOn w:val="Tipodeletrapredefinidodopargrafo"/>
+    <w:basedOn w:val="DefaultParagraphFont"/>
     <w:uiPriority w:val="19"/>
     <w:qFormat/>
     <w:rsid w:val="00FC693F"/>
@@ -2832,9 +2721,9 @@
       <w:color w:val="808080" w:themeColor="text1" w:themeTint="7F"/>
     </w:rPr>
   </w:style>
-  <w:style w:type="character" w:styleId="nfaseIntensa">
+  <w:style w:type="character" w:styleId="IntenseEmphasis">
     <w:name w:val="Intense Emphasis"/>
-    <w:basedOn w:val="Tipodeletrapredefinidodopargrafo"/>
+    <w:basedOn w:val="DefaultParagraphFont"/>
     <w:uiPriority w:val="21"/>
     <w:qFormat/>
     <w:rsid w:val="00FC693F"/>
@@ -2846,9 +2735,9 @@
       <w:color w:val="4F81BD" w:themeColor="accent1"/>
     </w:rPr>
   </w:style>
-  <w:style w:type="character" w:styleId="RefernciaDiscreta">
+  <w:style w:type="character" w:styleId="SubtleReference">
     <w:name w:val="Subtle Reference"/>
-    <w:basedOn w:val="Tipodeletrapredefinidodopargrafo"/>
+    <w:basedOn w:val="DefaultParagraphFont"/>
     <w:uiPriority w:val="31"/>
     <w:qFormat/>
     <w:rsid w:val="00FC693F"/>
@@ -2858,9 +2747,9 @@
       <w:u w:val="single"/>
     </w:rPr>
   </w:style>
-  <w:style w:type="character" w:styleId="RefernciaIntensa">
+  <w:style w:type="character" w:styleId="IntenseReference">
     <w:name w:val="Intense Reference"/>
-    <w:basedOn w:val="Tipodeletrapredefinidodopargrafo"/>
+    <w:basedOn w:val="DefaultParagraphFont"/>
     <w:uiPriority w:val="32"/>
     <w:qFormat/>
     <w:rsid w:val="00FC693F"/>
@@ -2873,9 +2762,9 @@
       <w:u w:val="single"/>
     </w:rPr>
   </w:style>
-  <w:style w:type="character" w:styleId="TtulodoLivro">
+  <w:style w:type="character" w:styleId="BookTitle">
     <w:name w:val="Book Title"/>
-    <w:basedOn w:val="Tipodeletrapredefinidodopargrafo"/>
+    <w:basedOn w:val="DefaultParagraphFont"/>
     <w:uiPriority w:val="33"/>
     <w:qFormat/>
     <w:rsid w:val="00FC693F"/>
@@ -2886,9 +2775,9 @@
       <w:spacing w:val="5"/>
     </w:rPr>
   </w:style>
-  <w:style w:type="paragraph" w:styleId="Cabealhodondice">
+  <w:style w:type="paragraph" w:styleId="TOCHeading">
     <w:name w:val="TOC Heading"/>
-    <w:basedOn w:val="Ttulo1"/>
+    <w:basedOn w:val="Heading1"/>
     <w:next w:val="Normal"/>
     <w:uiPriority w:val="39"/>
     <w:semiHidden/>
@@ -2899,9 +2788,9 @@
       <w:outlineLvl w:val="9"/>
     </w:pPr>
   </w:style>
-  <w:style w:type="table" w:styleId="TabelacomGrelha">
+  <w:style w:type="table" w:styleId="TableGrid">
     <w:name w:val="Table Grid"/>
-    <w:basedOn w:val="Tabelanormal"/>
+    <w:basedOn w:val="TableNormal"/>
     <w:uiPriority w:val="59"/>
     <w:rsid w:val="00FC693F"/>
     <w:pPr>
@@ -2918,9 +2807,9 @@
       </w:tblBorders>
     </w:tblPr>
   </w:style>
-  <w:style w:type="table" w:styleId="SombreadoClaro">
+  <w:style w:type="table" w:styleId="LightShading">
     <w:name w:val="Light Shading"/>
-    <w:basedOn w:val="Tabelanormal"/>
+    <w:basedOn w:val="TableNormal"/>
     <w:uiPriority w:val="60"/>
     <w:rsid w:val="00FC693F"/>
     <w:pPr>
@@ -3014,9 +2903,9 @@
       </w:tcPr>
     </w:tblStylePr>
   </w:style>
-  <w:style w:type="table" w:styleId="SombreadoClaro-Cor1">
+  <w:style w:type="table" w:styleId="LightShading-Accent1">
     <w:name w:val="Light Shading Accent 1"/>
-    <w:basedOn w:val="Tabelanormal"/>
+    <w:basedOn w:val="TableNormal"/>
     <w:uiPriority w:val="60"/>
     <w:rsid w:val="00FC693F"/>
     <w:pPr>
@@ -3110,9 +2999,9 @@
       </w:tcPr>
     </w:tblStylePr>
   </w:style>
-  <w:style w:type="table" w:styleId="SombreadoClaro-Cor2">
+  <w:style w:type="table" w:styleId="LightShading-Accent2">
     <w:name w:val="Light Shading Accent 2"/>
-    <w:basedOn w:val="Tabelanormal"/>
+    <w:basedOn w:val="TableNormal"/>
     <w:uiPriority w:val="60"/>
     <w:rsid w:val="00FC693F"/>
     <w:pPr>
@@ -3206,9 +3095,9 @@
       </w:tcPr>
     </w:tblStylePr>
   </w:style>
-  <w:style w:type="table" w:styleId="SombreadoClaro-Cor3">
+  <w:style w:type="table" w:styleId="LightShading-Accent3">
     <w:name w:val="Light Shading Accent 3"/>
-    <w:basedOn w:val="Tabelanormal"/>
+    <w:basedOn w:val="TableNormal"/>
     <w:uiPriority w:val="60"/>
     <w:rsid w:val="00FC693F"/>
     <w:pPr>
@@ -3302,9 +3191,9 @@
       </w:tcPr>
     </w:tblStylePr>
   </w:style>
-  <w:style w:type="table" w:styleId="SombreadoClaro-Cor4">
+  <w:style w:type="table" w:styleId="LightShading-Accent4">
     <w:name w:val="Light Shading Accent 4"/>
-    <w:basedOn w:val="Tabelanormal"/>
+    <w:basedOn w:val="TableNormal"/>
     <w:uiPriority w:val="60"/>
     <w:rsid w:val="00FC693F"/>
     <w:pPr>
@@ -3398,9 +3287,9 @@
       </w:tcPr>
     </w:tblStylePr>
   </w:style>
-  <w:style w:type="table" w:styleId="SombreadoClaro-Cor5">
+  <w:style w:type="table" w:styleId="LightShading-Accent5">
     <w:name w:val="Light Shading Accent 5"/>
-    <w:basedOn w:val="Tabelanormal"/>
+    <w:basedOn w:val="TableNormal"/>
     <w:uiPriority w:val="60"/>
     <w:rsid w:val="00FC693F"/>
     <w:pPr>
@@ -3494,9 +3383,9 @@
       </w:tcPr>
     </w:tblStylePr>
   </w:style>
-  <w:style w:type="table" w:styleId="SombreadoClaro-Cor6">
+  <w:style w:type="table" w:styleId="LightShading-Accent6">
     <w:name w:val="Light Shading Accent 6"/>
-    <w:basedOn w:val="Tabelanormal"/>
+    <w:basedOn w:val="TableNormal"/>
     <w:uiPriority w:val="60"/>
     <w:rsid w:val="00FC693F"/>
     <w:pPr>
@@ -3590,9 +3479,9 @@
       </w:tcPr>
     </w:tblStylePr>
   </w:style>
-  <w:style w:type="table" w:styleId="ListaClara">
+  <w:style w:type="table" w:styleId="LightList">
     <w:name w:val="Light List"/>
-    <w:basedOn w:val="Tabelanormal"/>
+    <w:basedOn w:val="TableNormal"/>
     <w:uiPriority w:val="61"/>
     <w:rsid w:val="00FC693F"/>
     <w:pPr>
@@ -3675,9 +3564,9 @@
       </w:tcPr>
     </w:tblStylePr>
   </w:style>
-  <w:style w:type="table" w:styleId="ListaClara-Cor1">
+  <w:style w:type="table" w:styleId="LightList-Accent1">
     <w:name w:val="Light List Accent 1"/>
-    <w:basedOn w:val="Tabelanormal"/>
+    <w:basedOn w:val="TableNormal"/>
     <w:uiPriority w:val="61"/>
     <w:rsid w:val="00FC693F"/>
     <w:pPr>
@@ -3760,9 +3649,9 @@
       </w:tcPr>
     </w:tblStylePr>
   </w:style>
-  <w:style w:type="table" w:styleId="ListaClara-Cor2">
+  <w:style w:type="table" w:styleId="LightList-Accent2">
     <w:name w:val="Light List Accent 2"/>
-    <w:basedOn w:val="Tabelanormal"/>
+    <w:basedOn w:val="TableNormal"/>
     <w:uiPriority w:val="61"/>
     <w:rsid w:val="00CB0664"/>
     <w:pPr>
@@ -3845,9 +3734,9 @@
       </w:tcPr>
     </w:tblStylePr>
   </w:style>
-  <w:style w:type="table" w:styleId="ListaClara-Cor3">
+  <w:style w:type="table" w:styleId="LightList-Accent3">
     <w:name w:val="Light List Accent 3"/>
-    <w:basedOn w:val="Tabelanormal"/>
+    <w:basedOn w:val="TableNormal"/>
     <w:uiPriority w:val="61"/>
     <w:rsid w:val="00CB0664"/>
     <w:pPr>
@@ -3930,9 +3819,9 @@
       </w:tcPr>
     </w:tblStylePr>
   </w:style>
-  <w:style w:type="table" w:styleId="ListaClara-Cor4">
+  <w:style w:type="table" w:styleId="LightList-Accent4">
     <w:name w:val="Light List Accent 4"/>
-    <w:basedOn w:val="Tabelanormal"/>
+    <w:basedOn w:val="TableNormal"/>
     <w:uiPriority w:val="61"/>
     <w:rsid w:val="00CB0664"/>
     <w:pPr>
@@ -4015,9 +3904,9 @@
       </w:tcPr>
     </w:tblStylePr>
   </w:style>
-  <w:style w:type="table" w:styleId="ListaClara-Cor5">
+  <w:style w:type="table" w:styleId="LightList-Accent5">
     <w:name w:val="Light List Accent 5"/>
-    <w:basedOn w:val="Tabelanormal"/>
+    <w:basedOn w:val="TableNormal"/>
     <w:uiPriority w:val="61"/>
     <w:rsid w:val="00CB0664"/>
     <w:pPr>
@@ -4100,9 +3989,9 @@
       </w:tcPr>
     </w:tblStylePr>
   </w:style>
-  <w:style w:type="table" w:styleId="ListaClara-Cor6">
+  <w:style w:type="table" w:styleId="LightList-Accent6">
     <w:name w:val="Light List Accent 6"/>
-    <w:basedOn w:val="Tabelanormal"/>
+    <w:basedOn w:val="TableNormal"/>
     <w:uiPriority w:val="61"/>
     <w:rsid w:val="00CB0664"/>
     <w:pPr>
@@ -4185,9 +4074,9 @@
       </w:tcPr>
     </w:tblStylePr>
   </w:style>
-  <w:style w:type="table" w:styleId="GrelhaClara">
+  <w:style w:type="table" w:styleId="LightGrid">
     <w:name w:val="Light Grid"/>
-    <w:basedOn w:val="Tabelanormal"/>
+    <w:basedOn w:val="TableNormal"/>
     <w:uiPriority w:val="62"/>
     <w:rsid w:val="00CB0664"/>
     <w:pPr>
@@ -4308,9 +4197,9 @@
       </w:tcPr>
     </w:tblStylePr>
   </w:style>
-  <w:style w:type="table" w:styleId="GrelhaClara-Cor1">
+  <w:style w:type="table" w:styleId="LightGrid-Accent1">
     <w:name w:val="Light Grid Accent 1"/>
-    <w:basedOn w:val="Tabelanormal"/>
+    <w:basedOn w:val="TableNormal"/>
     <w:uiPriority w:val="62"/>
     <w:rsid w:val="00CB0664"/>
     <w:pPr>
@@ -4431,9 +4320,9 @@
       </w:tcPr>
     </w:tblStylePr>
   </w:style>
-  <w:style w:type="table" w:styleId="GrelhaClara-Cor2">
+  <w:style w:type="table" w:styleId="LightGrid-Accent2">
     <w:name w:val="Light Grid Accent 2"/>
-    <w:basedOn w:val="Tabelanormal"/>
+    <w:basedOn w:val="TableNormal"/>
     <w:uiPriority w:val="62"/>
     <w:rsid w:val="00CB0664"/>
     <w:pPr>
@@ -4554,9 +4443,9 @@
       </w:tcPr>
     </w:tblStylePr>
   </w:style>
-  <w:style w:type="table" w:styleId="GrelhaClara-Cor3">
+  <w:style w:type="table" w:styleId="LightGrid-Accent3">
     <w:name w:val="Light Grid Accent 3"/>
-    <w:basedOn w:val="Tabelanormal"/>
+    <w:basedOn w:val="TableNormal"/>
     <w:uiPriority w:val="62"/>
     <w:rsid w:val="00CB0664"/>
     <w:pPr>
@@ -4677,9 +4566,9 @@
       </w:tcPr>
     </w:tblStylePr>
   </w:style>
-  <w:style w:type="table" w:styleId="GrelhaClara-Cor4">
+  <w:style w:type="table" w:styleId="LightGrid-Accent4">
     <w:name w:val="Light Grid Accent 4"/>
-    <w:basedOn w:val="Tabelanormal"/>
+    <w:basedOn w:val="TableNormal"/>
     <w:uiPriority w:val="62"/>
     <w:rsid w:val="00CB0664"/>
     <w:pPr>
@@ -4800,9 +4689,9 @@
       </w:tcPr>
     </w:tblStylePr>
   </w:style>
-  <w:style w:type="table" w:styleId="GrelhaClara-Cor5">
+  <w:style w:type="table" w:styleId="LightGrid-Accent5">
     <w:name w:val="Light Grid Accent 5"/>
-    <w:basedOn w:val="Tabelanormal"/>
+    <w:basedOn w:val="TableNormal"/>
     <w:uiPriority w:val="62"/>
     <w:rsid w:val="00CB0664"/>
     <w:pPr>
@@ -4923,9 +4812,9 @@
       </w:tcPr>
     </w:tblStylePr>
   </w:style>
-  <w:style w:type="table" w:styleId="GrelhaClara-Cor6">
+  <w:style w:type="table" w:styleId="LightGrid-Accent6">
     <w:name w:val="Light Grid Accent 6"/>
-    <w:basedOn w:val="Tabelanormal"/>
+    <w:basedOn w:val="TableNormal"/>
     <w:uiPriority w:val="62"/>
     <w:rsid w:val="00CB0664"/>
     <w:pPr>
@@ -5046,9 +4935,9 @@
       </w:tcPr>
     </w:tblStylePr>
   </w:style>
-  <w:style w:type="table" w:styleId="SombreadoMdio1">
+  <w:style w:type="table" w:styleId="MediumShading1">
     <w:name w:val="Medium Shading 1"/>
-    <w:basedOn w:val="Tabelanormal"/>
+    <w:basedOn w:val="TableNormal"/>
     <w:uiPriority w:val="63"/>
     <w:rsid w:val="00CB0664"/>
     <w:pPr>
@@ -5145,9 +5034,9 @@
       </w:tcPr>
     </w:tblStylePr>
   </w:style>
-  <w:style w:type="table" w:styleId="SombreadoMdio1-Cor1">
+  <w:style w:type="table" w:styleId="MediumShading1-Accent1">
     <w:name w:val="Medium Shading 1 Accent 1"/>
-    <w:basedOn w:val="Tabelanormal"/>
+    <w:basedOn w:val="TableNormal"/>
     <w:uiPriority w:val="63"/>
     <w:rsid w:val="00CB0664"/>
     <w:pPr>
@@ -5244,9 +5133,9 @@
       </w:tcPr>
     </w:tblStylePr>
   </w:style>
-  <w:style w:type="table" w:styleId="SombreadoMdio1-Cor2">
+  <w:style w:type="table" w:styleId="MediumShading1-Accent2">
     <w:name w:val="Medium Shading 1 Accent 2"/>
-    <w:basedOn w:val="Tabelanormal"/>
+    <w:basedOn w:val="TableNormal"/>
     <w:uiPriority w:val="63"/>
     <w:rsid w:val="00CB0664"/>
     <w:pPr>
@@ -5343,9 +5232,9 @@
       </w:tcPr>
     </w:tblStylePr>
   </w:style>
-  <w:style w:type="table" w:styleId="SombreadoMdio1-Cor3">
+  <w:style w:type="table" w:styleId="MediumShading1-Accent3">
     <w:name w:val="Medium Shading 1 Accent 3"/>
-    <w:basedOn w:val="Tabelanormal"/>
+    <w:basedOn w:val="TableNormal"/>
     <w:uiPriority w:val="63"/>
     <w:rsid w:val="00CB0664"/>
     <w:pPr>
@@ -5442,9 +5331,9 @@
       </w:tcPr>
     </w:tblStylePr>
   </w:style>
-  <w:style w:type="table" w:styleId="SombreadoMdio1-Cor4">
+  <w:style w:type="table" w:styleId="MediumShading1-Accent4">
     <w:name w:val="Medium Shading 1 Accent 4"/>
-    <w:basedOn w:val="Tabelanormal"/>
+    <w:basedOn w:val="TableNormal"/>
     <w:uiPriority w:val="63"/>
     <w:rsid w:val="00CB0664"/>
     <w:pPr>
@@ -5541,9 +5430,9 @@
       </w:tcPr>
     </w:tblStylePr>
   </w:style>
-  <w:style w:type="table" w:styleId="SombreadoMdio1-Cor5">
+  <w:style w:type="table" w:styleId="MediumShading1-Accent5">
     <w:name w:val="Medium Shading 1 Accent 5"/>
-    <w:basedOn w:val="Tabelanormal"/>
+    <w:basedOn w:val="TableNormal"/>
     <w:uiPriority w:val="63"/>
     <w:rsid w:val="00CB0664"/>
     <w:pPr>
@@ -5640,9 +5529,9 @@
       </w:tcPr>
     </w:tblStylePr>
   </w:style>
-  <w:style w:type="table" w:styleId="SombreadoMdio1-Cor6">
+  <w:style w:type="table" w:styleId="MediumShading1-Accent6">
     <w:name w:val="Medium Shading 1 Accent 6"/>
-    <w:basedOn w:val="Tabelanormal"/>
+    <w:basedOn w:val="TableNormal"/>
     <w:uiPriority w:val="63"/>
     <w:rsid w:val="00CB0664"/>
     <w:pPr>
@@ -5739,9 +5628,9 @@
       </w:tcPr>
     </w:tblStylePr>
   </w:style>
-  <w:style w:type="table" w:styleId="SombreadoMdio2">
+  <w:style w:type="table" w:styleId="MediumShading2">
     <w:name w:val="Medium Shading 2"/>
-    <w:basedOn w:val="Tabelanormal"/>
+    <w:basedOn w:val="TableNormal"/>
     <w:uiPriority w:val="64"/>
     <w:rsid w:val="00CB0664"/>
     <w:pPr>
@@ -5881,9 +5770,9 @@
       </w:tcPr>
     </w:tblStylePr>
   </w:style>
-  <w:style w:type="table" w:styleId="SombreadoMdio2-Cor1">
+  <w:style w:type="table" w:styleId="MediumShading2-Accent1">
     <w:name w:val="Medium Shading 2 Accent 1"/>
-    <w:basedOn w:val="Tabelanormal"/>
+    <w:basedOn w:val="TableNormal"/>
     <w:uiPriority w:val="64"/>
     <w:rsid w:val="00CB0664"/>
     <w:pPr>
@@ -6023,9 +5912,9 @@
       </w:tcPr>
     </w:tblStylePr>
   </w:style>
-  <w:style w:type="table" w:styleId="SombreadoMdio2-Cor2">
+  <w:style w:type="table" w:styleId="MediumShading2-Accent2">
     <w:name w:val="Medium Shading 2 Accent 2"/>
-    <w:basedOn w:val="Tabelanormal"/>
+    <w:basedOn w:val="TableNormal"/>
     <w:uiPriority w:val="64"/>
     <w:rsid w:val="00CB0664"/>
     <w:pPr>
@@ -6165,9 +6054,9 @@
       </w:tcPr>
     </w:tblStylePr>
   </w:style>
-  <w:style w:type="table" w:styleId="SombreadoMdio2-Cor3">
+  <w:style w:type="table" w:styleId="MediumShading2-Accent3">
     <w:name w:val="Medium Shading 2 Accent 3"/>
-    <w:basedOn w:val="Tabelanormal"/>
+    <w:basedOn w:val="TableNormal"/>
     <w:uiPriority w:val="64"/>
     <w:rsid w:val="00CB0664"/>
     <w:pPr>
@@ -6307,9 +6196,9 @@
       </w:tcPr>
     </w:tblStylePr>
   </w:style>
-  <w:style w:type="table" w:styleId="SombreadoMdio2-Cor4">
+  <w:style w:type="table" w:styleId="MediumShading2-Accent4">
     <w:name w:val="Medium Shading 2 Accent 4"/>
-    <w:basedOn w:val="Tabelanormal"/>
+    <w:basedOn w:val="TableNormal"/>
     <w:uiPriority w:val="64"/>
     <w:rsid w:val="00CB0664"/>
     <w:pPr>
@@ -6449,9 +6338,9 @@
       </w:tcPr>
     </w:tblStylePr>
   </w:style>
-  <w:style w:type="table" w:styleId="SombreadoMdio2-Cor5">
+  <w:style w:type="table" w:styleId="MediumShading2-Accent5">
     <w:name w:val="Medium Shading 2 Accent 5"/>
-    <w:basedOn w:val="Tabelanormal"/>
+    <w:basedOn w:val="TableNormal"/>
     <w:uiPriority w:val="64"/>
     <w:rsid w:val="00CB0664"/>
     <w:pPr>
@@ -6591,9 +6480,9 @@
       </w:tcPr>
     </w:tblStylePr>
   </w:style>
-  <w:style w:type="table" w:styleId="SombreadoMdio2-Cor6">
+  <w:style w:type="table" w:styleId="MediumShading2-Accent6">
     <w:name w:val="Medium Shading 2 Accent 6"/>
-    <w:basedOn w:val="Tabelanormal"/>
+    <w:basedOn w:val="TableNormal"/>
     <w:uiPriority w:val="64"/>
     <w:rsid w:val="00CB0664"/>
     <w:pPr>
@@ -6733,9 +6622,9 @@
       </w:tcPr>
     </w:tblStylePr>
   </w:style>
-  <w:style w:type="table" w:styleId="ListaMdia1">
+  <w:style w:type="table" w:styleId="MediumList1">
     <w:name w:val="Medium List 1"/>
-    <w:basedOn w:val="Tabelanormal"/>
+    <w:basedOn w:val="TableNormal"/>
     <w:uiPriority w:val="65"/>
     <w:rsid w:val="00CB0664"/>
     <w:pPr>
@@ -6810,9 +6699,9 @@
       </w:tcPr>
     </w:tblStylePr>
   </w:style>
-  <w:style w:type="table" w:styleId="ListaMdia1-Cor1">
+  <w:style w:type="table" w:styleId="MediumList1-Accent1">
     <w:name w:val="Medium List 1 Accent 1"/>
-    <w:basedOn w:val="Tabelanormal"/>
+    <w:basedOn w:val="TableNormal"/>
     <w:uiPriority w:val="65"/>
     <w:rsid w:val="00CB0664"/>
     <w:pPr>
@@ -6887,9 +6776,9 @@
       </w:tcPr>
     </w:tblStylePr>
   </w:style>
-  <w:style w:type="table" w:styleId="ListaMdia1-Cor2">
+  <w:style w:type="table" w:styleId="MediumList1-Accent2">
     <w:name w:val="Medium List 1 Accent 2"/>
-    <w:basedOn w:val="Tabelanormal"/>
+    <w:basedOn w:val="TableNormal"/>
     <w:uiPriority w:val="65"/>
     <w:rsid w:val="00CB0664"/>
     <w:pPr>
@@ -6964,9 +6853,9 @@
       </w:tcPr>
     </w:tblStylePr>
   </w:style>
-  <w:style w:type="table" w:styleId="ListaMdia1-Cor3">
+  <w:style w:type="table" w:styleId="MediumList1-Accent3">
     <w:name w:val="Medium List 1 Accent 3"/>
-    <w:basedOn w:val="Tabelanormal"/>
+    <w:basedOn w:val="TableNormal"/>
     <w:uiPriority w:val="65"/>
     <w:rsid w:val="00CB0664"/>
     <w:pPr>
@@ -7041,9 +6930,9 @@
       </w:tcPr>
     </w:tblStylePr>
   </w:style>
-  <w:style w:type="table" w:styleId="ListaMdia1-Cor4">
+  <w:style w:type="table" w:styleId="MediumList1-Accent4">
     <w:name w:val="Medium List 1 Accent 4"/>
-    <w:basedOn w:val="Tabelanormal"/>
+    <w:basedOn w:val="TableNormal"/>
     <w:uiPriority w:val="65"/>
     <w:rsid w:val="00CB0664"/>
     <w:pPr>
@@ -7118,9 +7007,9 @@
       </w:tcPr>
     </w:tblStylePr>
   </w:style>
-  <w:style w:type="table" w:styleId="ListaMdia1-Cor5">
+  <w:style w:type="table" w:styleId="MediumList1-Accent5">
     <w:name w:val="Medium List 1 Accent 5"/>
-    <w:basedOn w:val="Tabelanormal"/>
+    <w:basedOn w:val="TableNormal"/>
     <w:uiPriority w:val="65"/>
     <w:rsid w:val="00CB0664"/>
     <w:pPr>
@@ -7195,9 +7084,9 @@
       </w:tcPr>
     </w:tblStylePr>
   </w:style>
-  <w:style w:type="table" w:styleId="ListaMdia1-Cor6">
+  <w:style w:type="table" w:styleId="MediumList1-Accent6">
     <w:name w:val="Medium List 1 Accent 6"/>
-    <w:basedOn w:val="Tabelanormal"/>
+    <w:basedOn w:val="TableNormal"/>
     <w:uiPriority w:val="65"/>
     <w:rsid w:val="00CB0664"/>
     <w:pPr>
@@ -7272,9 +7161,9 @@
       </w:tcPr>
     </w:tblStylePr>
   </w:style>
-  <w:style w:type="table" w:styleId="ListaMdia2">
+  <w:style w:type="table" w:styleId="MediumList2">
     <w:name w:val="Medium List 2"/>
-    <w:basedOn w:val="Tabelanormal"/>
+    <w:basedOn w:val="TableNormal"/>
     <w:uiPriority w:val="66"/>
     <w:rsid w:val="00CB0664"/>
     <w:pPr>
@@ -7393,9 +7282,9 @@
       </w:tcPr>
     </w:tblStylePr>
   </w:style>
-  <w:style w:type="table" w:styleId="ListaMdia2-Cor1">
+  <w:style w:type="table" w:styleId="MediumList2-Accent1">
     <w:name w:val="Medium List 2 Accent 1"/>
-    <w:basedOn w:val="Tabelanormal"/>
+    <w:basedOn w:val="TableNormal"/>
     <w:uiPriority w:val="66"/>
     <w:rsid w:val="00CB0664"/>
     <w:pPr>
@@ -7514,9 +7403,9 @@
       </w:tcPr>
     </w:tblStylePr>
   </w:style>
-  <w:style w:type="table" w:styleId="ListaMdia2-Cor2">
+  <w:style w:type="table" w:styleId="MediumList2-Accent2">
     <w:name w:val="Medium List 2 Accent 2"/>
-    <w:basedOn w:val="Tabelanormal"/>
+    <w:basedOn w:val="TableNormal"/>
     <w:uiPriority w:val="66"/>
     <w:rsid w:val="00CB0664"/>
     <w:pPr>
@@ -7635,9 +7524,9 @@
       </w:tcPr>
     </w:tblStylePr>
   </w:style>
-  <w:style w:type="table" w:styleId="ListaMdia2-Cor3">
+  <w:style w:type="table" w:styleId="MediumList2-Accent3">
     <w:name w:val="Medium List 2 Accent 3"/>
-    <w:basedOn w:val="Tabelanormal"/>
+    <w:basedOn w:val="TableNormal"/>
     <w:uiPriority w:val="66"/>
     <w:rsid w:val="00CB0664"/>
     <w:pPr>
@@ -7756,9 +7645,9 @@
       </w:tcPr>
     </w:tblStylePr>
   </w:style>
-  <w:style w:type="table" w:styleId="ListaMdia2-Cor4">
+  <w:style w:type="table" w:styleId="MediumList2-Accent4">
     <w:name w:val="Medium List 2 Accent 4"/>
-    <w:basedOn w:val="Tabelanormal"/>
+    <w:basedOn w:val="TableNormal"/>
     <w:uiPriority w:val="66"/>
     <w:rsid w:val="00CB0664"/>
     <w:pPr>
@@ -7877,9 +7766,9 @@
       </w:tcPr>
     </w:tblStylePr>
   </w:style>
-  <w:style w:type="table" w:styleId="ListaMdia2-Cor5">
+  <w:style w:type="table" w:styleId="MediumList2-Accent5">
     <w:name w:val="Medium List 2 Accent 5"/>
-    <w:basedOn w:val="Tabelanormal"/>
+    <w:basedOn w:val="TableNormal"/>
     <w:uiPriority w:val="66"/>
     <w:rsid w:val="00CB0664"/>
     <w:pPr>
@@ -7998,9 +7887,9 @@
       </w:tcPr>
     </w:tblStylePr>
   </w:style>
-  <w:style w:type="table" w:styleId="ListaMdia2-Cor6">
+  <w:style w:type="table" w:styleId="MediumList2-Accent6">
     <w:name w:val="Medium List 2 Accent 6"/>
-    <w:basedOn w:val="Tabelanormal"/>
+    <w:basedOn w:val="TableNormal"/>
     <w:uiPriority w:val="66"/>
     <w:rsid w:val="00CB0664"/>
     <w:pPr>
@@ -8119,9 +8008,9 @@
       </w:tcPr>
     </w:tblStylePr>
   </w:style>
-  <w:style w:type="table" w:styleId="GrelhaMdia1">
+  <w:style w:type="table" w:styleId="MediumGrid1">
     <w:name w:val="Medium Grid 1"/>
-    <w:basedOn w:val="Tabelanormal"/>
+    <w:basedOn w:val="TableNormal"/>
     <w:uiPriority w:val="67"/>
     <w:rsid w:val="00CB0664"/>
     <w:pPr>
@@ -8185,9 +8074,9 @@
       </w:tcPr>
     </w:tblStylePr>
   </w:style>
-  <w:style w:type="table" w:styleId="GrelhaMdia1-Cor1">
+  <w:style w:type="table" w:styleId="MediumGrid1-Accent1">
     <w:name w:val="Medium Grid 1 Accent 1"/>
-    <w:basedOn w:val="Tabelanormal"/>
+    <w:basedOn w:val="TableNormal"/>
     <w:uiPriority w:val="67"/>
     <w:rsid w:val="00CB0664"/>
     <w:pPr>
@@ -8251,9 +8140,9 @@
       </w:tcPr>
     </w:tblStylePr>
   </w:style>
-  <w:style w:type="table" w:styleId="GrelhaMdia1-Cor2">
+  <w:style w:type="table" w:styleId="MediumGrid1-Accent2">
     <w:name w:val="Medium Grid 1 Accent 2"/>
-    <w:basedOn w:val="Tabelanormal"/>
+    <w:basedOn w:val="TableNormal"/>
     <w:uiPriority w:val="67"/>
     <w:rsid w:val="00CB0664"/>
     <w:pPr>
@@ -8317,9 +8206,9 @@
       </w:tcPr>
     </w:tblStylePr>
   </w:style>
-  <w:style w:type="table" w:styleId="GrelhaMdia1-Cor3">
+  <w:style w:type="table" w:styleId="MediumGrid1-Accent3">
     <w:name w:val="Medium Grid 1 Accent 3"/>
-    <w:basedOn w:val="Tabelanormal"/>
+    <w:basedOn w:val="TableNormal"/>
     <w:uiPriority w:val="67"/>
     <w:rsid w:val="00CB0664"/>
     <w:pPr>
@@ -8383,9 +8272,9 @@
       </w:tcPr>
     </w:tblStylePr>
   </w:style>
-  <w:style w:type="table" w:styleId="GrelhaMdia1-Cor4">
+  <w:style w:type="table" w:styleId="MediumGrid1-Accent4">
     <w:name w:val="Medium Grid 1 Accent 4"/>
-    <w:basedOn w:val="Tabelanormal"/>
+    <w:basedOn w:val="TableNormal"/>
     <w:uiPriority w:val="67"/>
     <w:rsid w:val="00CB0664"/>
     <w:pPr>
@@ -8449,9 +8338,9 @@
       </w:tcPr>
     </w:tblStylePr>
   </w:style>
-  <w:style w:type="table" w:styleId="GrelhaMdia1-Cor5">
+  <w:style w:type="table" w:styleId="MediumGrid1-Accent5">
     <w:name w:val="Medium Grid 1 Accent 5"/>
-    <w:basedOn w:val="Tabelanormal"/>
+    <w:basedOn w:val="TableNormal"/>
     <w:uiPriority w:val="67"/>
     <w:rsid w:val="00CB0664"/>
     <w:pPr>
@@ -8515,9 +8404,9 @@
       </w:tcPr>
     </w:tblStylePr>
   </w:style>
-  <w:style w:type="table" w:styleId="GrelhaMdia1-Cor6">
+  <w:style w:type="table" w:styleId="MediumGrid1-Accent6">
     <w:name w:val="Medium Grid 1 Accent 6"/>
-    <w:basedOn w:val="Tabelanormal"/>
+    <w:basedOn w:val="TableNormal"/>
     <w:uiPriority w:val="67"/>
     <w:rsid w:val="00CB0664"/>
     <w:pPr>
@@ -8581,9 +8470,9 @@
       </w:tcPr>
     </w:tblStylePr>
   </w:style>
-  <w:style w:type="table" w:styleId="GrelhaMdia2">
+  <w:style w:type="table" w:styleId="MediumGrid2">
     <w:name w:val="Medium Grid 2"/>
-    <w:basedOn w:val="Tabelanormal"/>
+    <w:basedOn w:val="TableNormal"/>
     <w:uiPriority w:val="68"/>
     <w:rsid w:val="00CB0664"/>
     <w:pPr>
@@ -8699,9 +8588,9 @@
       </w:tcPr>
     </w:tblStylePr>
   </w:style>
-  <w:style w:type="table" w:styleId="GrelhaMdia2-Cor1">
+  <w:style w:type="table" w:styleId="MediumGrid2-Accent1">
     <w:name w:val="Medium Grid 2 Accent 1"/>
-    <w:basedOn w:val="Tabelanormal"/>
+    <w:basedOn w:val="TableNormal"/>
     <w:uiPriority w:val="68"/>
     <w:rsid w:val="00CB0664"/>
     <w:pPr>
@@ -8817,9 +8706,9 @@
       </w:tcPr>
     </w:tblStylePr>
   </w:style>
-  <w:style w:type="table" w:styleId="GrelhaMdia2-Cor2">
+  <w:style w:type="table" w:styleId="MediumGrid2-Accent2">
     <w:name w:val="Medium Grid 2 Accent 2"/>
-    <w:basedOn w:val="Tabelanormal"/>
+    <w:basedOn w:val="TableNormal"/>
     <w:uiPriority w:val="68"/>
     <w:rsid w:val="00CB0664"/>
     <w:pPr>
@@ -8935,9 +8824,9 @@
       </w:tcPr>
     </w:tblStylePr>
   </w:style>
-  <w:style w:type="table" w:styleId="GrelhaMdia2-Cor3">
+  <w:style w:type="table" w:styleId="MediumGrid2-Accent3">
     <w:name w:val="Medium Grid 2 Accent 3"/>
-    <w:basedOn w:val="Tabelanormal"/>
+    <w:basedOn w:val="TableNormal"/>
     <w:uiPriority w:val="68"/>
     <w:rsid w:val="00CB0664"/>
     <w:pPr>
@@ -9053,9 +8942,9 @@
       </w:tcPr>
     </w:tblStylePr>
   </w:style>
-  <w:style w:type="table" w:styleId="GrelhaMdia2-Cor4">
+  <w:style w:type="table" w:styleId="MediumGrid2-Accent4">
     <w:name w:val="Medium Grid 2 Accent 4"/>
-    <w:basedOn w:val="Tabelanormal"/>
+    <w:basedOn w:val="TableNormal"/>
     <w:uiPriority w:val="68"/>
     <w:rsid w:val="00CB0664"/>
     <w:pPr>
@@ -9171,9 +9060,9 @@
       </w:tcPr>
     </w:tblStylePr>
   </w:style>
-  <w:style w:type="table" w:styleId="GrelhaMdia2-Cor5">
+  <w:style w:type="table" w:styleId="MediumGrid2-Accent5">
     <w:name w:val="Medium Grid 2 Accent 5"/>
-    <w:basedOn w:val="Tabelanormal"/>
+    <w:basedOn w:val="TableNormal"/>
     <w:uiPriority w:val="68"/>
     <w:rsid w:val="00CB0664"/>
     <w:pPr>
@@ -9289,9 +9178,9 @@
       </w:tcPr>
     </w:tblStylePr>
   </w:style>
-  <w:style w:type="table" w:styleId="GrelhaMdia2-Cor6">
+  <w:style w:type="table" w:styleId="MediumGrid2-Accent6">
     <w:name w:val="Medium Grid 2 Accent 6"/>
-    <w:basedOn w:val="Tabelanormal"/>
+    <w:basedOn w:val="TableNormal"/>
     <w:uiPriority w:val="68"/>
     <w:rsid w:val="00CB0664"/>
     <w:pPr>
@@ -9407,9 +9296,9 @@
       </w:tcPr>
     </w:tblStylePr>
   </w:style>
-  <w:style w:type="table" w:styleId="GrelhaMdia3">
+  <w:style w:type="table" w:styleId="MediumGrid3">
     <w:name w:val="Medium Grid 3"/>
-    <w:basedOn w:val="Tabelanormal"/>
+    <w:basedOn w:val="TableNormal"/>
     <w:uiPriority w:val="69"/>
     <w:rsid w:val="00CB0664"/>
     <w:pPr>
@@ -9541,9 +9430,9 @@
       </w:tcPr>
     </w:tblStylePr>
   </w:style>
-  <w:style w:type="table" w:styleId="GrelhaMdia3-Cor1">
+  <w:style w:type="table" w:styleId="MediumGrid3-Accent1">
     <w:name w:val="Medium Grid 3 Accent 1"/>
-    <w:basedOn w:val="Tabelanormal"/>
+    <w:basedOn w:val="TableNormal"/>
     <w:uiPriority w:val="69"/>
     <w:rsid w:val="00CB0664"/>
     <w:pPr>
@@ -9675,9 +9564,9 @@
       </w:tcPr>
     </w:tblStylePr>
   </w:style>
-  <w:style w:type="table" w:styleId="GrelhaMdia3-Cor2">
+  <w:style w:type="table" w:styleId="MediumGrid3-Accent2">
     <w:name w:val="Medium Grid 3 Accent 2"/>
-    <w:basedOn w:val="Tabelanormal"/>
+    <w:basedOn w:val="TableNormal"/>
     <w:uiPriority w:val="69"/>
     <w:rsid w:val="00CB0664"/>
     <w:pPr>
@@ -9809,9 +9698,9 @@
       </w:tcPr>
     </w:tblStylePr>
   </w:style>
-  <w:style w:type="table" w:styleId="GrelhaMdia3-Cor3">
+  <w:style w:type="table" w:styleId="MediumGrid3-Accent3">
     <w:name w:val="Medium Grid 3 Accent 3"/>
-    <w:basedOn w:val="Tabelanormal"/>
+    <w:basedOn w:val="TableNormal"/>
     <w:uiPriority w:val="69"/>
     <w:rsid w:val="00CB0664"/>
     <w:pPr>
@@ -9943,9 +9832,9 @@
       </w:tcPr>
     </w:tblStylePr>
   </w:style>
-  <w:style w:type="table" w:styleId="GrelhaMdia3-Cor4">
+  <w:style w:type="table" w:styleId="MediumGrid3-Accent4">
     <w:name w:val="Medium Grid 3 Accent 4"/>
-    <w:basedOn w:val="Tabelanormal"/>
+    <w:basedOn w:val="TableNormal"/>
     <w:uiPriority w:val="69"/>
     <w:rsid w:val="00CB0664"/>
     <w:pPr>
@@ -10077,9 +9966,9 @@
       </w:tcPr>
     </w:tblStylePr>
   </w:style>
-  <w:style w:type="table" w:styleId="GrelhaMdia3-Cor5">
+  <w:style w:type="table" w:styleId="MediumGrid3-Accent5">
     <w:name w:val="Medium Grid 3 Accent 5"/>
-    <w:basedOn w:val="Tabelanormal"/>
+    <w:basedOn w:val="TableNormal"/>
     <w:uiPriority w:val="69"/>
     <w:rsid w:val="00CB0664"/>
     <w:pPr>
@@ -10211,9 +10100,9 @@
       </w:tcPr>
     </w:tblStylePr>
   </w:style>
-  <w:style w:type="table" w:styleId="GrelhaMdia3-Cor6">
+  <w:style w:type="table" w:styleId="MediumGrid3-Accent6">
     <w:name w:val="Medium Grid 3 Accent 6"/>
-    <w:basedOn w:val="Tabelanormal"/>
+    <w:basedOn w:val="TableNormal"/>
     <w:uiPriority w:val="69"/>
     <w:rsid w:val="00CB0664"/>
     <w:pPr>
@@ -10345,9 +10234,9 @@
       </w:tcPr>
     </w:tblStylePr>
   </w:style>
-  <w:style w:type="table" w:styleId="ListaEscura">
+  <w:style w:type="table" w:styleId="DarkList">
     <w:name w:val="Dark List"/>
-    <w:basedOn w:val="Tabelanormal"/>
+    <w:basedOn w:val="TableNormal"/>
     <w:uiPriority w:val="70"/>
     <w:rsid w:val="00CB0664"/>
     <w:pPr>
@@ -10452,9 +10341,9 @@
       </w:tcPr>
     </w:tblStylePr>
   </w:style>
-  <w:style w:type="table" w:styleId="ListaEscura-Cor1">
+  <w:style w:type="table" w:styleId="DarkList-Accent1">
     <w:name w:val="Dark List Accent 1"/>
-    <w:basedOn w:val="Tabelanormal"/>
+    <w:basedOn w:val="TableNormal"/>
     <w:uiPriority w:val="70"/>
     <w:rsid w:val="00CB0664"/>
     <w:pPr>
@@ -10559,9 +10448,9 @@
       </w:tcPr>
     </w:tblStylePr>
   </w:style>
-  <w:style w:type="table" w:styleId="ListaEscura-Cor2">
+  <w:style w:type="table" w:styleId="DarkList-Accent2">
     <w:name w:val="Dark List Accent 2"/>
-    <w:basedOn w:val="Tabelanormal"/>
+    <w:basedOn w:val="TableNormal"/>
     <w:uiPriority w:val="70"/>
     <w:rsid w:val="00CB0664"/>
     <w:pPr>
@@ -10666,9 +10555,9 @@
       </w:tcPr>
     </w:tblStylePr>
   </w:style>
-  <w:style w:type="table" w:styleId="ListaEscura-Cor3">
+  <w:style w:type="table" w:styleId="DarkList-Accent3">
     <w:name w:val="Dark List Accent 3"/>
-    <w:basedOn w:val="Tabelanormal"/>
+    <w:basedOn w:val="TableNormal"/>
     <w:uiPriority w:val="70"/>
     <w:rsid w:val="00CB0664"/>
     <w:pPr>
@@ -10773,9 +10662,9 @@
       </w:tcPr>
     </w:tblStylePr>
   </w:style>
-  <w:style w:type="table" w:styleId="ListaEscura-Cor4">
+  <w:style w:type="table" w:styleId="DarkList-Accent4">
     <w:name w:val="Dark List Accent 4"/>
-    <w:basedOn w:val="Tabelanormal"/>
+    <w:basedOn w:val="TableNormal"/>
     <w:uiPriority w:val="70"/>
     <w:rsid w:val="00CB0664"/>
     <w:pPr>
@@ -10880,9 +10769,9 @@
       </w:tcPr>
     </w:tblStylePr>
   </w:style>
-  <w:style w:type="table" w:styleId="ListaEscura-Cor5">
+  <w:style w:type="table" w:styleId="DarkList-Accent5">
     <w:name w:val="Dark List Accent 5"/>
-    <w:basedOn w:val="Tabelanormal"/>
+    <w:basedOn w:val="TableNormal"/>
     <w:uiPriority w:val="70"/>
     <w:rsid w:val="00CB0664"/>
     <w:pPr>
@@ -10987,9 +10876,9 @@
       </w:tcPr>
     </w:tblStylePr>
   </w:style>
-  <w:style w:type="table" w:styleId="ListaEscura-Cor6">
+  <w:style w:type="table" w:styleId="DarkList-Accent6">
     <w:name w:val="Dark List Accent 6"/>
-    <w:basedOn w:val="Tabelanormal"/>
+    <w:basedOn w:val="TableNormal"/>
     <w:uiPriority w:val="70"/>
     <w:rsid w:val="00CB0664"/>
     <w:pPr>
@@ -11094,9 +10983,9 @@
       </w:tcPr>
     </w:tblStylePr>
   </w:style>
-  <w:style w:type="table" w:styleId="SombreadoColorido">
+  <w:style w:type="table" w:styleId="ColorfulShading">
     <w:name w:val="Colorful Shading"/>
-    <w:basedOn w:val="Tabelanormal"/>
+    <w:basedOn w:val="TableNormal"/>
     <w:uiPriority w:val="71"/>
     <w:rsid w:val="00CB0664"/>
     <w:pPr>
@@ -11209,9 +11098,9 @@
       </w:rPr>
     </w:tblStylePr>
   </w:style>
-  <w:style w:type="table" w:styleId="SombreadoColorido-Cor1">
+  <w:style w:type="table" w:styleId="ColorfulShading-Accent1">
     <w:name w:val="Colorful Shading Accent 1"/>
-    <w:basedOn w:val="Tabelanormal"/>
+    <w:basedOn w:val="TableNormal"/>
     <w:uiPriority w:val="71"/>
     <w:rsid w:val="00CB0664"/>
     <w:pPr>
@@ -11324,9 +11213,9 @@
       </w:rPr>
     </w:tblStylePr>
   </w:style>
-  <w:style w:type="table" w:styleId="SombreadoColorido-Cor2">
+  <w:style w:type="table" w:styleId="ColorfulShading-Accent2">
     <w:name w:val="Colorful Shading Accent 2"/>
-    <w:basedOn w:val="Tabelanormal"/>
+    <w:basedOn w:val="TableNormal"/>
     <w:uiPriority w:val="71"/>
     <w:rsid w:val="00CB0664"/>
     <w:pPr>
@@ -11439,9 +11328,9 @@
       </w:rPr>
     </w:tblStylePr>
   </w:style>
-  <w:style w:type="table" w:styleId="SombreadoColorido-Cor3">
+  <w:style w:type="table" w:styleId="ColorfulShading-Accent3">
     <w:name w:val="Colorful Shading Accent 3"/>
-    <w:basedOn w:val="Tabelanormal"/>
+    <w:basedOn w:val="TableNormal"/>
     <w:uiPriority w:val="71"/>
     <w:rsid w:val="00CB0664"/>
     <w:pPr>
@@ -11544,9 +11433,9 @@
       </w:tcPr>
     </w:tblStylePr>
   </w:style>
-  <w:style w:type="table" w:styleId="SombreadoColorido-Cor4">
+  <w:style w:type="table" w:styleId="ColorfulShading-Accent4">
     <w:name w:val="Colorful Shading Accent 4"/>
-    <w:basedOn w:val="Tabelanormal"/>
+    <w:basedOn w:val="TableNormal"/>
     <w:uiPriority w:val="71"/>
     <w:rsid w:val="00CB0664"/>
     <w:pPr>
@@ -11659,9 +11548,9 @@
       </w:rPr>
     </w:tblStylePr>
   </w:style>
-  <w:style w:type="table" w:styleId="SombreadoColorido-Cor5">
+  <w:style w:type="table" w:styleId="ColorfulShading-Accent5">
     <w:name w:val="Colorful Shading Accent 5"/>
-    <w:basedOn w:val="Tabelanormal"/>
+    <w:basedOn w:val="TableNormal"/>
     <w:uiPriority w:val="71"/>
     <w:rsid w:val="00CB0664"/>
     <w:pPr>
@@ -11774,9 +11663,9 @@
       </w:rPr>
     </w:tblStylePr>
   </w:style>
-  <w:style w:type="table" w:styleId="SombreadoColorido-Cor6">
+  <w:style w:type="table" w:styleId="ColorfulShading-Accent6">
     <w:name w:val="Colorful Shading Accent 6"/>
-    <w:basedOn w:val="Tabelanormal"/>
+    <w:basedOn w:val="TableNormal"/>
     <w:uiPriority w:val="71"/>
     <w:rsid w:val="00CB0664"/>
     <w:pPr>
@@ -11889,9 +11778,9 @@
       </w:rPr>
     </w:tblStylePr>
   </w:style>
-  <w:style w:type="table" w:styleId="ListaColorida">
+  <w:style w:type="table" w:styleId="ColorfulList">
     <w:name w:val="Colorful List"/>
-    <w:basedOn w:val="Tabelanormal"/>
+    <w:basedOn w:val="TableNormal"/>
     <w:uiPriority w:val="72"/>
     <w:rsid w:val="00CB0664"/>
     <w:pPr>
@@ -11968,9 +11857,9 @@
       </w:tcPr>
     </w:tblStylePr>
   </w:style>
-  <w:style w:type="table" w:styleId="ListaColorida-Cor1">
+  <w:style w:type="table" w:styleId="ColorfulList-Accent1">
     <w:name w:val="Colorful List Accent 1"/>
-    <w:basedOn w:val="Tabelanormal"/>
+    <w:basedOn w:val="TableNormal"/>
     <w:uiPriority w:val="72"/>
     <w:rsid w:val="00CB0664"/>
     <w:pPr>
@@ -12047,9 +11936,9 @@
       </w:tcPr>
     </w:tblStylePr>
   </w:style>
-  <w:style w:type="table" w:styleId="ListaColorida-Cor2">
+  <w:style w:type="table" w:styleId="ColorfulList-Accent2">
     <w:name w:val="Colorful List Accent 2"/>
-    <w:basedOn w:val="Tabelanormal"/>
+    <w:basedOn w:val="TableNormal"/>
     <w:uiPriority w:val="72"/>
     <w:rsid w:val="00CB0664"/>
     <w:pPr>
@@ -12126,9 +12015,9 @@
       </w:tcPr>
     </w:tblStylePr>
   </w:style>
-  <w:style w:type="table" w:styleId="ListaColorida-Cor3">
+  <w:style w:type="table" w:styleId="ColorfulList-Accent3">
     <w:name w:val="Colorful List Accent 3"/>
-    <w:basedOn w:val="Tabelanormal"/>
+    <w:basedOn w:val="TableNormal"/>
     <w:uiPriority w:val="72"/>
     <w:rsid w:val="00CB0664"/>
     <w:pPr>
@@ -12205,9 +12094,9 @@
       </w:tcPr>
     </w:tblStylePr>
   </w:style>
-  <w:style w:type="table" w:styleId="ListaColorida-Cor4">
+  <w:style w:type="table" w:styleId="ColorfulList-Accent4">
     <w:name w:val="Colorful List Accent 4"/>
-    <w:basedOn w:val="Tabelanormal"/>
+    <w:basedOn w:val="TableNormal"/>
     <w:uiPriority w:val="72"/>
     <w:rsid w:val="00CB0664"/>
     <w:pPr>
@@ -12284,9 +12173,9 @@
       </w:tcPr>
     </w:tblStylePr>
   </w:style>
-  <w:style w:type="table" w:styleId="ListaColorida-Cor5">
+  <w:style w:type="table" w:styleId="ColorfulList-Accent5">
     <w:name w:val="Colorful List Accent 5"/>
-    <w:basedOn w:val="Tabelanormal"/>
+    <w:basedOn w:val="TableNormal"/>
     <w:uiPriority w:val="72"/>
     <w:rsid w:val="00CB0664"/>
     <w:pPr>
@@ -12363,9 +12252,9 @@
       </w:tcPr>
     </w:tblStylePr>
   </w:style>
-  <w:style w:type="table" w:styleId="ListaColorida-Cor6">
+  <w:style w:type="table" w:styleId="ColorfulList-Accent6">
     <w:name w:val="Colorful List Accent 6"/>
-    <w:basedOn w:val="Tabelanormal"/>
+    <w:basedOn w:val="TableNormal"/>
     <w:uiPriority w:val="72"/>
     <w:rsid w:val="00CB0664"/>
     <w:pPr>
@@ -12442,9 +12331,9 @@
       </w:tcPr>
     </w:tblStylePr>
   </w:style>
-  <w:style w:type="table" w:styleId="GrelhaColorida">
+  <w:style w:type="table" w:styleId="ColorfulGrid">
     <w:name w:val="Colorful Grid"/>
-    <w:basedOn w:val="Tabelanormal"/>
+    <w:basedOn w:val="TableNormal"/>
     <w:uiPriority w:val="73"/>
     <w:rsid w:val="00CB0664"/>
     <w:pPr>
@@ -12515,9 +12404,9 @@
       </w:tcPr>
     </w:tblStylePr>
   </w:style>
-  <w:style w:type="table" w:styleId="GrelhaColorida-Cor1">
+  <w:style w:type="table" w:styleId="ColorfulGrid-Accent1">
     <w:name w:val="Colorful Grid Accent 1"/>
-    <w:basedOn w:val="Tabelanormal"/>
+    <w:basedOn w:val="TableNormal"/>
     <w:uiPriority w:val="73"/>
     <w:rsid w:val="00CB0664"/>
     <w:pPr>
@@ -12588,9 +12477,9 @@
       </w:tcPr>
     </w:tblStylePr>
   </w:style>
-  <w:style w:type="table" w:styleId="GrelhaColorida-Cor2">
+  <w:style w:type="table" w:styleId="ColorfulGrid-Accent2">
     <w:name w:val="Colorful Grid Accent 2"/>
-    <w:basedOn w:val="Tabelanormal"/>
+    <w:basedOn w:val="TableNormal"/>
     <w:uiPriority w:val="73"/>
     <w:rsid w:val="00CB0664"/>
     <w:pPr>
@@ -12661,9 +12550,9 @@
       </w:tcPr>
     </w:tblStylePr>
   </w:style>
-  <w:style w:type="table" w:styleId="GrelhaColorida-Cor3">
+  <w:style w:type="table" w:styleId="ColorfulGrid-Accent3">
     <w:name w:val="Colorful Grid Accent 3"/>
-    <w:basedOn w:val="Tabelanormal"/>
+    <w:basedOn w:val="TableNormal"/>
     <w:uiPriority w:val="73"/>
     <w:rsid w:val="00CB0664"/>
     <w:pPr>
@@ -12734,9 +12623,9 @@
       </w:tcPr>
     </w:tblStylePr>
   </w:style>
-  <w:style w:type="table" w:styleId="GrelhaColorida-Cor4">
+  <w:style w:type="table" w:styleId="ColorfulGrid-Accent4">
     <w:name w:val="Colorful Grid Accent 4"/>
-    <w:basedOn w:val="Tabelanormal"/>
+    <w:basedOn w:val="TableNormal"/>
     <w:uiPriority w:val="73"/>
     <w:rsid w:val="00CB0664"/>
     <w:pPr>
@@ -12807,9 +12696,9 @@
       </w:tcPr>
     </w:tblStylePr>
   </w:style>
-  <w:style w:type="table" w:styleId="GrelhaColorida-Cor5">
+  <w:style w:type="table" w:styleId="ColorfulGrid-Accent5">
     <w:name w:val="Colorful Grid Accent 5"/>
-    <w:basedOn w:val="Tabelanormal"/>
+    <w:basedOn w:val="TableNormal"/>
     <w:uiPriority w:val="73"/>
     <w:rsid w:val="00CB0664"/>
     <w:pPr>
@@ -12880,9 +12769,9 @@
       </w:tcPr>
     </w:tblStylePr>
   </w:style>
-  <w:style w:type="table" w:styleId="GrelhaColorida-Cor6">
+  <w:style w:type="table" w:styleId="ColorfulGrid-Accent6">
     <w:name w:val="Colorful Grid Accent 6"/>
-    <w:basedOn w:val="Tabelanormal"/>
+    <w:basedOn w:val="TableNormal"/>
     <w:uiPriority w:val="73"/>
     <w:rsid w:val="00CB0664"/>
     <w:pPr>

</xml_diff>

<commit_message>
[Feature] Adiciona vista de Agenda e reorganiza navegação na app Android
      - implementa a nova AgendaActivity com o respetivo layout e ícones
      - reorganiza as abas da barra de navegação inferior (BottomNavigation) para incluir a Agenda
      - altera a métrica Hoje na página inicial (HomeActivity) para reencaminhar para a Agenda
      - atualiza a MainActivity para forçar o término de sessão (limpeza de dados) no arranque da aplicação
      - garante a remoção da chave location do armazenamento local durante o _logout_
      - atualiza as imagens de pré-visualização (prints) dos ecrãs Android e remove as antigas
      - atualiza o documento detalhado do calendário do projeto
</commit_message>
<xml_diff>
--- a/docs/Calendario_Detalhado_Hephaestus.docx
+++ b/docs/Calendario_Detalhado_Hephaestus.docx
@@ -4,37 +4,16 @@
   <w:body>
     <w:p>
       <w:pPr>
-        <w:pStyle w:val="Title"/>
+        <w:pStyle w:val="Ttulo"/>
       </w:pPr>
-      <w:proofErr w:type="spellStart"/>
       <w:r>
-        <w:t>Cronograma</w:t>
-      </w:r>
-      <w:proofErr w:type="spellEnd"/>
-      <w:r>
-        <w:t xml:space="preserve"> </w:t>
-      </w:r>
-      <w:proofErr w:type="spellStart"/>
-      <w:r>
-        <w:t>Detalhado</w:t>
-      </w:r>
-      <w:proofErr w:type="spellEnd"/>
-      <w:r>
-        <w:t xml:space="preserve"> de </w:t>
-      </w:r>
-      <w:proofErr w:type="spellStart"/>
-      <w:r>
-        <w:t>Tarefas</w:t>
-      </w:r>
-      <w:proofErr w:type="spellEnd"/>
-      <w:r>
-        <w:t xml:space="preserve"> - Hephaestus</w:t>
+        <w:t>Cronograma Detalhado de Tarefas - Hephaestus</w:t>
       </w:r>
     </w:p>
     <w:p/>
     <w:tbl>
       <w:tblPr>
-        <w:tblStyle w:val="TableGrid"/>
+        <w:tblStyle w:val="TabelacomGrelha"/>
         <w:tblW w:w="0" w:type="auto"/>
         <w:tblLook w:val="04A0" w:firstRow="1" w:lastRow="0" w:firstColumn="1" w:lastColumn="0" w:noHBand="0" w:noVBand="1"/>
       </w:tblPr>
@@ -62,14 +41,12 @@
             <w:tcW w:w="2880" w:type="dxa"/>
           </w:tcPr>
           <w:p>
-            <w:proofErr w:type="spellStart"/>
             <w:r>
               <w:rPr>
                 <w:b/>
               </w:rPr>
               <w:t>Período</w:t>
             </w:r>
-            <w:proofErr w:type="spellEnd"/>
           </w:p>
         </w:tc>
         <w:tc>
@@ -77,28 +54,12 @@
             <w:tcW w:w="2880" w:type="dxa"/>
           </w:tcPr>
           <w:p>
-            <w:proofErr w:type="spellStart"/>
             <w:r>
               <w:rPr>
                 <w:b/>
               </w:rPr>
-              <w:t>Tarefas</w:t>
+              <w:t>Tarefas e Ecrãs</w:t>
             </w:r>
-            <w:proofErr w:type="spellEnd"/>
-            <w:r>
-              <w:rPr>
-                <w:b/>
-              </w:rPr>
-              <w:t xml:space="preserve"> e </w:t>
-            </w:r>
-            <w:proofErr w:type="spellStart"/>
-            <w:r>
-              <w:rPr>
-                <w:b/>
-              </w:rPr>
-              <w:t>Ecrãs</w:t>
-            </w:r>
-            <w:proofErr w:type="spellEnd"/>
           </w:p>
         </w:tc>
       </w:tr>
@@ -309,21 +270,7 @@
               <w:rPr>
                 <w:highlight w:val="green"/>
               </w:rPr>
-              <w:t xml:space="preserve">09/08 </w:t>
-            </w:r>
-            <w:proofErr w:type="gramStart"/>
-            <w:r>
-              <w:rPr>
-                <w:highlight w:val="green"/>
-              </w:rPr>
-              <w:t>a</w:t>
-            </w:r>
-            <w:proofErr w:type="gramEnd"/>
-            <w:r>
-              <w:rPr>
-                <w:highlight w:val="green"/>
-              </w:rPr>
-              <w:t xml:space="preserve"> 11/08</w:t>
+              <w:t>09/08 a 11/08</w:t>
             </w:r>
           </w:p>
         </w:tc>
@@ -381,21 +328,7 @@
               <w:rPr>
                 <w:highlight w:val="green"/>
               </w:rPr>
-              <w:t>12/</w:t>
-            </w:r>
-            <w:proofErr w:type="gramStart"/>
-            <w:r>
-              <w:rPr>
-                <w:highlight w:val="green"/>
-              </w:rPr>
-              <w:t>08 a</w:t>
-            </w:r>
-            <w:proofErr w:type="gramEnd"/>
-            <w:r>
-              <w:rPr>
-                <w:highlight w:val="green"/>
-              </w:rPr>
-              <w:t xml:space="preserve"> 14/08</w:t>
+              <w:t>12/08 a 14/08</w:t>
             </w:r>
           </w:p>
         </w:tc>
@@ -511,21 +444,7 @@
               <w:rPr>
                 <w:highlight w:val="green"/>
               </w:rPr>
-              <w:t xml:space="preserve">17/08 </w:t>
-            </w:r>
-            <w:proofErr w:type="gramStart"/>
-            <w:r>
-              <w:rPr>
-                <w:highlight w:val="green"/>
-              </w:rPr>
-              <w:t>a</w:t>
-            </w:r>
-            <w:proofErr w:type="gramEnd"/>
-            <w:r>
-              <w:rPr>
-                <w:highlight w:val="green"/>
-              </w:rPr>
-              <w:t xml:space="preserve"> 18/08</w:t>
+              <w:t>17/08 a 18/08</w:t>
             </w:r>
           </w:p>
         </w:tc>
@@ -756,7 +675,15 @@
             <w:tcW w:w="2880" w:type="dxa"/>
           </w:tcPr>
           <w:p>
+            <w:pPr>
+              <w:rPr>
+                <w:highlight w:val="yellow"/>
+              </w:rPr>
+            </w:pPr>
             <w:r>
+              <w:rPr>
+                <w:highlight w:val="yellow"/>
+              </w:rPr>
               <w:lastRenderedPageBreak/>
               <w:t>Frontend Mobile</w:t>
             </w:r>
@@ -767,7 +694,15 @@
             <w:tcW w:w="2880" w:type="dxa"/>
           </w:tcPr>
           <w:p>
+            <w:pPr>
+              <w:rPr>
+                <w:highlight w:val="yellow"/>
+              </w:rPr>
+            </w:pPr>
             <w:r>
+              <w:rPr>
+                <w:highlight w:val="yellow"/>
+              </w:rPr>
               <w:t>25/08 a 26/08</w:t>
             </w:r>
           </w:p>
@@ -779,11 +714,13 @@
           <w:p>
             <w:pPr>
               <w:rPr>
+                <w:highlight w:val="yellow"/>
                 <w:lang w:val="pt-PT"/>
               </w:rPr>
             </w:pPr>
             <w:r>
               <w:rPr>
+                <w:highlight w:val="yellow"/>
                 <w:lang w:val="pt-PT"/>
               </w:rPr>
               <w:t>Ecrã da Agenda Diária do Técnico e implementação de alertas visuais de perda de ligação à rede.</w:t>
@@ -1008,15 +945,7 @@
           </w:tcPr>
           <w:p>
             <w:r>
-              <w:t xml:space="preserve">14/09 </w:t>
-            </w:r>
-            <w:proofErr w:type="gramStart"/>
-            <w:r>
-              <w:t>a</w:t>
-            </w:r>
-            <w:proofErr w:type="gramEnd"/>
-            <w:r>
-              <w:t xml:space="preserve"> 18/09</w:t>
+              <w:t>14/09 a 18/09</w:t>
             </w:r>
           </w:p>
         </w:tc>
@@ -1111,21 +1040,8 @@
               </w:rPr>
               <w:t xml:space="preserve">Testes de Integração e Interface (E2E) em ambiente Web e Mobile. </w:t>
             </w:r>
-            <w:proofErr w:type="spellStart"/>
             <w:r>
-              <w:t>Resolução</w:t>
-            </w:r>
-            <w:proofErr w:type="spellEnd"/>
-            <w:r>
-              <w:t xml:space="preserve"> de Bugs </w:t>
-            </w:r>
-            <w:proofErr w:type="spellStart"/>
-            <w:r>
-              <w:t>identificados</w:t>
-            </w:r>
-            <w:proofErr w:type="spellEnd"/>
-            <w:r>
-              <w:t>.</w:t>
+              <w:t>Resolução de Bugs identificados.</w:t>
             </w:r>
           </w:p>
         </w:tc>
@@ -1302,7 +1218,7 @@
     <w:lvl w:ilvl="0">
       <w:start w:val="1"/>
       <w:numFmt w:val="decimal"/>
-      <w:pStyle w:val="ListNumber3"/>
+      <w:pStyle w:val="Listanumerada3"/>
       <w:lvlText w:val="%1."/>
       <w:lvlJc w:val="left"/>
       <w:pPr>
@@ -1320,7 +1236,7 @@
     <w:lvl w:ilvl="0">
       <w:start w:val="1"/>
       <w:numFmt w:val="decimal"/>
-      <w:pStyle w:val="ListNumber2"/>
+      <w:pStyle w:val="Listanumerada2"/>
       <w:lvlText w:val="%1."/>
       <w:lvlJc w:val="left"/>
       <w:pPr>
@@ -1358,7 +1274,7 @@
     <w:lvl w:ilvl="0">
       <w:start w:val="1"/>
       <w:numFmt w:val="bullet"/>
-      <w:pStyle w:val="ListBullet3"/>
+      <w:pStyle w:val="Listacommarcas3"/>
       <w:lvlText w:val=""/>
       <w:lvlJc w:val="left"/>
       <w:pPr>
@@ -1379,7 +1295,7 @@
     <w:lvl w:ilvl="0">
       <w:start w:val="1"/>
       <w:numFmt w:val="bullet"/>
-      <w:pStyle w:val="ListBullet2"/>
+      <w:pStyle w:val="Listacommarcas2"/>
       <w:lvlText w:val=""/>
       <w:lvlJc w:val="left"/>
       <w:pPr>
@@ -1400,7 +1316,7 @@
     <w:lvl w:ilvl="0">
       <w:start w:val="1"/>
       <w:numFmt w:val="decimal"/>
-      <w:pStyle w:val="ListNumber"/>
+      <w:pStyle w:val="Listanumerada"/>
       <w:lvlText w:val="%1."/>
       <w:lvlJc w:val="left"/>
       <w:pPr>
@@ -1418,7 +1334,7 @@
     <w:lvl w:ilvl="0">
       <w:start w:val="1"/>
       <w:numFmt w:val="bullet"/>
-      <w:pStyle w:val="ListBullet"/>
+      <w:pStyle w:val="Listacommarcas"/>
       <w:lvlText w:val=""/>
       <w:lvlJc w:val="left"/>
       <w:pPr>
@@ -1853,11 +1769,11 @@
     <w:qFormat/>
     <w:rsid w:val="00FC693F"/>
   </w:style>
-  <w:style w:type="paragraph" w:styleId="Heading1">
+  <w:style w:type="paragraph" w:styleId="Ttulo1">
     <w:name w:val="heading 1"/>
     <w:basedOn w:val="Normal"/>
     <w:next w:val="Normal"/>
-    <w:link w:val="Heading1Char"/>
+    <w:link w:val="Ttulo1Carter"/>
     <w:uiPriority w:val="9"/>
     <w:qFormat/>
     <w:rsid w:val="00FC693F"/>
@@ -1876,11 +1792,11 @@
       <w:szCs w:val="28"/>
     </w:rPr>
   </w:style>
-  <w:style w:type="paragraph" w:styleId="Heading2">
+  <w:style w:type="paragraph" w:styleId="Ttulo2">
     <w:name w:val="heading 2"/>
     <w:basedOn w:val="Normal"/>
     <w:next w:val="Normal"/>
-    <w:link w:val="Heading2Char"/>
+    <w:link w:val="Ttulo2Carter"/>
     <w:uiPriority w:val="9"/>
     <w:unhideWhenUsed/>
     <w:qFormat/>
@@ -1900,11 +1816,11 @@
       <w:szCs w:val="26"/>
     </w:rPr>
   </w:style>
-  <w:style w:type="paragraph" w:styleId="Heading3">
+  <w:style w:type="paragraph" w:styleId="Ttulo3">
     <w:name w:val="heading 3"/>
     <w:basedOn w:val="Normal"/>
     <w:next w:val="Normal"/>
-    <w:link w:val="Heading3Char"/>
+    <w:link w:val="Ttulo3Carter"/>
     <w:uiPriority w:val="9"/>
     <w:unhideWhenUsed/>
     <w:qFormat/>
@@ -1922,11 +1838,11 @@
       <w:color w:val="4F81BD" w:themeColor="accent1"/>
     </w:rPr>
   </w:style>
-  <w:style w:type="paragraph" w:styleId="Heading4">
+  <w:style w:type="paragraph" w:styleId="Ttulo4">
     <w:name w:val="heading 4"/>
     <w:basedOn w:val="Normal"/>
     <w:next w:val="Normal"/>
-    <w:link w:val="Heading4Char"/>
+    <w:link w:val="Ttulo4Carter"/>
     <w:uiPriority w:val="9"/>
     <w:semiHidden/>
     <w:unhideWhenUsed/>
@@ -1947,11 +1863,11 @@
       <w:color w:val="4F81BD" w:themeColor="accent1"/>
     </w:rPr>
   </w:style>
-  <w:style w:type="paragraph" w:styleId="Heading5">
+  <w:style w:type="paragraph" w:styleId="Ttulo5">
     <w:name w:val="heading 5"/>
     <w:basedOn w:val="Normal"/>
     <w:next w:val="Normal"/>
-    <w:link w:val="Heading5Char"/>
+    <w:link w:val="Ttulo5Carter"/>
     <w:uiPriority w:val="9"/>
     <w:semiHidden/>
     <w:unhideWhenUsed/>
@@ -1968,11 +1884,11 @@
       <w:color w:val="243F60" w:themeColor="accent1" w:themeShade="7F"/>
     </w:rPr>
   </w:style>
-  <w:style w:type="paragraph" w:styleId="Heading6">
+  <w:style w:type="paragraph" w:styleId="Ttulo6">
     <w:name w:val="heading 6"/>
     <w:basedOn w:val="Normal"/>
     <w:next w:val="Normal"/>
-    <w:link w:val="Heading6Char"/>
+    <w:link w:val="Ttulo6Carter"/>
     <w:uiPriority w:val="9"/>
     <w:semiHidden/>
     <w:unhideWhenUsed/>
@@ -1991,11 +1907,11 @@
       <w:color w:val="243F60" w:themeColor="accent1" w:themeShade="7F"/>
     </w:rPr>
   </w:style>
-  <w:style w:type="paragraph" w:styleId="Heading7">
+  <w:style w:type="paragraph" w:styleId="Ttulo7">
     <w:name w:val="heading 7"/>
     <w:basedOn w:val="Normal"/>
     <w:next w:val="Normal"/>
-    <w:link w:val="Heading7Char"/>
+    <w:link w:val="Ttulo7Carter"/>
     <w:uiPriority w:val="9"/>
     <w:semiHidden/>
     <w:unhideWhenUsed/>
@@ -2014,11 +1930,11 @@
       <w:color w:val="404040" w:themeColor="text1" w:themeTint="BF"/>
     </w:rPr>
   </w:style>
-  <w:style w:type="paragraph" w:styleId="Heading8">
+  <w:style w:type="paragraph" w:styleId="Ttulo8">
     <w:name w:val="heading 8"/>
     <w:basedOn w:val="Normal"/>
     <w:next w:val="Normal"/>
-    <w:link w:val="Heading8Char"/>
+    <w:link w:val="Ttulo8Carter"/>
     <w:uiPriority w:val="9"/>
     <w:semiHidden/>
     <w:unhideWhenUsed/>
@@ -2037,11 +1953,11 @@
       <w:szCs w:val="20"/>
     </w:rPr>
   </w:style>
-  <w:style w:type="paragraph" w:styleId="Heading9">
+  <w:style w:type="paragraph" w:styleId="Ttulo9">
     <w:name w:val="heading 9"/>
     <w:basedOn w:val="Normal"/>
     <w:next w:val="Normal"/>
-    <w:link w:val="Heading9Char"/>
+    <w:link w:val="Ttulo9Carter"/>
     <w:uiPriority w:val="9"/>
     <w:semiHidden/>
     <w:unhideWhenUsed/>
@@ -2062,13 +1978,13 @@
       <w:szCs w:val="20"/>
     </w:rPr>
   </w:style>
-  <w:style w:type="character" w:default="1" w:styleId="DefaultParagraphFont">
+  <w:style w:type="character" w:default="1" w:styleId="Tipodeletrapredefinidodopargrafo">
     <w:name w:val="Default Paragraph Font"/>
     <w:uiPriority w:val="1"/>
     <w:semiHidden/>
     <w:unhideWhenUsed/>
   </w:style>
-  <w:style w:type="table" w:default="1" w:styleId="TableNormal">
+  <w:style w:type="table" w:default="1" w:styleId="Tabelanormal">
     <w:name w:val="Normal Table"/>
     <w:uiPriority w:val="99"/>
     <w:semiHidden/>
@@ -2083,16 +1999,16 @@
       </w:tblCellMar>
     </w:tblPr>
   </w:style>
-  <w:style w:type="numbering" w:default="1" w:styleId="NoList">
+  <w:style w:type="numbering" w:default="1" w:styleId="Semlista">
     <w:name w:val="No List"/>
     <w:uiPriority w:val="99"/>
     <w:semiHidden/>
     <w:unhideWhenUsed/>
   </w:style>
-  <w:style w:type="paragraph" w:styleId="Header">
+  <w:style w:type="paragraph" w:styleId="Cabealho">
     <w:name w:val="header"/>
     <w:basedOn w:val="Normal"/>
-    <w:link w:val="HeaderChar"/>
+    <w:link w:val="CabealhoCarter"/>
     <w:uiPriority w:val="99"/>
     <w:unhideWhenUsed/>
     <w:rsid w:val="00E618BF"/>
@@ -2104,17 +2020,17 @@
       <w:spacing w:after="0" w:line="240" w:lineRule="auto"/>
     </w:pPr>
   </w:style>
-  <w:style w:type="character" w:customStyle="1" w:styleId="HeaderChar">
-    <w:name w:val="Header Char"/>
-    <w:basedOn w:val="DefaultParagraphFont"/>
-    <w:link w:val="Header"/>
+  <w:style w:type="character" w:customStyle="1" w:styleId="CabealhoCarter">
+    <w:name w:val="Cabeçalho Caráter"/>
+    <w:basedOn w:val="Tipodeletrapredefinidodopargrafo"/>
+    <w:link w:val="Cabealho"/>
     <w:uiPriority w:val="99"/>
     <w:rsid w:val="00E618BF"/>
   </w:style>
-  <w:style w:type="paragraph" w:styleId="Footer">
+  <w:style w:type="paragraph" w:styleId="Rodap">
     <w:name w:val="footer"/>
     <w:basedOn w:val="Normal"/>
-    <w:link w:val="FooterChar"/>
+    <w:link w:val="RodapCarter"/>
     <w:uiPriority w:val="99"/>
     <w:unhideWhenUsed/>
     <w:rsid w:val="00E618BF"/>
@@ -2126,14 +2042,14 @@
       <w:spacing w:after="0" w:line="240" w:lineRule="auto"/>
     </w:pPr>
   </w:style>
-  <w:style w:type="character" w:customStyle="1" w:styleId="FooterChar">
-    <w:name w:val="Footer Char"/>
-    <w:basedOn w:val="DefaultParagraphFont"/>
-    <w:link w:val="Footer"/>
+  <w:style w:type="character" w:customStyle="1" w:styleId="RodapCarter">
+    <w:name w:val="Rodapé Caráter"/>
+    <w:basedOn w:val="Tipodeletrapredefinidodopargrafo"/>
+    <w:link w:val="Rodap"/>
     <w:uiPriority w:val="99"/>
     <w:rsid w:val="00E618BF"/>
   </w:style>
-  <w:style w:type="paragraph" w:styleId="NoSpacing">
+  <w:style w:type="paragraph" w:styleId="SemEspaamento">
     <w:name w:val="No Spacing"/>
     <w:uiPriority w:val="1"/>
     <w:qFormat/>
@@ -2142,10 +2058,10 @@
       <w:spacing w:after="0" w:line="240" w:lineRule="auto"/>
     </w:pPr>
   </w:style>
-  <w:style w:type="character" w:customStyle="1" w:styleId="Heading1Char">
-    <w:name w:val="Heading 1 Char"/>
-    <w:basedOn w:val="DefaultParagraphFont"/>
-    <w:link w:val="Heading1"/>
+  <w:style w:type="character" w:customStyle="1" w:styleId="Ttulo1Carter">
+    <w:name w:val="Título 1 Caráter"/>
+    <w:basedOn w:val="Tipodeletrapredefinidodopargrafo"/>
+    <w:link w:val="Ttulo1"/>
     <w:uiPriority w:val="9"/>
     <w:rsid w:val="00FC693F"/>
     <w:rPr>
@@ -2157,10 +2073,10 @@
       <w:szCs w:val="28"/>
     </w:rPr>
   </w:style>
-  <w:style w:type="character" w:customStyle="1" w:styleId="Heading2Char">
-    <w:name w:val="Heading 2 Char"/>
-    <w:basedOn w:val="DefaultParagraphFont"/>
-    <w:link w:val="Heading2"/>
+  <w:style w:type="character" w:customStyle="1" w:styleId="Ttulo2Carter">
+    <w:name w:val="Título 2 Caráter"/>
+    <w:basedOn w:val="Tipodeletrapredefinidodopargrafo"/>
+    <w:link w:val="Ttulo2"/>
     <w:uiPriority w:val="9"/>
     <w:rsid w:val="00FC693F"/>
     <w:rPr>
@@ -2172,10 +2088,10 @@
       <w:szCs w:val="26"/>
     </w:rPr>
   </w:style>
-  <w:style w:type="character" w:customStyle="1" w:styleId="Heading3Char">
-    <w:name w:val="Heading 3 Char"/>
-    <w:basedOn w:val="DefaultParagraphFont"/>
-    <w:link w:val="Heading3"/>
+  <w:style w:type="character" w:customStyle="1" w:styleId="Ttulo3Carter">
+    <w:name w:val="Título 3 Caráter"/>
+    <w:basedOn w:val="Tipodeletrapredefinidodopargrafo"/>
+    <w:link w:val="Ttulo3"/>
     <w:uiPriority w:val="9"/>
     <w:rsid w:val="00FC693F"/>
     <w:rPr>
@@ -2185,11 +2101,11 @@
       <w:color w:val="4F81BD" w:themeColor="accent1"/>
     </w:rPr>
   </w:style>
-  <w:style w:type="paragraph" w:styleId="Title">
+  <w:style w:type="paragraph" w:styleId="Ttulo">
     <w:name w:val="Title"/>
     <w:basedOn w:val="Normal"/>
     <w:next w:val="Normal"/>
-    <w:link w:val="TitleChar"/>
+    <w:link w:val="TtuloCarter"/>
     <w:uiPriority w:val="10"/>
     <w:qFormat/>
     <w:rsid w:val="00FC693F"/>
@@ -2209,10 +2125,10 @@
       <w:szCs w:val="52"/>
     </w:rPr>
   </w:style>
-  <w:style w:type="character" w:customStyle="1" w:styleId="TitleChar">
-    <w:name w:val="Title Char"/>
-    <w:basedOn w:val="DefaultParagraphFont"/>
-    <w:link w:val="Title"/>
+  <w:style w:type="character" w:customStyle="1" w:styleId="TtuloCarter">
+    <w:name w:val="Título Caráter"/>
+    <w:basedOn w:val="Tipodeletrapredefinidodopargrafo"/>
+    <w:link w:val="Ttulo"/>
     <w:uiPriority w:val="10"/>
     <w:rsid w:val="00FC693F"/>
     <w:rPr>
@@ -2224,11 +2140,11 @@
       <w:szCs w:val="52"/>
     </w:rPr>
   </w:style>
-  <w:style w:type="paragraph" w:styleId="Subtitle">
+  <w:style w:type="paragraph" w:styleId="Subttulo">
     <w:name w:val="Subtitle"/>
     <w:basedOn w:val="Normal"/>
     <w:next w:val="Normal"/>
-    <w:link w:val="SubtitleChar"/>
+    <w:link w:val="SubttuloCarter"/>
     <w:uiPriority w:val="11"/>
     <w:qFormat/>
     <w:rsid w:val="00FC693F"/>
@@ -2247,10 +2163,10 @@
       <w:szCs w:val="24"/>
     </w:rPr>
   </w:style>
-  <w:style w:type="character" w:customStyle="1" w:styleId="SubtitleChar">
-    <w:name w:val="Subtitle Char"/>
-    <w:basedOn w:val="DefaultParagraphFont"/>
-    <w:link w:val="Subtitle"/>
+  <w:style w:type="character" w:customStyle="1" w:styleId="SubttuloCarter">
+    <w:name w:val="Subtítulo Caráter"/>
+    <w:basedOn w:val="Tipodeletrapredefinidodopargrafo"/>
+    <w:link w:val="Subttulo"/>
     <w:uiPriority w:val="11"/>
     <w:rsid w:val="00FC693F"/>
     <w:rPr>
@@ -2263,7 +2179,7 @@
       <w:szCs w:val="24"/>
     </w:rPr>
   </w:style>
-  <w:style w:type="paragraph" w:styleId="ListParagraph">
+  <w:style w:type="paragraph" w:styleId="PargrafodaLista">
     <w:name w:val="List Paragraph"/>
     <w:basedOn w:val="Normal"/>
     <w:uiPriority w:val="34"/>
@@ -2274,10 +2190,10 @@
       <w:contextualSpacing/>
     </w:pPr>
   </w:style>
-  <w:style w:type="paragraph" w:styleId="BodyText">
+  <w:style w:type="paragraph" w:styleId="Corpodetexto">
     <w:name w:val="Body Text"/>
     <w:basedOn w:val="Normal"/>
-    <w:link w:val="BodyTextChar"/>
+    <w:link w:val="CorpodetextoCarter"/>
     <w:uiPriority w:val="99"/>
     <w:unhideWhenUsed/>
     <w:rsid w:val="00AA1D8D"/>
@@ -2285,17 +2201,17 @@
       <w:spacing w:after="120"/>
     </w:pPr>
   </w:style>
-  <w:style w:type="character" w:customStyle="1" w:styleId="BodyTextChar">
-    <w:name w:val="Body Text Char"/>
-    <w:basedOn w:val="DefaultParagraphFont"/>
-    <w:link w:val="BodyText"/>
+  <w:style w:type="character" w:customStyle="1" w:styleId="CorpodetextoCarter">
+    <w:name w:val="Corpo de texto Caráter"/>
+    <w:basedOn w:val="Tipodeletrapredefinidodopargrafo"/>
+    <w:link w:val="Corpodetexto"/>
     <w:uiPriority w:val="99"/>
     <w:rsid w:val="00AA1D8D"/>
   </w:style>
-  <w:style w:type="paragraph" w:styleId="BodyText2">
+  <w:style w:type="paragraph" w:styleId="Corpodetexto2">
     <w:name w:val="Body Text 2"/>
     <w:basedOn w:val="Normal"/>
-    <w:link w:val="BodyText2Char"/>
+    <w:link w:val="Corpodetexto2Carter"/>
     <w:uiPriority w:val="99"/>
     <w:unhideWhenUsed/>
     <w:rsid w:val="00AA1D8D"/>
@@ -2303,17 +2219,17 @@
       <w:spacing w:after="120" w:line="480" w:lineRule="auto"/>
     </w:pPr>
   </w:style>
-  <w:style w:type="character" w:customStyle="1" w:styleId="BodyText2Char">
-    <w:name w:val="Body Text 2 Char"/>
-    <w:basedOn w:val="DefaultParagraphFont"/>
-    <w:link w:val="BodyText2"/>
+  <w:style w:type="character" w:customStyle="1" w:styleId="Corpodetexto2Carter">
+    <w:name w:val="Corpo de texto 2 Caráter"/>
+    <w:basedOn w:val="Tipodeletrapredefinidodopargrafo"/>
+    <w:link w:val="Corpodetexto2"/>
     <w:uiPriority w:val="99"/>
     <w:rsid w:val="00AA1D8D"/>
   </w:style>
-  <w:style w:type="paragraph" w:styleId="BodyText3">
+  <w:style w:type="paragraph" w:styleId="Corpodetexto3">
     <w:name w:val="Body Text 3"/>
     <w:basedOn w:val="Normal"/>
-    <w:link w:val="BodyText3Char"/>
+    <w:link w:val="Corpodetexto3Carter"/>
     <w:uiPriority w:val="99"/>
     <w:unhideWhenUsed/>
     <w:rsid w:val="00AA1D8D"/>
@@ -2325,10 +2241,10 @@
       <w:szCs w:val="16"/>
     </w:rPr>
   </w:style>
-  <w:style w:type="character" w:customStyle="1" w:styleId="BodyText3Char">
-    <w:name w:val="Body Text 3 Char"/>
-    <w:basedOn w:val="DefaultParagraphFont"/>
-    <w:link w:val="BodyText3"/>
+  <w:style w:type="character" w:customStyle="1" w:styleId="Corpodetexto3Carter">
+    <w:name w:val="Corpo de texto 3 Caráter"/>
+    <w:basedOn w:val="Tipodeletrapredefinidodopargrafo"/>
+    <w:link w:val="Corpodetexto3"/>
     <w:uiPriority w:val="99"/>
     <w:rsid w:val="00AA1D8D"/>
     <w:rPr>
@@ -2336,7 +2252,7 @@
       <w:szCs w:val="16"/>
     </w:rPr>
   </w:style>
-  <w:style w:type="paragraph" w:styleId="List">
+  <w:style w:type="paragraph" w:styleId="Lista">
     <w:name w:val="List"/>
     <w:basedOn w:val="Normal"/>
     <w:uiPriority w:val="99"/>
@@ -2347,7 +2263,7 @@
       <w:contextualSpacing/>
     </w:pPr>
   </w:style>
-  <w:style w:type="paragraph" w:styleId="List2">
+  <w:style w:type="paragraph" w:styleId="Lista2">
     <w:name w:val="List 2"/>
     <w:basedOn w:val="Normal"/>
     <w:uiPriority w:val="99"/>
@@ -2358,7 +2274,7 @@
       <w:contextualSpacing/>
     </w:pPr>
   </w:style>
-  <w:style w:type="paragraph" w:styleId="List3">
+  <w:style w:type="paragraph" w:styleId="Lista3">
     <w:name w:val="List 3"/>
     <w:basedOn w:val="Normal"/>
     <w:uiPriority w:val="99"/>
@@ -2369,7 +2285,7 @@
       <w:contextualSpacing/>
     </w:pPr>
   </w:style>
-  <w:style w:type="paragraph" w:styleId="ListBullet">
+  <w:style w:type="paragraph" w:styleId="Listacommarcas">
     <w:name w:val="List Bullet"/>
     <w:basedOn w:val="Normal"/>
     <w:uiPriority w:val="99"/>
@@ -2382,7 +2298,7 @@
       <w:contextualSpacing/>
     </w:pPr>
   </w:style>
-  <w:style w:type="paragraph" w:styleId="ListBullet2">
+  <w:style w:type="paragraph" w:styleId="Listacommarcas2">
     <w:name w:val="List Bullet 2"/>
     <w:basedOn w:val="Normal"/>
     <w:uiPriority w:val="99"/>
@@ -2395,7 +2311,7 @@
       <w:contextualSpacing/>
     </w:pPr>
   </w:style>
-  <w:style w:type="paragraph" w:styleId="ListBullet3">
+  <w:style w:type="paragraph" w:styleId="Listacommarcas3">
     <w:name w:val="List Bullet 3"/>
     <w:basedOn w:val="Normal"/>
     <w:uiPriority w:val="99"/>
@@ -2408,7 +2324,7 @@
       <w:contextualSpacing/>
     </w:pPr>
   </w:style>
-  <w:style w:type="paragraph" w:styleId="ListNumber">
+  <w:style w:type="paragraph" w:styleId="Listanumerada">
     <w:name w:val="List Number"/>
     <w:basedOn w:val="Normal"/>
     <w:uiPriority w:val="99"/>
@@ -2421,7 +2337,7 @@
       <w:contextualSpacing/>
     </w:pPr>
   </w:style>
-  <w:style w:type="paragraph" w:styleId="ListNumber2">
+  <w:style w:type="paragraph" w:styleId="Listanumerada2">
     <w:name w:val="List Number 2"/>
     <w:basedOn w:val="Normal"/>
     <w:uiPriority w:val="99"/>
@@ -2434,7 +2350,7 @@
       <w:contextualSpacing/>
     </w:pPr>
   </w:style>
-  <w:style w:type="paragraph" w:styleId="ListNumber3">
+  <w:style w:type="paragraph" w:styleId="Listanumerada3">
     <w:name w:val="List Number 3"/>
     <w:basedOn w:val="Normal"/>
     <w:uiPriority w:val="99"/>
@@ -2447,7 +2363,7 @@
       <w:contextualSpacing/>
     </w:pPr>
   </w:style>
-  <w:style w:type="paragraph" w:styleId="ListContinue">
+  <w:style w:type="paragraph" w:styleId="Listadecont">
     <w:name w:val="List Continue"/>
     <w:basedOn w:val="Normal"/>
     <w:uiPriority w:val="99"/>
@@ -2459,7 +2375,7 @@
       <w:contextualSpacing/>
     </w:pPr>
   </w:style>
-  <w:style w:type="paragraph" w:styleId="ListContinue2">
+  <w:style w:type="paragraph" w:styleId="Listadecont2">
     <w:name w:val="List Continue 2"/>
     <w:basedOn w:val="Normal"/>
     <w:uiPriority w:val="99"/>
@@ -2471,7 +2387,7 @@
       <w:contextualSpacing/>
     </w:pPr>
   </w:style>
-  <w:style w:type="paragraph" w:styleId="ListContinue3">
+  <w:style w:type="paragraph" w:styleId="Listadecont3">
     <w:name w:val="List Continue 3"/>
     <w:basedOn w:val="Normal"/>
     <w:uiPriority w:val="99"/>
@@ -2483,9 +2399,9 @@
       <w:contextualSpacing/>
     </w:pPr>
   </w:style>
-  <w:style w:type="paragraph" w:styleId="MacroText">
+  <w:style w:type="paragraph" w:styleId="Textodemacro">
     <w:name w:val="macro"/>
-    <w:link w:val="MacroTextChar"/>
+    <w:link w:val="TextodemacroCarter"/>
     <w:uiPriority w:val="99"/>
     <w:unhideWhenUsed/>
     <w:rsid w:val="0029639D"/>
@@ -2506,10 +2422,10 @@
       <w:szCs w:val="20"/>
     </w:rPr>
   </w:style>
-  <w:style w:type="character" w:customStyle="1" w:styleId="MacroTextChar">
-    <w:name w:val="Macro Text Char"/>
-    <w:basedOn w:val="DefaultParagraphFont"/>
-    <w:link w:val="MacroText"/>
+  <w:style w:type="character" w:customStyle="1" w:styleId="TextodemacroCarter">
+    <w:name w:val="Texto de macro Caráter"/>
+    <w:basedOn w:val="Tipodeletrapredefinidodopargrafo"/>
+    <w:link w:val="Textodemacro"/>
     <w:uiPriority w:val="99"/>
     <w:rsid w:val="0029639D"/>
     <w:rPr>
@@ -2518,11 +2434,11 @@
       <w:szCs w:val="20"/>
     </w:rPr>
   </w:style>
-  <w:style w:type="paragraph" w:styleId="Quote">
+  <w:style w:type="paragraph" w:styleId="Citao">
     <w:name w:val="Quote"/>
     <w:basedOn w:val="Normal"/>
     <w:next w:val="Normal"/>
-    <w:link w:val="QuoteChar"/>
+    <w:link w:val="CitaoCarter"/>
     <w:uiPriority w:val="29"/>
     <w:qFormat/>
     <w:rsid w:val="00FC693F"/>
@@ -2532,10 +2448,10 @@
       <w:color w:val="000000" w:themeColor="text1"/>
     </w:rPr>
   </w:style>
-  <w:style w:type="character" w:customStyle="1" w:styleId="QuoteChar">
-    <w:name w:val="Quote Char"/>
-    <w:basedOn w:val="DefaultParagraphFont"/>
-    <w:link w:val="Quote"/>
+  <w:style w:type="character" w:customStyle="1" w:styleId="CitaoCarter">
+    <w:name w:val="Citação Caráter"/>
+    <w:basedOn w:val="Tipodeletrapredefinidodopargrafo"/>
+    <w:link w:val="Citao"/>
     <w:uiPriority w:val="29"/>
     <w:rsid w:val="00FC693F"/>
     <w:rPr>
@@ -2544,10 +2460,10 @@
       <w:color w:val="000000" w:themeColor="text1"/>
     </w:rPr>
   </w:style>
-  <w:style w:type="character" w:customStyle="1" w:styleId="Heading4Char">
-    <w:name w:val="Heading 4 Char"/>
-    <w:basedOn w:val="DefaultParagraphFont"/>
-    <w:link w:val="Heading4"/>
+  <w:style w:type="character" w:customStyle="1" w:styleId="Ttulo4Carter">
+    <w:name w:val="Título 4 Caráter"/>
+    <w:basedOn w:val="Tipodeletrapredefinidodopargrafo"/>
+    <w:link w:val="Ttulo4"/>
     <w:uiPriority w:val="9"/>
     <w:semiHidden/>
     <w:rsid w:val="00FC693F"/>
@@ -2560,10 +2476,10 @@
       <w:color w:val="4F81BD" w:themeColor="accent1"/>
     </w:rPr>
   </w:style>
-  <w:style w:type="character" w:customStyle="1" w:styleId="Heading5Char">
-    <w:name w:val="Heading 5 Char"/>
-    <w:basedOn w:val="DefaultParagraphFont"/>
-    <w:link w:val="Heading5"/>
+  <w:style w:type="character" w:customStyle="1" w:styleId="Ttulo5Carter">
+    <w:name w:val="Título 5 Caráter"/>
+    <w:basedOn w:val="Tipodeletrapredefinidodopargrafo"/>
+    <w:link w:val="Ttulo5"/>
     <w:uiPriority w:val="9"/>
     <w:semiHidden/>
     <w:rsid w:val="00FC693F"/>
@@ -2572,10 +2488,10 @@
       <w:color w:val="243F60" w:themeColor="accent1" w:themeShade="7F"/>
     </w:rPr>
   </w:style>
-  <w:style w:type="character" w:customStyle="1" w:styleId="Heading6Char">
-    <w:name w:val="Heading 6 Char"/>
-    <w:basedOn w:val="DefaultParagraphFont"/>
-    <w:link w:val="Heading6"/>
+  <w:style w:type="character" w:customStyle="1" w:styleId="Ttulo6Carter">
+    <w:name w:val="Título 6 Caráter"/>
+    <w:basedOn w:val="Tipodeletrapredefinidodopargrafo"/>
+    <w:link w:val="Ttulo6"/>
     <w:uiPriority w:val="9"/>
     <w:semiHidden/>
     <w:rsid w:val="00FC693F"/>
@@ -2586,10 +2502,10 @@
       <w:color w:val="243F60" w:themeColor="accent1" w:themeShade="7F"/>
     </w:rPr>
   </w:style>
-  <w:style w:type="character" w:customStyle="1" w:styleId="Heading7Char">
-    <w:name w:val="Heading 7 Char"/>
-    <w:basedOn w:val="DefaultParagraphFont"/>
-    <w:link w:val="Heading7"/>
+  <w:style w:type="character" w:customStyle="1" w:styleId="Ttulo7Carter">
+    <w:name w:val="Título 7 Caráter"/>
+    <w:basedOn w:val="Tipodeletrapredefinidodopargrafo"/>
+    <w:link w:val="Ttulo7"/>
     <w:uiPriority w:val="9"/>
     <w:semiHidden/>
     <w:rsid w:val="00FC693F"/>
@@ -2600,10 +2516,10 @@
       <w:color w:val="404040" w:themeColor="text1" w:themeTint="BF"/>
     </w:rPr>
   </w:style>
-  <w:style w:type="character" w:customStyle="1" w:styleId="Heading8Char">
-    <w:name w:val="Heading 8 Char"/>
-    <w:basedOn w:val="DefaultParagraphFont"/>
-    <w:link w:val="Heading8"/>
+  <w:style w:type="character" w:customStyle="1" w:styleId="Ttulo8Carter">
+    <w:name w:val="Título 8 Caráter"/>
+    <w:basedOn w:val="Tipodeletrapredefinidodopargrafo"/>
+    <w:link w:val="Ttulo8"/>
     <w:uiPriority w:val="9"/>
     <w:semiHidden/>
     <w:rsid w:val="00FC693F"/>
@@ -2614,10 +2530,10 @@
       <w:szCs w:val="20"/>
     </w:rPr>
   </w:style>
-  <w:style w:type="character" w:customStyle="1" w:styleId="Heading9Char">
-    <w:name w:val="Heading 9 Char"/>
-    <w:basedOn w:val="DefaultParagraphFont"/>
-    <w:link w:val="Heading9"/>
+  <w:style w:type="character" w:customStyle="1" w:styleId="Ttulo9Carter">
+    <w:name w:val="Título 9 Caráter"/>
+    <w:basedOn w:val="Tipodeletrapredefinidodopargrafo"/>
+    <w:link w:val="Ttulo9"/>
     <w:uiPriority w:val="9"/>
     <w:semiHidden/>
     <w:rsid w:val="00FC693F"/>
@@ -2630,7 +2546,7 @@
       <w:szCs w:val="20"/>
     </w:rPr>
   </w:style>
-  <w:style w:type="paragraph" w:styleId="Caption">
+  <w:style w:type="paragraph" w:styleId="Legenda">
     <w:name w:val="caption"/>
     <w:basedOn w:val="Normal"/>
     <w:next w:val="Normal"/>
@@ -2650,9 +2566,9 @@
       <w:szCs w:val="18"/>
     </w:rPr>
   </w:style>
-  <w:style w:type="character" w:styleId="Strong">
+  <w:style w:type="character" w:styleId="Forte">
     <w:name w:val="Strong"/>
-    <w:basedOn w:val="DefaultParagraphFont"/>
+    <w:basedOn w:val="Tipodeletrapredefinidodopargrafo"/>
     <w:uiPriority w:val="22"/>
     <w:qFormat/>
     <w:rsid w:val="00FC693F"/>
@@ -2661,9 +2577,9 @@
       <w:bCs/>
     </w:rPr>
   </w:style>
-  <w:style w:type="character" w:styleId="Emphasis">
+  <w:style w:type="character" w:styleId="nfase">
     <w:name w:val="Emphasis"/>
-    <w:basedOn w:val="DefaultParagraphFont"/>
+    <w:basedOn w:val="Tipodeletrapredefinidodopargrafo"/>
     <w:uiPriority w:val="20"/>
     <w:qFormat/>
     <w:rsid w:val="00FC693F"/>
@@ -2672,11 +2588,11 @@
       <w:iCs/>
     </w:rPr>
   </w:style>
-  <w:style w:type="paragraph" w:styleId="IntenseQuote">
+  <w:style w:type="paragraph" w:styleId="CitaoIntensa">
     <w:name w:val="Intense Quote"/>
     <w:basedOn w:val="Normal"/>
     <w:next w:val="Normal"/>
-    <w:link w:val="IntenseQuoteChar"/>
+    <w:link w:val="CitaoIntensaCarter"/>
     <w:uiPriority w:val="30"/>
     <w:qFormat/>
     <w:rsid w:val="00FC693F"/>
@@ -2695,10 +2611,10 @@
       <w:color w:val="4F81BD" w:themeColor="accent1"/>
     </w:rPr>
   </w:style>
-  <w:style w:type="character" w:customStyle="1" w:styleId="IntenseQuoteChar">
-    <w:name w:val="Intense Quote Char"/>
-    <w:basedOn w:val="DefaultParagraphFont"/>
-    <w:link w:val="IntenseQuote"/>
+  <w:style w:type="character" w:customStyle="1" w:styleId="CitaoIntensaCarter">
+    <w:name w:val="Citação Intensa Caráter"/>
+    <w:basedOn w:val="Tipodeletrapredefinidodopargrafo"/>
+    <w:link w:val="CitaoIntensa"/>
     <w:uiPriority w:val="30"/>
     <w:rsid w:val="00FC693F"/>
     <w:rPr>
@@ -2709,9 +2625,9 @@
       <w:color w:val="4F81BD" w:themeColor="accent1"/>
     </w:rPr>
   </w:style>
-  <w:style w:type="character" w:styleId="SubtleEmphasis">
+  <w:style w:type="character" w:styleId="nfaseDiscreta">
     <w:name w:val="Subtle Emphasis"/>
-    <w:basedOn w:val="DefaultParagraphFont"/>
+    <w:basedOn w:val="Tipodeletrapredefinidodopargrafo"/>
     <w:uiPriority w:val="19"/>
     <w:qFormat/>
     <w:rsid w:val="00FC693F"/>
@@ -2721,9 +2637,9 @@
       <w:color w:val="808080" w:themeColor="text1" w:themeTint="7F"/>
     </w:rPr>
   </w:style>
-  <w:style w:type="character" w:styleId="IntenseEmphasis">
+  <w:style w:type="character" w:styleId="nfaseIntensa">
     <w:name w:val="Intense Emphasis"/>
-    <w:basedOn w:val="DefaultParagraphFont"/>
+    <w:basedOn w:val="Tipodeletrapredefinidodopargrafo"/>
     <w:uiPriority w:val="21"/>
     <w:qFormat/>
     <w:rsid w:val="00FC693F"/>
@@ -2735,9 +2651,9 @@
       <w:color w:val="4F81BD" w:themeColor="accent1"/>
     </w:rPr>
   </w:style>
-  <w:style w:type="character" w:styleId="SubtleReference">
+  <w:style w:type="character" w:styleId="RefernciaDiscreta">
     <w:name w:val="Subtle Reference"/>
-    <w:basedOn w:val="DefaultParagraphFont"/>
+    <w:basedOn w:val="Tipodeletrapredefinidodopargrafo"/>
     <w:uiPriority w:val="31"/>
     <w:qFormat/>
     <w:rsid w:val="00FC693F"/>
@@ -2747,9 +2663,9 @@
       <w:u w:val="single"/>
     </w:rPr>
   </w:style>
-  <w:style w:type="character" w:styleId="IntenseReference">
+  <w:style w:type="character" w:styleId="RefernciaIntensa">
     <w:name w:val="Intense Reference"/>
-    <w:basedOn w:val="DefaultParagraphFont"/>
+    <w:basedOn w:val="Tipodeletrapredefinidodopargrafo"/>
     <w:uiPriority w:val="32"/>
     <w:qFormat/>
     <w:rsid w:val="00FC693F"/>
@@ -2762,9 +2678,9 @@
       <w:u w:val="single"/>
     </w:rPr>
   </w:style>
-  <w:style w:type="character" w:styleId="BookTitle">
+  <w:style w:type="character" w:styleId="TtulodoLivro">
     <w:name w:val="Book Title"/>
-    <w:basedOn w:val="DefaultParagraphFont"/>
+    <w:basedOn w:val="Tipodeletrapredefinidodopargrafo"/>
     <w:uiPriority w:val="33"/>
     <w:qFormat/>
     <w:rsid w:val="00FC693F"/>
@@ -2775,9 +2691,9 @@
       <w:spacing w:val="5"/>
     </w:rPr>
   </w:style>
-  <w:style w:type="paragraph" w:styleId="TOCHeading">
+  <w:style w:type="paragraph" w:styleId="Cabealhodondice">
     <w:name w:val="TOC Heading"/>
-    <w:basedOn w:val="Heading1"/>
+    <w:basedOn w:val="Ttulo1"/>
     <w:next w:val="Normal"/>
     <w:uiPriority w:val="39"/>
     <w:semiHidden/>
@@ -2788,9 +2704,9 @@
       <w:outlineLvl w:val="9"/>
     </w:pPr>
   </w:style>
-  <w:style w:type="table" w:styleId="TableGrid">
+  <w:style w:type="table" w:styleId="TabelacomGrelha">
     <w:name w:val="Table Grid"/>
-    <w:basedOn w:val="TableNormal"/>
+    <w:basedOn w:val="Tabelanormal"/>
     <w:uiPriority w:val="59"/>
     <w:rsid w:val="00FC693F"/>
     <w:pPr>
@@ -2807,9 +2723,9 @@
       </w:tblBorders>
     </w:tblPr>
   </w:style>
-  <w:style w:type="table" w:styleId="LightShading">
+  <w:style w:type="table" w:styleId="SombreadoClaro">
     <w:name w:val="Light Shading"/>
-    <w:basedOn w:val="TableNormal"/>
+    <w:basedOn w:val="Tabelanormal"/>
     <w:uiPriority w:val="60"/>
     <w:rsid w:val="00FC693F"/>
     <w:pPr>
@@ -2903,9 +2819,9 @@
       </w:tcPr>
     </w:tblStylePr>
   </w:style>
-  <w:style w:type="table" w:styleId="LightShading-Accent1">
+  <w:style w:type="table" w:styleId="SombreadoClaro-Cor1">
     <w:name w:val="Light Shading Accent 1"/>
-    <w:basedOn w:val="TableNormal"/>
+    <w:basedOn w:val="Tabelanormal"/>
     <w:uiPriority w:val="60"/>
     <w:rsid w:val="00FC693F"/>
     <w:pPr>
@@ -2999,9 +2915,9 @@
       </w:tcPr>
     </w:tblStylePr>
   </w:style>
-  <w:style w:type="table" w:styleId="LightShading-Accent2">
+  <w:style w:type="table" w:styleId="SombreadoClaro-Cor2">
     <w:name w:val="Light Shading Accent 2"/>
-    <w:basedOn w:val="TableNormal"/>
+    <w:basedOn w:val="Tabelanormal"/>
     <w:uiPriority w:val="60"/>
     <w:rsid w:val="00FC693F"/>
     <w:pPr>
@@ -3095,9 +3011,9 @@
       </w:tcPr>
     </w:tblStylePr>
   </w:style>
-  <w:style w:type="table" w:styleId="LightShading-Accent3">
+  <w:style w:type="table" w:styleId="SombreadoClaro-Cor3">
     <w:name w:val="Light Shading Accent 3"/>
-    <w:basedOn w:val="TableNormal"/>
+    <w:basedOn w:val="Tabelanormal"/>
     <w:uiPriority w:val="60"/>
     <w:rsid w:val="00FC693F"/>
     <w:pPr>
@@ -3191,9 +3107,9 @@
       </w:tcPr>
     </w:tblStylePr>
   </w:style>
-  <w:style w:type="table" w:styleId="LightShading-Accent4">
+  <w:style w:type="table" w:styleId="SombreadoClaro-Cor4">
     <w:name w:val="Light Shading Accent 4"/>
-    <w:basedOn w:val="TableNormal"/>
+    <w:basedOn w:val="Tabelanormal"/>
     <w:uiPriority w:val="60"/>
     <w:rsid w:val="00FC693F"/>
     <w:pPr>
@@ -3287,9 +3203,9 @@
       </w:tcPr>
     </w:tblStylePr>
   </w:style>
-  <w:style w:type="table" w:styleId="LightShading-Accent5">
+  <w:style w:type="table" w:styleId="SombreadoClaro-Cor5">
     <w:name w:val="Light Shading Accent 5"/>
-    <w:basedOn w:val="TableNormal"/>
+    <w:basedOn w:val="Tabelanormal"/>
     <w:uiPriority w:val="60"/>
     <w:rsid w:val="00FC693F"/>
     <w:pPr>
@@ -3383,9 +3299,9 @@
       </w:tcPr>
     </w:tblStylePr>
   </w:style>
-  <w:style w:type="table" w:styleId="LightShading-Accent6">
+  <w:style w:type="table" w:styleId="SombreadoClaro-Cor6">
     <w:name w:val="Light Shading Accent 6"/>
-    <w:basedOn w:val="TableNormal"/>
+    <w:basedOn w:val="Tabelanormal"/>
     <w:uiPriority w:val="60"/>
     <w:rsid w:val="00FC693F"/>
     <w:pPr>
@@ -3479,9 +3395,9 @@
       </w:tcPr>
     </w:tblStylePr>
   </w:style>
-  <w:style w:type="table" w:styleId="LightList">
+  <w:style w:type="table" w:styleId="ListaClara">
     <w:name w:val="Light List"/>
-    <w:basedOn w:val="TableNormal"/>
+    <w:basedOn w:val="Tabelanormal"/>
     <w:uiPriority w:val="61"/>
     <w:rsid w:val="00FC693F"/>
     <w:pPr>
@@ -3564,9 +3480,9 @@
       </w:tcPr>
     </w:tblStylePr>
   </w:style>
-  <w:style w:type="table" w:styleId="LightList-Accent1">
+  <w:style w:type="table" w:styleId="ListaClara-Cor1">
     <w:name w:val="Light List Accent 1"/>
-    <w:basedOn w:val="TableNormal"/>
+    <w:basedOn w:val="Tabelanormal"/>
     <w:uiPriority w:val="61"/>
     <w:rsid w:val="00FC693F"/>
     <w:pPr>
@@ -3649,9 +3565,9 @@
       </w:tcPr>
     </w:tblStylePr>
   </w:style>
-  <w:style w:type="table" w:styleId="LightList-Accent2">
+  <w:style w:type="table" w:styleId="ListaClara-Cor2">
     <w:name w:val="Light List Accent 2"/>
-    <w:basedOn w:val="TableNormal"/>
+    <w:basedOn w:val="Tabelanormal"/>
     <w:uiPriority w:val="61"/>
     <w:rsid w:val="00CB0664"/>
     <w:pPr>
@@ -3734,9 +3650,9 @@
       </w:tcPr>
     </w:tblStylePr>
   </w:style>
-  <w:style w:type="table" w:styleId="LightList-Accent3">
+  <w:style w:type="table" w:styleId="ListaClara-Cor3">
     <w:name w:val="Light List Accent 3"/>
-    <w:basedOn w:val="TableNormal"/>
+    <w:basedOn w:val="Tabelanormal"/>
     <w:uiPriority w:val="61"/>
     <w:rsid w:val="00CB0664"/>
     <w:pPr>
@@ -3819,9 +3735,9 @@
       </w:tcPr>
     </w:tblStylePr>
   </w:style>
-  <w:style w:type="table" w:styleId="LightList-Accent4">
+  <w:style w:type="table" w:styleId="ListaClara-Cor4">
     <w:name w:val="Light List Accent 4"/>
-    <w:basedOn w:val="TableNormal"/>
+    <w:basedOn w:val="Tabelanormal"/>
     <w:uiPriority w:val="61"/>
     <w:rsid w:val="00CB0664"/>
     <w:pPr>
@@ -3904,9 +3820,9 @@
       </w:tcPr>
     </w:tblStylePr>
   </w:style>
-  <w:style w:type="table" w:styleId="LightList-Accent5">
+  <w:style w:type="table" w:styleId="ListaClara-Cor5">
     <w:name w:val="Light List Accent 5"/>
-    <w:basedOn w:val="TableNormal"/>
+    <w:basedOn w:val="Tabelanormal"/>
     <w:uiPriority w:val="61"/>
     <w:rsid w:val="00CB0664"/>
     <w:pPr>
@@ -3989,9 +3905,9 @@
       </w:tcPr>
     </w:tblStylePr>
   </w:style>
-  <w:style w:type="table" w:styleId="LightList-Accent6">
+  <w:style w:type="table" w:styleId="ListaClara-Cor6">
     <w:name w:val="Light List Accent 6"/>
-    <w:basedOn w:val="TableNormal"/>
+    <w:basedOn w:val="Tabelanormal"/>
     <w:uiPriority w:val="61"/>
     <w:rsid w:val="00CB0664"/>
     <w:pPr>
@@ -4074,9 +3990,9 @@
       </w:tcPr>
     </w:tblStylePr>
   </w:style>
-  <w:style w:type="table" w:styleId="LightGrid">
+  <w:style w:type="table" w:styleId="GrelhaClara">
     <w:name w:val="Light Grid"/>
-    <w:basedOn w:val="TableNormal"/>
+    <w:basedOn w:val="Tabelanormal"/>
     <w:uiPriority w:val="62"/>
     <w:rsid w:val="00CB0664"/>
     <w:pPr>
@@ -4197,9 +4113,9 @@
       </w:tcPr>
     </w:tblStylePr>
   </w:style>
-  <w:style w:type="table" w:styleId="LightGrid-Accent1">
+  <w:style w:type="table" w:styleId="GrelhaClara-Cor1">
     <w:name w:val="Light Grid Accent 1"/>
-    <w:basedOn w:val="TableNormal"/>
+    <w:basedOn w:val="Tabelanormal"/>
     <w:uiPriority w:val="62"/>
     <w:rsid w:val="00CB0664"/>
     <w:pPr>
@@ -4320,9 +4236,9 @@
       </w:tcPr>
     </w:tblStylePr>
   </w:style>
-  <w:style w:type="table" w:styleId="LightGrid-Accent2">
+  <w:style w:type="table" w:styleId="GrelhaClara-Cor2">
     <w:name w:val="Light Grid Accent 2"/>
-    <w:basedOn w:val="TableNormal"/>
+    <w:basedOn w:val="Tabelanormal"/>
     <w:uiPriority w:val="62"/>
     <w:rsid w:val="00CB0664"/>
     <w:pPr>
@@ -4443,9 +4359,9 @@
       </w:tcPr>
     </w:tblStylePr>
   </w:style>
-  <w:style w:type="table" w:styleId="LightGrid-Accent3">
+  <w:style w:type="table" w:styleId="GrelhaClara-Cor3">
     <w:name w:val="Light Grid Accent 3"/>
-    <w:basedOn w:val="TableNormal"/>
+    <w:basedOn w:val="Tabelanormal"/>
     <w:uiPriority w:val="62"/>
     <w:rsid w:val="00CB0664"/>
     <w:pPr>
@@ -4566,9 +4482,9 @@
       </w:tcPr>
     </w:tblStylePr>
   </w:style>
-  <w:style w:type="table" w:styleId="LightGrid-Accent4">
+  <w:style w:type="table" w:styleId="GrelhaClara-Cor4">
     <w:name w:val="Light Grid Accent 4"/>
-    <w:basedOn w:val="TableNormal"/>
+    <w:basedOn w:val="Tabelanormal"/>
     <w:uiPriority w:val="62"/>
     <w:rsid w:val="00CB0664"/>
     <w:pPr>
@@ -4689,9 +4605,9 @@
       </w:tcPr>
     </w:tblStylePr>
   </w:style>
-  <w:style w:type="table" w:styleId="LightGrid-Accent5">
+  <w:style w:type="table" w:styleId="GrelhaClara-Cor5">
     <w:name w:val="Light Grid Accent 5"/>
-    <w:basedOn w:val="TableNormal"/>
+    <w:basedOn w:val="Tabelanormal"/>
     <w:uiPriority w:val="62"/>
     <w:rsid w:val="00CB0664"/>
     <w:pPr>
@@ -4812,9 +4728,9 @@
       </w:tcPr>
     </w:tblStylePr>
   </w:style>
-  <w:style w:type="table" w:styleId="LightGrid-Accent6">
+  <w:style w:type="table" w:styleId="GrelhaClara-Cor6">
     <w:name w:val="Light Grid Accent 6"/>
-    <w:basedOn w:val="TableNormal"/>
+    <w:basedOn w:val="Tabelanormal"/>
     <w:uiPriority w:val="62"/>
     <w:rsid w:val="00CB0664"/>
     <w:pPr>
@@ -4935,9 +4851,9 @@
       </w:tcPr>
     </w:tblStylePr>
   </w:style>
-  <w:style w:type="table" w:styleId="MediumShading1">
+  <w:style w:type="table" w:styleId="SombreadoMdio1">
     <w:name w:val="Medium Shading 1"/>
-    <w:basedOn w:val="TableNormal"/>
+    <w:basedOn w:val="Tabelanormal"/>
     <w:uiPriority w:val="63"/>
     <w:rsid w:val="00CB0664"/>
     <w:pPr>
@@ -5034,9 +4950,9 @@
       </w:tcPr>
     </w:tblStylePr>
   </w:style>
-  <w:style w:type="table" w:styleId="MediumShading1-Accent1">
+  <w:style w:type="table" w:styleId="SombreadoMdio1-Cor1">
     <w:name w:val="Medium Shading 1 Accent 1"/>
-    <w:basedOn w:val="TableNormal"/>
+    <w:basedOn w:val="Tabelanormal"/>
     <w:uiPriority w:val="63"/>
     <w:rsid w:val="00CB0664"/>
     <w:pPr>
@@ -5133,9 +5049,9 @@
       </w:tcPr>
     </w:tblStylePr>
   </w:style>
-  <w:style w:type="table" w:styleId="MediumShading1-Accent2">
+  <w:style w:type="table" w:styleId="SombreadoMdio1-Cor2">
     <w:name w:val="Medium Shading 1 Accent 2"/>
-    <w:basedOn w:val="TableNormal"/>
+    <w:basedOn w:val="Tabelanormal"/>
     <w:uiPriority w:val="63"/>
     <w:rsid w:val="00CB0664"/>
     <w:pPr>
@@ -5232,9 +5148,9 @@
       </w:tcPr>
     </w:tblStylePr>
   </w:style>
-  <w:style w:type="table" w:styleId="MediumShading1-Accent3">
+  <w:style w:type="table" w:styleId="SombreadoMdio1-Cor3">
     <w:name w:val="Medium Shading 1 Accent 3"/>
-    <w:basedOn w:val="TableNormal"/>
+    <w:basedOn w:val="Tabelanormal"/>
     <w:uiPriority w:val="63"/>
     <w:rsid w:val="00CB0664"/>
     <w:pPr>
@@ -5331,9 +5247,9 @@
       </w:tcPr>
     </w:tblStylePr>
   </w:style>
-  <w:style w:type="table" w:styleId="MediumShading1-Accent4">
+  <w:style w:type="table" w:styleId="SombreadoMdio1-Cor4">
     <w:name w:val="Medium Shading 1 Accent 4"/>
-    <w:basedOn w:val="TableNormal"/>
+    <w:basedOn w:val="Tabelanormal"/>
     <w:uiPriority w:val="63"/>
     <w:rsid w:val="00CB0664"/>
     <w:pPr>
@@ -5430,9 +5346,9 @@
       </w:tcPr>
     </w:tblStylePr>
   </w:style>
-  <w:style w:type="table" w:styleId="MediumShading1-Accent5">
+  <w:style w:type="table" w:styleId="SombreadoMdio1-Cor5">
     <w:name w:val="Medium Shading 1 Accent 5"/>
-    <w:basedOn w:val="TableNormal"/>
+    <w:basedOn w:val="Tabelanormal"/>
     <w:uiPriority w:val="63"/>
     <w:rsid w:val="00CB0664"/>
     <w:pPr>
@@ -5529,9 +5445,9 @@
       </w:tcPr>
     </w:tblStylePr>
   </w:style>
-  <w:style w:type="table" w:styleId="MediumShading1-Accent6">
+  <w:style w:type="table" w:styleId="SombreadoMdio1-Cor6">
     <w:name w:val="Medium Shading 1 Accent 6"/>
-    <w:basedOn w:val="TableNormal"/>
+    <w:basedOn w:val="Tabelanormal"/>
     <w:uiPriority w:val="63"/>
     <w:rsid w:val="00CB0664"/>
     <w:pPr>
@@ -5628,9 +5544,9 @@
       </w:tcPr>
     </w:tblStylePr>
   </w:style>
-  <w:style w:type="table" w:styleId="MediumShading2">
+  <w:style w:type="table" w:styleId="SombreadoMdio2">
     <w:name w:val="Medium Shading 2"/>
-    <w:basedOn w:val="TableNormal"/>
+    <w:basedOn w:val="Tabelanormal"/>
     <w:uiPriority w:val="64"/>
     <w:rsid w:val="00CB0664"/>
     <w:pPr>
@@ -5770,9 +5686,9 @@
       </w:tcPr>
     </w:tblStylePr>
   </w:style>
-  <w:style w:type="table" w:styleId="MediumShading2-Accent1">
+  <w:style w:type="table" w:styleId="SombreadoMdio2-Cor1">
     <w:name w:val="Medium Shading 2 Accent 1"/>
-    <w:basedOn w:val="TableNormal"/>
+    <w:basedOn w:val="Tabelanormal"/>
     <w:uiPriority w:val="64"/>
     <w:rsid w:val="00CB0664"/>
     <w:pPr>
@@ -5912,9 +5828,9 @@
       </w:tcPr>
     </w:tblStylePr>
   </w:style>
-  <w:style w:type="table" w:styleId="MediumShading2-Accent2">
+  <w:style w:type="table" w:styleId="SombreadoMdio2-Cor2">
     <w:name w:val="Medium Shading 2 Accent 2"/>
-    <w:basedOn w:val="TableNormal"/>
+    <w:basedOn w:val="Tabelanormal"/>
     <w:uiPriority w:val="64"/>
     <w:rsid w:val="00CB0664"/>
     <w:pPr>
@@ -6054,9 +5970,9 @@
       </w:tcPr>
     </w:tblStylePr>
   </w:style>
-  <w:style w:type="table" w:styleId="MediumShading2-Accent3">
+  <w:style w:type="table" w:styleId="SombreadoMdio2-Cor3">
     <w:name w:val="Medium Shading 2 Accent 3"/>
-    <w:basedOn w:val="TableNormal"/>
+    <w:basedOn w:val="Tabelanormal"/>
     <w:uiPriority w:val="64"/>
     <w:rsid w:val="00CB0664"/>
     <w:pPr>
@@ -6196,9 +6112,9 @@
       </w:tcPr>
     </w:tblStylePr>
   </w:style>
-  <w:style w:type="table" w:styleId="MediumShading2-Accent4">
+  <w:style w:type="table" w:styleId="SombreadoMdio2-Cor4">
     <w:name w:val="Medium Shading 2 Accent 4"/>
-    <w:basedOn w:val="TableNormal"/>
+    <w:basedOn w:val="Tabelanormal"/>
     <w:uiPriority w:val="64"/>
     <w:rsid w:val="00CB0664"/>
     <w:pPr>
@@ -6338,9 +6254,9 @@
       </w:tcPr>
     </w:tblStylePr>
   </w:style>
-  <w:style w:type="table" w:styleId="MediumShading2-Accent5">
+  <w:style w:type="table" w:styleId="SombreadoMdio2-Cor5">
     <w:name w:val="Medium Shading 2 Accent 5"/>
-    <w:basedOn w:val="TableNormal"/>
+    <w:basedOn w:val="Tabelanormal"/>
     <w:uiPriority w:val="64"/>
     <w:rsid w:val="00CB0664"/>
     <w:pPr>
@@ -6480,9 +6396,9 @@
       </w:tcPr>
     </w:tblStylePr>
   </w:style>
-  <w:style w:type="table" w:styleId="MediumShading2-Accent6">
+  <w:style w:type="table" w:styleId="SombreadoMdio2-Cor6">
     <w:name w:val="Medium Shading 2 Accent 6"/>
-    <w:basedOn w:val="TableNormal"/>
+    <w:basedOn w:val="Tabelanormal"/>
     <w:uiPriority w:val="64"/>
     <w:rsid w:val="00CB0664"/>
     <w:pPr>
@@ -6622,9 +6538,9 @@
       </w:tcPr>
     </w:tblStylePr>
   </w:style>
-  <w:style w:type="table" w:styleId="MediumList1">
+  <w:style w:type="table" w:styleId="ListaMdia1">
     <w:name w:val="Medium List 1"/>
-    <w:basedOn w:val="TableNormal"/>
+    <w:basedOn w:val="Tabelanormal"/>
     <w:uiPriority w:val="65"/>
     <w:rsid w:val="00CB0664"/>
     <w:pPr>
@@ -6699,9 +6615,9 @@
       </w:tcPr>
     </w:tblStylePr>
   </w:style>
-  <w:style w:type="table" w:styleId="MediumList1-Accent1">
+  <w:style w:type="table" w:styleId="ListaMdia1-Cor1">
     <w:name w:val="Medium List 1 Accent 1"/>
-    <w:basedOn w:val="TableNormal"/>
+    <w:basedOn w:val="Tabelanormal"/>
     <w:uiPriority w:val="65"/>
     <w:rsid w:val="00CB0664"/>
     <w:pPr>
@@ -6776,9 +6692,9 @@
       </w:tcPr>
     </w:tblStylePr>
   </w:style>
-  <w:style w:type="table" w:styleId="MediumList1-Accent2">
+  <w:style w:type="table" w:styleId="ListaMdia1-Cor2">
     <w:name w:val="Medium List 1 Accent 2"/>
-    <w:basedOn w:val="TableNormal"/>
+    <w:basedOn w:val="Tabelanormal"/>
     <w:uiPriority w:val="65"/>
     <w:rsid w:val="00CB0664"/>
     <w:pPr>
@@ -6853,9 +6769,9 @@
       </w:tcPr>
     </w:tblStylePr>
   </w:style>
-  <w:style w:type="table" w:styleId="MediumList1-Accent3">
+  <w:style w:type="table" w:styleId="ListaMdia1-Cor3">
     <w:name w:val="Medium List 1 Accent 3"/>
-    <w:basedOn w:val="TableNormal"/>
+    <w:basedOn w:val="Tabelanormal"/>
     <w:uiPriority w:val="65"/>
     <w:rsid w:val="00CB0664"/>
     <w:pPr>
@@ -6930,9 +6846,9 @@
       </w:tcPr>
     </w:tblStylePr>
   </w:style>
-  <w:style w:type="table" w:styleId="MediumList1-Accent4">
+  <w:style w:type="table" w:styleId="ListaMdia1-Cor4">
     <w:name w:val="Medium List 1 Accent 4"/>
-    <w:basedOn w:val="TableNormal"/>
+    <w:basedOn w:val="Tabelanormal"/>
     <w:uiPriority w:val="65"/>
     <w:rsid w:val="00CB0664"/>
     <w:pPr>
@@ -7007,9 +6923,9 @@
       </w:tcPr>
     </w:tblStylePr>
   </w:style>
-  <w:style w:type="table" w:styleId="MediumList1-Accent5">
+  <w:style w:type="table" w:styleId="ListaMdia1-Cor5">
     <w:name w:val="Medium List 1 Accent 5"/>
-    <w:basedOn w:val="TableNormal"/>
+    <w:basedOn w:val="Tabelanormal"/>
     <w:uiPriority w:val="65"/>
     <w:rsid w:val="00CB0664"/>
     <w:pPr>
@@ -7084,9 +7000,9 @@
       </w:tcPr>
     </w:tblStylePr>
   </w:style>
-  <w:style w:type="table" w:styleId="MediumList1-Accent6">
+  <w:style w:type="table" w:styleId="ListaMdia1-Cor6">
     <w:name w:val="Medium List 1 Accent 6"/>
-    <w:basedOn w:val="TableNormal"/>
+    <w:basedOn w:val="Tabelanormal"/>
     <w:uiPriority w:val="65"/>
     <w:rsid w:val="00CB0664"/>
     <w:pPr>
@@ -7161,9 +7077,9 @@
       </w:tcPr>
     </w:tblStylePr>
   </w:style>
-  <w:style w:type="table" w:styleId="MediumList2">
+  <w:style w:type="table" w:styleId="ListaMdia2">
     <w:name w:val="Medium List 2"/>
-    <w:basedOn w:val="TableNormal"/>
+    <w:basedOn w:val="Tabelanormal"/>
     <w:uiPriority w:val="66"/>
     <w:rsid w:val="00CB0664"/>
     <w:pPr>
@@ -7282,9 +7198,9 @@
       </w:tcPr>
     </w:tblStylePr>
   </w:style>
-  <w:style w:type="table" w:styleId="MediumList2-Accent1">
+  <w:style w:type="table" w:styleId="ListaMdia2-Cor1">
     <w:name w:val="Medium List 2 Accent 1"/>
-    <w:basedOn w:val="TableNormal"/>
+    <w:basedOn w:val="Tabelanormal"/>
     <w:uiPriority w:val="66"/>
     <w:rsid w:val="00CB0664"/>
     <w:pPr>
@@ -7403,9 +7319,9 @@
       </w:tcPr>
     </w:tblStylePr>
   </w:style>
-  <w:style w:type="table" w:styleId="MediumList2-Accent2">
+  <w:style w:type="table" w:styleId="ListaMdia2-Cor2">
     <w:name w:val="Medium List 2 Accent 2"/>
-    <w:basedOn w:val="TableNormal"/>
+    <w:basedOn w:val="Tabelanormal"/>
     <w:uiPriority w:val="66"/>
     <w:rsid w:val="00CB0664"/>
     <w:pPr>
@@ -7524,9 +7440,9 @@
       </w:tcPr>
     </w:tblStylePr>
   </w:style>
-  <w:style w:type="table" w:styleId="MediumList2-Accent3">
+  <w:style w:type="table" w:styleId="ListaMdia2-Cor3">
     <w:name w:val="Medium List 2 Accent 3"/>
-    <w:basedOn w:val="TableNormal"/>
+    <w:basedOn w:val="Tabelanormal"/>
     <w:uiPriority w:val="66"/>
     <w:rsid w:val="00CB0664"/>
     <w:pPr>
@@ -7645,9 +7561,9 @@
       </w:tcPr>
     </w:tblStylePr>
   </w:style>
-  <w:style w:type="table" w:styleId="MediumList2-Accent4">
+  <w:style w:type="table" w:styleId="ListaMdia2-Cor4">
     <w:name w:val="Medium List 2 Accent 4"/>
-    <w:basedOn w:val="TableNormal"/>
+    <w:basedOn w:val="Tabelanormal"/>
     <w:uiPriority w:val="66"/>
     <w:rsid w:val="00CB0664"/>
     <w:pPr>
@@ -7766,9 +7682,9 @@
       </w:tcPr>
     </w:tblStylePr>
   </w:style>
-  <w:style w:type="table" w:styleId="MediumList2-Accent5">
+  <w:style w:type="table" w:styleId="ListaMdia2-Cor5">
     <w:name w:val="Medium List 2 Accent 5"/>
-    <w:basedOn w:val="TableNormal"/>
+    <w:basedOn w:val="Tabelanormal"/>
     <w:uiPriority w:val="66"/>
     <w:rsid w:val="00CB0664"/>
     <w:pPr>
@@ -7887,9 +7803,9 @@
       </w:tcPr>
     </w:tblStylePr>
   </w:style>
-  <w:style w:type="table" w:styleId="MediumList2-Accent6">
+  <w:style w:type="table" w:styleId="ListaMdia2-Cor6">
     <w:name w:val="Medium List 2 Accent 6"/>
-    <w:basedOn w:val="TableNormal"/>
+    <w:basedOn w:val="Tabelanormal"/>
     <w:uiPriority w:val="66"/>
     <w:rsid w:val="00CB0664"/>
     <w:pPr>
@@ -8008,9 +7924,9 @@
       </w:tcPr>
     </w:tblStylePr>
   </w:style>
-  <w:style w:type="table" w:styleId="MediumGrid1">
+  <w:style w:type="table" w:styleId="GrelhaMdia1">
     <w:name w:val="Medium Grid 1"/>
-    <w:basedOn w:val="TableNormal"/>
+    <w:basedOn w:val="Tabelanormal"/>
     <w:uiPriority w:val="67"/>
     <w:rsid w:val="00CB0664"/>
     <w:pPr>
@@ -8074,9 +7990,9 @@
       </w:tcPr>
     </w:tblStylePr>
   </w:style>
-  <w:style w:type="table" w:styleId="MediumGrid1-Accent1">
+  <w:style w:type="table" w:styleId="GrelhaMdia1-Cor1">
     <w:name w:val="Medium Grid 1 Accent 1"/>
-    <w:basedOn w:val="TableNormal"/>
+    <w:basedOn w:val="Tabelanormal"/>
     <w:uiPriority w:val="67"/>
     <w:rsid w:val="00CB0664"/>
     <w:pPr>
@@ -8140,9 +8056,9 @@
       </w:tcPr>
     </w:tblStylePr>
   </w:style>
-  <w:style w:type="table" w:styleId="MediumGrid1-Accent2">
+  <w:style w:type="table" w:styleId="GrelhaMdia1-Cor2">
     <w:name w:val="Medium Grid 1 Accent 2"/>
-    <w:basedOn w:val="TableNormal"/>
+    <w:basedOn w:val="Tabelanormal"/>
     <w:uiPriority w:val="67"/>
     <w:rsid w:val="00CB0664"/>
     <w:pPr>
@@ -8206,9 +8122,9 @@
       </w:tcPr>
     </w:tblStylePr>
   </w:style>
-  <w:style w:type="table" w:styleId="MediumGrid1-Accent3">
+  <w:style w:type="table" w:styleId="GrelhaMdia1-Cor3">
     <w:name w:val="Medium Grid 1 Accent 3"/>
-    <w:basedOn w:val="TableNormal"/>
+    <w:basedOn w:val="Tabelanormal"/>
     <w:uiPriority w:val="67"/>
     <w:rsid w:val="00CB0664"/>
     <w:pPr>
@@ -8272,9 +8188,9 @@
       </w:tcPr>
     </w:tblStylePr>
   </w:style>
-  <w:style w:type="table" w:styleId="MediumGrid1-Accent4">
+  <w:style w:type="table" w:styleId="GrelhaMdia1-Cor4">
     <w:name w:val="Medium Grid 1 Accent 4"/>
-    <w:basedOn w:val="TableNormal"/>
+    <w:basedOn w:val="Tabelanormal"/>
     <w:uiPriority w:val="67"/>
     <w:rsid w:val="00CB0664"/>
     <w:pPr>
@@ -8338,9 +8254,9 @@
       </w:tcPr>
     </w:tblStylePr>
   </w:style>
-  <w:style w:type="table" w:styleId="MediumGrid1-Accent5">
+  <w:style w:type="table" w:styleId="GrelhaMdia1-Cor5">
     <w:name w:val="Medium Grid 1 Accent 5"/>
-    <w:basedOn w:val="TableNormal"/>
+    <w:basedOn w:val="Tabelanormal"/>
     <w:uiPriority w:val="67"/>
     <w:rsid w:val="00CB0664"/>
     <w:pPr>
@@ -8404,9 +8320,9 @@
       </w:tcPr>
     </w:tblStylePr>
   </w:style>
-  <w:style w:type="table" w:styleId="MediumGrid1-Accent6">
+  <w:style w:type="table" w:styleId="GrelhaMdia1-Cor6">
     <w:name w:val="Medium Grid 1 Accent 6"/>
-    <w:basedOn w:val="TableNormal"/>
+    <w:basedOn w:val="Tabelanormal"/>
     <w:uiPriority w:val="67"/>
     <w:rsid w:val="00CB0664"/>
     <w:pPr>
@@ -8470,9 +8386,9 @@
       </w:tcPr>
     </w:tblStylePr>
   </w:style>
-  <w:style w:type="table" w:styleId="MediumGrid2">
+  <w:style w:type="table" w:styleId="GrelhaMdia2">
     <w:name w:val="Medium Grid 2"/>
-    <w:basedOn w:val="TableNormal"/>
+    <w:basedOn w:val="Tabelanormal"/>
     <w:uiPriority w:val="68"/>
     <w:rsid w:val="00CB0664"/>
     <w:pPr>
@@ -8588,9 +8504,9 @@
       </w:tcPr>
     </w:tblStylePr>
   </w:style>
-  <w:style w:type="table" w:styleId="MediumGrid2-Accent1">
+  <w:style w:type="table" w:styleId="GrelhaMdia2-Cor1">
     <w:name w:val="Medium Grid 2 Accent 1"/>
-    <w:basedOn w:val="TableNormal"/>
+    <w:basedOn w:val="Tabelanormal"/>
     <w:uiPriority w:val="68"/>
     <w:rsid w:val="00CB0664"/>
     <w:pPr>
@@ -8706,9 +8622,9 @@
       </w:tcPr>
     </w:tblStylePr>
   </w:style>
-  <w:style w:type="table" w:styleId="MediumGrid2-Accent2">
+  <w:style w:type="table" w:styleId="GrelhaMdia2-Cor2">
     <w:name w:val="Medium Grid 2 Accent 2"/>
-    <w:basedOn w:val="TableNormal"/>
+    <w:basedOn w:val="Tabelanormal"/>
     <w:uiPriority w:val="68"/>
     <w:rsid w:val="00CB0664"/>
     <w:pPr>
@@ -8824,9 +8740,9 @@
       </w:tcPr>
     </w:tblStylePr>
   </w:style>
-  <w:style w:type="table" w:styleId="MediumGrid2-Accent3">
+  <w:style w:type="table" w:styleId="GrelhaMdia2-Cor3">
     <w:name w:val="Medium Grid 2 Accent 3"/>
-    <w:basedOn w:val="TableNormal"/>
+    <w:basedOn w:val="Tabelanormal"/>
     <w:uiPriority w:val="68"/>
     <w:rsid w:val="00CB0664"/>
     <w:pPr>
@@ -8942,9 +8858,9 @@
       </w:tcPr>
     </w:tblStylePr>
   </w:style>
-  <w:style w:type="table" w:styleId="MediumGrid2-Accent4">
+  <w:style w:type="table" w:styleId="GrelhaMdia2-Cor4">
     <w:name w:val="Medium Grid 2 Accent 4"/>
-    <w:basedOn w:val="TableNormal"/>
+    <w:basedOn w:val="Tabelanormal"/>
     <w:uiPriority w:val="68"/>
     <w:rsid w:val="00CB0664"/>
     <w:pPr>
@@ -9060,9 +8976,9 @@
       </w:tcPr>
     </w:tblStylePr>
   </w:style>
-  <w:style w:type="table" w:styleId="MediumGrid2-Accent5">
+  <w:style w:type="table" w:styleId="GrelhaMdia2-Cor5">
     <w:name w:val="Medium Grid 2 Accent 5"/>
-    <w:basedOn w:val="TableNormal"/>
+    <w:basedOn w:val="Tabelanormal"/>
     <w:uiPriority w:val="68"/>
     <w:rsid w:val="00CB0664"/>
     <w:pPr>
@@ -9178,9 +9094,9 @@
       </w:tcPr>
     </w:tblStylePr>
   </w:style>
-  <w:style w:type="table" w:styleId="MediumGrid2-Accent6">
+  <w:style w:type="table" w:styleId="GrelhaMdia2-Cor6">
     <w:name w:val="Medium Grid 2 Accent 6"/>
-    <w:basedOn w:val="TableNormal"/>
+    <w:basedOn w:val="Tabelanormal"/>
     <w:uiPriority w:val="68"/>
     <w:rsid w:val="00CB0664"/>
     <w:pPr>
@@ -9296,9 +9212,9 @@
       </w:tcPr>
     </w:tblStylePr>
   </w:style>
-  <w:style w:type="table" w:styleId="MediumGrid3">
+  <w:style w:type="table" w:styleId="GrelhaMdia3">
     <w:name w:val="Medium Grid 3"/>
-    <w:basedOn w:val="TableNormal"/>
+    <w:basedOn w:val="Tabelanormal"/>
     <w:uiPriority w:val="69"/>
     <w:rsid w:val="00CB0664"/>
     <w:pPr>
@@ -9430,9 +9346,9 @@
       </w:tcPr>
     </w:tblStylePr>
   </w:style>
-  <w:style w:type="table" w:styleId="MediumGrid3-Accent1">
+  <w:style w:type="table" w:styleId="GrelhaMdia3-Cor1">
     <w:name w:val="Medium Grid 3 Accent 1"/>
-    <w:basedOn w:val="TableNormal"/>
+    <w:basedOn w:val="Tabelanormal"/>
     <w:uiPriority w:val="69"/>
     <w:rsid w:val="00CB0664"/>
     <w:pPr>
@@ -9564,9 +9480,9 @@
       </w:tcPr>
     </w:tblStylePr>
   </w:style>
-  <w:style w:type="table" w:styleId="MediumGrid3-Accent2">
+  <w:style w:type="table" w:styleId="GrelhaMdia3-Cor2">
     <w:name w:val="Medium Grid 3 Accent 2"/>
-    <w:basedOn w:val="TableNormal"/>
+    <w:basedOn w:val="Tabelanormal"/>
     <w:uiPriority w:val="69"/>
     <w:rsid w:val="00CB0664"/>
     <w:pPr>
@@ -9698,9 +9614,9 @@
       </w:tcPr>
     </w:tblStylePr>
   </w:style>
-  <w:style w:type="table" w:styleId="MediumGrid3-Accent3">
+  <w:style w:type="table" w:styleId="GrelhaMdia3-Cor3">
     <w:name w:val="Medium Grid 3 Accent 3"/>
-    <w:basedOn w:val="TableNormal"/>
+    <w:basedOn w:val="Tabelanormal"/>
     <w:uiPriority w:val="69"/>
     <w:rsid w:val="00CB0664"/>
     <w:pPr>
@@ -9832,9 +9748,9 @@
       </w:tcPr>
     </w:tblStylePr>
   </w:style>
-  <w:style w:type="table" w:styleId="MediumGrid3-Accent4">
+  <w:style w:type="table" w:styleId="GrelhaMdia3-Cor4">
     <w:name w:val="Medium Grid 3 Accent 4"/>
-    <w:basedOn w:val="TableNormal"/>
+    <w:basedOn w:val="Tabelanormal"/>
     <w:uiPriority w:val="69"/>
     <w:rsid w:val="00CB0664"/>
     <w:pPr>
@@ -9966,9 +9882,9 @@
       </w:tcPr>
     </w:tblStylePr>
   </w:style>
-  <w:style w:type="table" w:styleId="MediumGrid3-Accent5">
+  <w:style w:type="table" w:styleId="GrelhaMdia3-Cor5">
     <w:name w:val="Medium Grid 3 Accent 5"/>
-    <w:basedOn w:val="TableNormal"/>
+    <w:basedOn w:val="Tabelanormal"/>
     <w:uiPriority w:val="69"/>
     <w:rsid w:val="00CB0664"/>
     <w:pPr>
@@ -10100,9 +10016,9 @@
       </w:tcPr>
     </w:tblStylePr>
   </w:style>
-  <w:style w:type="table" w:styleId="MediumGrid3-Accent6">
+  <w:style w:type="table" w:styleId="GrelhaMdia3-Cor6">
     <w:name w:val="Medium Grid 3 Accent 6"/>
-    <w:basedOn w:val="TableNormal"/>
+    <w:basedOn w:val="Tabelanormal"/>
     <w:uiPriority w:val="69"/>
     <w:rsid w:val="00CB0664"/>
     <w:pPr>
@@ -10234,9 +10150,9 @@
       </w:tcPr>
     </w:tblStylePr>
   </w:style>
-  <w:style w:type="table" w:styleId="DarkList">
+  <w:style w:type="table" w:styleId="ListaEscura">
     <w:name w:val="Dark List"/>
-    <w:basedOn w:val="TableNormal"/>
+    <w:basedOn w:val="Tabelanormal"/>
     <w:uiPriority w:val="70"/>
     <w:rsid w:val="00CB0664"/>
     <w:pPr>
@@ -10341,9 +10257,9 @@
       </w:tcPr>
     </w:tblStylePr>
   </w:style>
-  <w:style w:type="table" w:styleId="DarkList-Accent1">
+  <w:style w:type="table" w:styleId="ListaEscura-Cor1">
     <w:name w:val="Dark List Accent 1"/>
-    <w:basedOn w:val="TableNormal"/>
+    <w:basedOn w:val="Tabelanormal"/>
     <w:uiPriority w:val="70"/>
     <w:rsid w:val="00CB0664"/>
     <w:pPr>
@@ -10448,9 +10364,9 @@
       </w:tcPr>
     </w:tblStylePr>
   </w:style>
-  <w:style w:type="table" w:styleId="DarkList-Accent2">
+  <w:style w:type="table" w:styleId="ListaEscura-Cor2">
     <w:name w:val="Dark List Accent 2"/>
-    <w:basedOn w:val="TableNormal"/>
+    <w:basedOn w:val="Tabelanormal"/>
     <w:uiPriority w:val="70"/>
     <w:rsid w:val="00CB0664"/>
     <w:pPr>
@@ -10555,9 +10471,9 @@
       </w:tcPr>
     </w:tblStylePr>
   </w:style>
-  <w:style w:type="table" w:styleId="DarkList-Accent3">
+  <w:style w:type="table" w:styleId="ListaEscura-Cor3">
     <w:name w:val="Dark List Accent 3"/>
-    <w:basedOn w:val="TableNormal"/>
+    <w:basedOn w:val="Tabelanormal"/>
     <w:uiPriority w:val="70"/>
     <w:rsid w:val="00CB0664"/>
     <w:pPr>
@@ -10662,9 +10578,9 @@
       </w:tcPr>
     </w:tblStylePr>
   </w:style>
-  <w:style w:type="table" w:styleId="DarkList-Accent4">
+  <w:style w:type="table" w:styleId="ListaEscura-Cor4">
     <w:name w:val="Dark List Accent 4"/>
-    <w:basedOn w:val="TableNormal"/>
+    <w:basedOn w:val="Tabelanormal"/>
     <w:uiPriority w:val="70"/>
     <w:rsid w:val="00CB0664"/>
     <w:pPr>
@@ -10769,9 +10685,9 @@
       </w:tcPr>
     </w:tblStylePr>
   </w:style>
-  <w:style w:type="table" w:styleId="DarkList-Accent5">
+  <w:style w:type="table" w:styleId="ListaEscura-Cor5">
     <w:name w:val="Dark List Accent 5"/>
-    <w:basedOn w:val="TableNormal"/>
+    <w:basedOn w:val="Tabelanormal"/>
     <w:uiPriority w:val="70"/>
     <w:rsid w:val="00CB0664"/>
     <w:pPr>
@@ -10876,9 +10792,9 @@
       </w:tcPr>
     </w:tblStylePr>
   </w:style>
-  <w:style w:type="table" w:styleId="DarkList-Accent6">
+  <w:style w:type="table" w:styleId="ListaEscura-Cor6">
     <w:name w:val="Dark List Accent 6"/>
-    <w:basedOn w:val="TableNormal"/>
+    <w:basedOn w:val="Tabelanormal"/>
     <w:uiPriority w:val="70"/>
     <w:rsid w:val="00CB0664"/>
     <w:pPr>
@@ -10983,9 +10899,9 @@
       </w:tcPr>
     </w:tblStylePr>
   </w:style>
-  <w:style w:type="table" w:styleId="ColorfulShading">
+  <w:style w:type="table" w:styleId="SombreadoColorido">
     <w:name w:val="Colorful Shading"/>
-    <w:basedOn w:val="TableNormal"/>
+    <w:basedOn w:val="Tabelanormal"/>
     <w:uiPriority w:val="71"/>
     <w:rsid w:val="00CB0664"/>
     <w:pPr>
@@ -11098,9 +11014,9 @@
       </w:rPr>
     </w:tblStylePr>
   </w:style>
-  <w:style w:type="table" w:styleId="ColorfulShading-Accent1">
+  <w:style w:type="table" w:styleId="SombreadoColorido-Cor1">
     <w:name w:val="Colorful Shading Accent 1"/>
-    <w:basedOn w:val="TableNormal"/>
+    <w:basedOn w:val="Tabelanormal"/>
     <w:uiPriority w:val="71"/>
     <w:rsid w:val="00CB0664"/>
     <w:pPr>
@@ -11213,9 +11129,9 @@
       </w:rPr>
     </w:tblStylePr>
   </w:style>
-  <w:style w:type="table" w:styleId="ColorfulShading-Accent2">
+  <w:style w:type="table" w:styleId="SombreadoColorido-Cor2">
     <w:name w:val="Colorful Shading Accent 2"/>
-    <w:basedOn w:val="TableNormal"/>
+    <w:basedOn w:val="Tabelanormal"/>
     <w:uiPriority w:val="71"/>
     <w:rsid w:val="00CB0664"/>
     <w:pPr>
@@ -11328,9 +11244,9 @@
       </w:rPr>
     </w:tblStylePr>
   </w:style>
-  <w:style w:type="table" w:styleId="ColorfulShading-Accent3">
+  <w:style w:type="table" w:styleId="SombreadoColorido-Cor3">
     <w:name w:val="Colorful Shading Accent 3"/>
-    <w:basedOn w:val="TableNormal"/>
+    <w:basedOn w:val="Tabelanormal"/>
     <w:uiPriority w:val="71"/>
     <w:rsid w:val="00CB0664"/>
     <w:pPr>
@@ -11433,9 +11349,9 @@
       </w:tcPr>
     </w:tblStylePr>
   </w:style>
-  <w:style w:type="table" w:styleId="ColorfulShading-Accent4">
+  <w:style w:type="table" w:styleId="SombreadoColorido-Cor4">
     <w:name w:val="Colorful Shading Accent 4"/>
-    <w:basedOn w:val="TableNormal"/>
+    <w:basedOn w:val="Tabelanormal"/>
     <w:uiPriority w:val="71"/>
     <w:rsid w:val="00CB0664"/>
     <w:pPr>
@@ -11548,9 +11464,9 @@
       </w:rPr>
     </w:tblStylePr>
   </w:style>
-  <w:style w:type="table" w:styleId="ColorfulShading-Accent5">
+  <w:style w:type="table" w:styleId="SombreadoColorido-Cor5">
     <w:name w:val="Colorful Shading Accent 5"/>
-    <w:basedOn w:val="TableNormal"/>
+    <w:basedOn w:val="Tabelanormal"/>
     <w:uiPriority w:val="71"/>
     <w:rsid w:val="00CB0664"/>
     <w:pPr>
@@ -11663,9 +11579,9 @@
       </w:rPr>
     </w:tblStylePr>
   </w:style>
-  <w:style w:type="table" w:styleId="ColorfulShading-Accent6">
+  <w:style w:type="table" w:styleId="SombreadoColorido-Cor6">
     <w:name w:val="Colorful Shading Accent 6"/>
-    <w:basedOn w:val="TableNormal"/>
+    <w:basedOn w:val="Tabelanormal"/>
     <w:uiPriority w:val="71"/>
     <w:rsid w:val="00CB0664"/>
     <w:pPr>
@@ -11778,9 +11694,9 @@
       </w:rPr>
     </w:tblStylePr>
   </w:style>
-  <w:style w:type="table" w:styleId="ColorfulList">
+  <w:style w:type="table" w:styleId="ListaColorida">
     <w:name w:val="Colorful List"/>
-    <w:basedOn w:val="TableNormal"/>
+    <w:basedOn w:val="Tabelanormal"/>
     <w:uiPriority w:val="72"/>
     <w:rsid w:val="00CB0664"/>
     <w:pPr>
@@ -11857,9 +11773,9 @@
       </w:tcPr>
     </w:tblStylePr>
   </w:style>
-  <w:style w:type="table" w:styleId="ColorfulList-Accent1">
+  <w:style w:type="table" w:styleId="ListaColorida-Cor1">
     <w:name w:val="Colorful List Accent 1"/>
-    <w:basedOn w:val="TableNormal"/>
+    <w:basedOn w:val="Tabelanormal"/>
     <w:uiPriority w:val="72"/>
     <w:rsid w:val="00CB0664"/>
     <w:pPr>
@@ -11936,9 +11852,9 @@
       </w:tcPr>
     </w:tblStylePr>
   </w:style>
-  <w:style w:type="table" w:styleId="ColorfulList-Accent2">
+  <w:style w:type="table" w:styleId="ListaColorida-Cor2">
     <w:name w:val="Colorful List Accent 2"/>
-    <w:basedOn w:val="TableNormal"/>
+    <w:basedOn w:val="Tabelanormal"/>
     <w:uiPriority w:val="72"/>
     <w:rsid w:val="00CB0664"/>
     <w:pPr>
@@ -12015,9 +11931,9 @@
       </w:tcPr>
     </w:tblStylePr>
   </w:style>
-  <w:style w:type="table" w:styleId="ColorfulList-Accent3">
+  <w:style w:type="table" w:styleId="ListaColorida-Cor3">
     <w:name w:val="Colorful List Accent 3"/>
-    <w:basedOn w:val="TableNormal"/>
+    <w:basedOn w:val="Tabelanormal"/>
     <w:uiPriority w:val="72"/>
     <w:rsid w:val="00CB0664"/>
     <w:pPr>
@@ -12094,9 +12010,9 @@
       </w:tcPr>
     </w:tblStylePr>
   </w:style>
-  <w:style w:type="table" w:styleId="ColorfulList-Accent4">
+  <w:style w:type="table" w:styleId="ListaColorida-Cor4">
     <w:name w:val="Colorful List Accent 4"/>
-    <w:basedOn w:val="TableNormal"/>
+    <w:basedOn w:val="Tabelanormal"/>
     <w:uiPriority w:val="72"/>
     <w:rsid w:val="00CB0664"/>
     <w:pPr>
@@ -12173,9 +12089,9 @@
       </w:tcPr>
     </w:tblStylePr>
   </w:style>
-  <w:style w:type="table" w:styleId="ColorfulList-Accent5">
+  <w:style w:type="table" w:styleId="ListaColorida-Cor5">
     <w:name w:val="Colorful List Accent 5"/>
-    <w:basedOn w:val="TableNormal"/>
+    <w:basedOn w:val="Tabelanormal"/>
     <w:uiPriority w:val="72"/>
     <w:rsid w:val="00CB0664"/>
     <w:pPr>
@@ -12252,9 +12168,9 @@
       </w:tcPr>
     </w:tblStylePr>
   </w:style>
-  <w:style w:type="table" w:styleId="ColorfulList-Accent6">
+  <w:style w:type="table" w:styleId="ListaColorida-Cor6">
     <w:name w:val="Colorful List Accent 6"/>
-    <w:basedOn w:val="TableNormal"/>
+    <w:basedOn w:val="Tabelanormal"/>
     <w:uiPriority w:val="72"/>
     <w:rsid w:val="00CB0664"/>
     <w:pPr>
@@ -12331,9 +12247,9 @@
       </w:tcPr>
     </w:tblStylePr>
   </w:style>
-  <w:style w:type="table" w:styleId="ColorfulGrid">
+  <w:style w:type="table" w:styleId="GrelhaColorida">
     <w:name w:val="Colorful Grid"/>
-    <w:basedOn w:val="TableNormal"/>
+    <w:basedOn w:val="Tabelanormal"/>
     <w:uiPriority w:val="73"/>
     <w:rsid w:val="00CB0664"/>
     <w:pPr>
@@ -12404,9 +12320,9 @@
       </w:tcPr>
     </w:tblStylePr>
   </w:style>
-  <w:style w:type="table" w:styleId="ColorfulGrid-Accent1">
+  <w:style w:type="table" w:styleId="GrelhaColorida-Cor1">
     <w:name w:val="Colorful Grid Accent 1"/>
-    <w:basedOn w:val="TableNormal"/>
+    <w:basedOn w:val="Tabelanormal"/>
     <w:uiPriority w:val="73"/>
     <w:rsid w:val="00CB0664"/>
     <w:pPr>
@@ -12477,9 +12393,9 @@
       </w:tcPr>
     </w:tblStylePr>
   </w:style>
-  <w:style w:type="table" w:styleId="ColorfulGrid-Accent2">
+  <w:style w:type="table" w:styleId="GrelhaColorida-Cor2">
     <w:name w:val="Colorful Grid Accent 2"/>
-    <w:basedOn w:val="TableNormal"/>
+    <w:basedOn w:val="Tabelanormal"/>
     <w:uiPriority w:val="73"/>
     <w:rsid w:val="00CB0664"/>
     <w:pPr>
@@ -12550,9 +12466,9 @@
       </w:tcPr>
     </w:tblStylePr>
   </w:style>
-  <w:style w:type="table" w:styleId="ColorfulGrid-Accent3">
+  <w:style w:type="table" w:styleId="GrelhaColorida-Cor3">
     <w:name w:val="Colorful Grid Accent 3"/>
-    <w:basedOn w:val="TableNormal"/>
+    <w:basedOn w:val="Tabelanormal"/>
     <w:uiPriority w:val="73"/>
     <w:rsid w:val="00CB0664"/>
     <w:pPr>
@@ -12623,9 +12539,9 @@
       </w:tcPr>
     </w:tblStylePr>
   </w:style>
-  <w:style w:type="table" w:styleId="ColorfulGrid-Accent4">
+  <w:style w:type="table" w:styleId="GrelhaColorida-Cor4">
     <w:name w:val="Colorful Grid Accent 4"/>
-    <w:basedOn w:val="TableNormal"/>
+    <w:basedOn w:val="Tabelanormal"/>
     <w:uiPriority w:val="73"/>
     <w:rsid w:val="00CB0664"/>
     <w:pPr>
@@ -12696,9 +12612,9 @@
       </w:tcPr>
     </w:tblStylePr>
   </w:style>
-  <w:style w:type="table" w:styleId="ColorfulGrid-Accent5">
+  <w:style w:type="table" w:styleId="GrelhaColorida-Cor5">
     <w:name w:val="Colorful Grid Accent 5"/>
-    <w:basedOn w:val="TableNormal"/>
+    <w:basedOn w:val="Tabelanormal"/>
     <w:uiPriority w:val="73"/>
     <w:rsid w:val="00CB0664"/>
     <w:pPr>
@@ -12769,9 +12685,9 @@
       </w:tcPr>
     </w:tblStylePr>
   </w:style>
-  <w:style w:type="table" w:styleId="ColorfulGrid-Accent6">
+  <w:style w:type="table" w:styleId="GrelhaColorida-Cor6">
     <w:name w:val="Colorful Grid Accent 6"/>
-    <w:basedOn w:val="TableNormal"/>
+    <w:basedOn w:val="Tabelanormal"/>
     <w:uiPriority w:val="73"/>
     <w:rsid w:val="00CB0664"/>
     <w:pPr>

</xml_diff>

<commit_message>
[Feature] Integra autenticação via API, 2FA e Google OAuth no Web e Android
      - adiciona clientes de API (ApiClient, HephaestusApiClient) e modelos para comunicação com o backend em ambas as plataformas
      - implementa fluxo real de login e verificação de dois fatores (2FA) na aplicação Web, substituindo as simulações
      - adiciona suporte a autenticação com Google (OAuth) e respetivas páginas de callback
      - implementa gestão e persistência de sessão (WebSession na Web, SessionStore e SecureStorage no Android)
      - atualiza a interface Web (Master page e Login) para reagir e consumir os dados reais do utilizador autenticado
      - atualiza os ficheiros de projeto (.csproj) e configurações da aplicação
      - atualiza as notas de desenvolvimento com novas pendências e ideias de melhorias
</commit_message>
<xml_diff>
--- a/docs/Calendario_Detalhado_Hephaestus.docx
+++ b/docs/Calendario_Detalhado_Hephaestus.docx
@@ -677,6 +677,65 @@
           <w:p>
             <w:pPr>
               <w:rPr>
+                <w:highlight w:val="green"/>
+              </w:rPr>
+            </w:pPr>
+            <w:r>
+              <w:rPr>
+                <w:highlight w:val="green"/>
+              </w:rPr>
+              <w:lastRenderedPageBreak/>
+              <w:t>Frontend Mobile</w:t>
+            </w:r>
+          </w:p>
+        </w:tc>
+        <w:tc>
+          <w:tcPr>
+            <w:tcW w:w="2880" w:type="dxa"/>
+          </w:tcPr>
+          <w:p>
+            <w:pPr>
+              <w:rPr>
+                <w:highlight w:val="green"/>
+              </w:rPr>
+            </w:pPr>
+            <w:r>
+              <w:rPr>
+                <w:highlight w:val="green"/>
+              </w:rPr>
+              <w:t>25/08 a 26/08</w:t>
+            </w:r>
+          </w:p>
+        </w:tc>
+        <w:tc>
+          <w:tcPr>
+            <w:tcW w:w="2880" w:type="dxa"/>
+          </w:tcPr>
+          <w:p>
+            <w:pPr>
+              <w:rPr>
+                <w:highlight w:val="green"/>
+                <w:lang w:val="pt-PT"/>
+              </w:rPr>
+            </w:pPr>
+            <w:r>
+              <w:rPr>
+                <w:highlight w:val="green"/>
+                <w:lang w:val="pt-PT"/>
+              </w:rPr>
+              <w:t>Ecrã da Agenda Diária do Técnico e implementação de alertas visuais de perda de ligação à rede.</w:t>
+            </w:r>
+          </w:p>
+        </w:tc>
+      </w:tr>
+      <w:tr>
+        <w:tc>
+          <w:tcPr>
+            <w:tcW w:w="2880" w:type="dxa"/>
+          </w:tcPr>
+          <w:p>
+            <w:pPr>
+              <w:rPr>
                 <w:highlight w:val="yellow"/>
               </w:rPr>
             </w:pPr>
@@ -684,8 +743,7 @@
               <w:rPr>
                 <w:highlight w:val="yellow"/>
               </w:rPr>
-              <w:lastRenderedPageBreak/>
-              <w:t>Frontend Mobile</w:t>
+              <w:t>Backend</w:t>
             </w:r>
           </w:p>
         </w:tc>
@@ -703,7 +761,7 @@
               <w:rPr>
                 <w:highlight w:val="yellow"/>
               </w:rPr>
-              <w:t>25/08 a 26/08</w:t>
+              <w:t>27/08 a 29/08</w:t>
             </w:r>
           </w:p>
         </w:tc>
@@ -723,46 +781,6 @@
                 <w:highlight w:val="yellow"/>
                 <w:lang w:val="pt-PT"/>
               </w:rPr>
-              <w:t>Ecrã da Agenda Diária do Técnico e implementação de alertas visuais de perda de ligação à rede.</w:t>
-            </w:r>
-          </w:p>
-        </w:tc>
-      </w:tr>
-      <w:tr>
-        <w:tc>
-          <w:tcPr>
-            <w:tcW w:w="2880" w:type="dxa"/>
-          </w:tcPr>
-          <w:p>
-            <w:r>
-              <w:t>Backend</w:t>
-            </w:r>
-          </w:p>
-        </w:tc>
-        <w:tc>
-          <w:tcPr>
-            <w:tcW w:w="2880" w:type="dxa"/>
-          </w:tcPr>
-          <w:p>
-            <w:r>
-              <w:t>27/08 a 29/08</w:t>
-            </w:r>
-          </w:p>
-        </w:tc>
-        <w:tc>
-          <w:tcPr>
-            <w:tcW w:w="2880" w:type="dxa"/>
-          </w:tcPr>
-          <w:p>
-            <w:pPr>
-              <w:rPr>
-                <w:lang w:val="pt-PT"/>
-              </w:rPr>
-            </w:pPr>
-            <w:r>
-              <w:rPr>
-                <w:lang w:val="pt-PT"/>
-              </w:rPr>
               <w:t>Configuração do projeto .NET Framework/C#, ligação à Base de Dados SQL Server e configuração de Web Services no IIS.</w:t>
             </w:r>
           </w:p>
@@ -774,7 +792,15 @@
             <w:tcW w:w="2880" w:type="dxa"/>
           </w:tcPr>
           <w:p>
+            <w:pPr>
+              <w:rPr>
+                <w:highlight w:val="yellow"/>
+              </w:rPr>
+            </w:pPr>
             <w:r>
+              <w:rPr>
+                <w:highlight w:val="yellow"/>
+              </w:rPr>
               <w:t>Backend</w:t>
             </w:r>
           </w:p>
@@ -784,7 +810,15 @@
             <w:tcW w:w="2880" w:type="dxa"/>
           </w:tcPr>
           <w:p>
+            <w:pPr>
+              <w:rPr>
+                <w:highlight w:val="yellow"/>
+              </w:rPr>
+            </w:pPr>
             <w:r>
+              <w:rPr>
+                <w:highlight w:val="yellow"/>
+              </w:rPr>
               <w:t>30/08 a 01/09</w:t>
             </w:r>
           </w:p>
@@ -796,11 +830,13 @@
           <w:p>
             <w:pPr>
               <w:rPr>
+                <w:highlight w:val="yellow"/>
                 <w:lang w:val="pt-PT"/>
               </w:rPr>
             </w:pPr>
             <w:r>
               <w:rPr>
+                <w:highlight w:val="yellow"/>
                 <w:lang w:val="pt-PT"/>
               </w:rPr>
               <w:t>Implementação de Autenticação, gestão de sessões, controlo de acessos por roles (Admin, Técnico, Standard) e OAuth 2.0.</w:t>

</xml_diff>